<commit_message>
docs: record fresh-clone verification and remaining submission work
</commit_message>
<xml_diff>
--- a/docs/report/SkipQ_Report_Draft.docx
+++ b/docs/report/SkipQ_Report_Draft.docx
@@ -115,6 +115,11 @@
           <w:i w:val="0"/>
         </w:rPr>
         <w:t>Frontend repository: https://github.com/ArellaKoo/devops-assignment-FE</w:t>
+      </w:r>
+    </w:p>
+    <w:p>
+      <w:r>
+        <w:br w:type="page"/>
       </w:r>
     </w:p>
     <w:p>
@@ -5844,7 +5849,7 @@
                 <w:i w:val="0"/>
                 <w:sz w:val="17"/>
               </w:rPr>
-              <w:t>Final reconciliation against the finished code: capability status assesses the original GBA, not whether implementation is finished</w:t>
+              <w:t>Qwen baseline reconciliation before Codex continuation: capability status assesses the original GBA, not whether implementation is finished</w:t>
             </w:r>
           </w:p>
         </w:tc>
@@ -5914,6 +5919,88 @@
                 <w:sz w:val="17"/>
               </w:rPr>
               <w:t>.</w:t>
+            </w:r>
+          </w:p>
+        </w:tc>
+      </w:tr>
+      <w:tr>
+        <w:tc>
+          <w:tcPr>
+            <w:tcW w:type="dxa" w:w="1405"/>
+          </w:tcPr>
+          <w:p>
+            <w:pPr>
+              <w:keepNext w:val="0"/>
+              <w:keepLines w:val="0"/>
+              <w:spacing w:after="60"/>
+            </w:pPr>
+            <w:r>
+              <w:rPr>
+                <w:b w:val="0"/>
+                <w:i w:val="0"/>
+                <w:sz w:val="17"/>
+              </w:rPr>
+              <w:t>2026-10-07</w:t>
+            </w:r>
+          </w:p>
+        </w:tc>
+        <w:tc>
+          <w:tcPr>
+            <w:tcW w:type="dxa" w:w="2308"/>
+          </w:tcPr>
+          <w:p>
+            <w:pPr>
+              <w:keepNext w:val="0"/>
+              <w:keepLines w:val="0"/>
+              <w:spacing w:after="60"/>
+            </w:pPr>
+            <w:r>
+              <w:rPr>
+                <w:b w:val="0"/>
+                <w:i w:val="0"/>
+                <w:sz w:val="17"/>
+              </w:rPr>
+              <w:t>C1/C3</w:t>
+            </w:r>
+          </w:p>
+        </w:tc>
+        <w:tc>
+          <w:tcPr>
+            <w:tcW w:type="dxa" w:w="3613"/>
+          </w:tcPr>
+          <w:p>
+            <w:pPr>
+              <w:keepNext w:val="0"/>
+              <w:keepLines w:val="0"/>
+              <w:spacing w:after="60"/>
+            </w:pPr>
+            <w:r>
+              <w:rPr>
+                <w:b w:val="0"/>
+                <w:i w:val="0"/>
+                <w:sz w:val="17"/>
+              </w:rPr>
+              <w:t>Codex final review found hidden checkout transport/server errors, overlapping cart/menu mutations and Unicode invalid-token 500s</w:t>
+            </w:r>
+          </w:p>
+        </w:tc>
+        <w:tc>
+          <w:tcPr>
+            <w:tcW w:type="dxa" w:w="2710"/>
+          </w:tcPr>
+          <w:p>
+            <w:pPr>
+              <w:keepNext w:val="0"/>
+              <w:keepLines w:val="0"/>
+              <w:spacing w:after="60"/>
+            </w:pPr>
+            <w:r>
+              <w:rPr>
+                <w:b w:val="0"/>
+                <w:i w:val="0"/>
+                <w:sz w:val="17"/>
+              </w:rPr>
+              <w:t>Checkout now displays actionable errors and retains the same retry key; menu/cart mutations use the existing synchronous in-flight guard; Unicode tokens return 401 before lookup. Four frontend diagnostic checks passed after meaningful failing runs; four token regressions were added. Current offline unit suite is 306 cases; functional/browser pairs and the demo rehearsal pass. All four original-GBA support classifications remain partially supported. See docs/assessment/codex-handover.md.</w:t>
             </w:r>
           </w:p>
         </w:tc>
@@ -22232,6 +22319,16 @@
       </w:r>
     </w:p>
     <w:p>
+      <w:pPr/>
+      <w:r>
+        <w:rPr>
+          <w:b w:val="0"/>
+          <w:i w:val="0"/>
+        </w:rPr>
+        <w:t>P16 fresh-checkout verification: local clones of backend d4ebe42/frontend a8364f8 installed cleanly into their own environments; pip check and frontend build passed; 306 unit cases passed; real-DB functional 10 passed twice; browser lifecycle 1 passed twice (15.39/11.45 s) with both servers running from the clones, no reset between runs. Original load evidence remained unchanged. DOCX/PDF exports were structurally checked and visually inspected; the cover was separated onto its own page after preview review. Exact fresh-run logs are retained under docs/evidence/codex-handover/.</w:t>
+      </w:r>
+    </w:p>
+    <w:p>
       <w:r>
         <w:br w:type="page"/>
       </w:r>
@@ -26832,7 +26929,574 @@
           <w:b w:val="0"/>
           <w:i w:val="0"/>
         </w:rPr>
-        <w:t xml:space="preserve">A new check of the final committed code/report package is recorded below once it runs. The earlier Qwen fresh-clone rehearsal remains in </w:t>
+        <w:t xml:space="preserve">Fresh local clones of backend </w:t>
+      </w:r>
+      <w:r>
+        <w:rPr>
+          <w:rFonts w:ascii="Courier New" w:hAnsi="Courier New"/>
+          <w:b w:val="0"/>
+          <w:i w:val="0"/>
+          <w:sz w:val="18"/>
+        </w:rPr>
+        <w:t>d4ebe42</w:t>
+      </w:r>
+      <w:r>
+        <w:rPr>
+          <w:b w:val="0"/>
+          <w:i w:val="0"/>
+        </w:rPr>
+        <w:t xml:space="preserve"> and frontend </w:t>
+      </w:r>
+      <w:r>
+        <w:rPr>
+          <w:rFonts w:ascii="Courier New" w:hAnsi="Courier New"/>
+          <w:b w:val="0"/>
+          <w:i w:val="0"/>
+          <w:sz w:val="18"/>
+        </w:rPr>
+        <w:t>a8364f8</w:t>
+      </w:r>
+      <w:r>
+        <w:rPr>
+          <w:b w:val="0"/>
+          <w:i w:val="0"/>
+        </w:rPr>
+        <w:t xml:space="preserve"> were created at </w:t>
+      </w:r>
+      <w:r>
+        <w:rPr>
+          <w:rFonts w:ascii="Courier New" w:hAnsi="Courier New"/>
+          <w:b w:val="0"/>
+          <w:i w:val="0"/>
+          <w:sz w:val="18"/>
+        </w:rPr>
+        <w:t>.local/codex-final-checkouts/20261007-120043/</w:t>
+      </w:r>
+      <w:r>
+        <w:rPr>
+          <w:b w:val="0"/>
+          <w:i w:val="0"/>
+        </w:rPr>
+        <w:t>. This package includes the final code fixes and assembled report. Subsequent changes only add this verification record and give the report a standalone cover; application code is unchanged.</w:t>
+      </w:r>
+    </w:p>
+    <w:p>
+      <w:pPr/>
+      <w:r>
+        <w:rPr>
+          <w:b w:val="0"/>
+          <w:i w:val="0"/>
+        </w:rPr>
+        <w:t xml:space="preserve">The clones used their own new Python environment, their own </w:t>
+      </w:r>
+      <w:r>
+        <w:rPr>
+          <w:rFonts w:ascii="Courier New" w:hAnsi="Courier New"/>
+          <w:b w:val="0"/>
+          <w:i w:val="0"/>
+          <w:sz w:val="18"/>
+        </w:rPr>
+        <w:t>npm ci</w:t>
+      </w:r>
+      <w:r>
+        <w:rPr>
+          <w:b w:val="0"/>
+          <w:i w:val="0"/>
+        </w:rPr>
+        <w:t xml:space="preserve">, their own </w:t>
+      </w:r>
+      <w:r>
+        <w:rPr>
+          <w:rFonts w:ascii="Courier New" w:hAnsi="Courier New"/>
+          <w:b w:val="0"/>
+          <w:i w:val="0"/>
+          <w:sz w:val="18"/>
+        </w:rPr>
+        <w:t>.env</w:t>
+      </w:r>
+      <w:r>
+        <w:rPr>
+          <w:b w:val="0"/>
+          <w:i w:val="0"/>
+        </w:rPr>
+        <w:t xml:space="preserve"> files (a newly generated local secret, never logged), and both servers ran from the clones during browser verification. No working-tree venv, node_modules or config was borrowed. MongoDB and the Playwright Chromium cache were the existing local prerequisites.</w:t>
+      </w:r>
+    </w:p>
+    <w:tbl>
+      <w:tblPr>
+        <w:tblStyle w:val="LightShading-Accent1"/>
+        <w:tblW w:type="auto" w:w="0"/>
+        <w:tblLayout w:type="fixed"/>
+        <w:tblLook w:firstColumn="1" w:firstRow="1" w:lastColumn="0" w:lastRow="0" w:noHBand="0" w:noVBand="1" w:val="04A0"/>
+      </w:tblPr>
+      <w:tblGrid>
+        <w:gridCol w:w="5017"/>
+        <w:gridCol w:w="5017"/>
+      </w:tblGrid>
+      <w:tr>
+        <w:trPr>
+          <w:tblHeader w:val="true"/>
+        </w:trPr>
+        <w:tc>
+          <w:tcPr>
+            <w:tcW w:type="dxa" w:w="3011"/>
+          </w:tcPr>
+          <w:p>
+            <w:pPr>
+              <w:keepNext w:val="0"/>
+              <w:keepLines w:val="0"/>
+              <w:spacing w:after="60"/>
+            </w:pPr>
+            <w:r>
+              <w:rPr>
+                <w:b/>
+                <w:i w:val="0"/>
+                <w:sz w:val="18"/>
+              </w:rPr>
+              <w:t>Fresh-clone command/check</w:t>
+            </w:r>
+          </w:p>
+        </w:tc>
+        <w:tc>
+          <w:tcPr>
+            <w:tcW w:type="dxa" w:w="7026"/>
+          </w:tcPr>
+          <w:p>
+            <w:pPr>
+              <w:keepNext w:val="0"/>
+              <w:keepLines w:val="0"/>
+              <w:spacing w:after="60"/>
+            </w:pPr>
+            <w:r>
+              <w:rPr>
+                <w:b/>
+                <w:i w:val="0"/>
+                <w:sz w:val="18"/>
+              </w:rPr>
+              <w:t>Actual result</w:t>
+            </w:r>
+          </w:p>
+        </w:tc>
+      </w:tr>
+      <w:tr>
+        <w:tc>
+          <w:tcPr>
+            <w:tcW w:type="dxa" w:w="3011"/>
+          </w:tcPr>
+          <w:p>
+            <w:pPr>
+              <w:keepNext w:val="0"/>
+              <w:keepLines w:val="0"/>
+              <w:spacing w:after="60"/>
+            </w:pPr>
+            <w:r>
+              <w:rPr>
+                <w:b w:val="0"/>
+                <w:i w:val="0"/>
+                <w:sz w:val="18"/>
+              </w:rPr>
+              <w:t>Fresh venv + install both requirements files</w:t>
+            </w:r>
+          </w:p>
+        </w:tc>
+        <w:tc>
+          <w:tcPr>
+            <w:tcW w:type="dxa" w:w="7026"/>
+          </w:tcPr>
+          <w:p>
+            <w:pPr>
+              <w:keepNext w:val="0"/>
+              <w:keepLines w:val="0"/>
+              <w:spacing w:after="60"/>
+            </w:pPr>
+            <w:r>
+              <w:rPr>
+                <w:b w:val="0"/>
+                <w:i w:val="0"/>
+                <w:sz w:val="18"/>
+              </w:rPr>
+              <w:t>Success</w:t>
+            </w:r>
+          </w:p>
+        </w:tc>
+      </w:tr>
+      <w:tr>
+        <w:tc>
+          <w:tcPr>
+            <w:tcW w:type="dxa" w:w="3011"/>
+          </w:tcPr>
+          <w:p>
+            <w:pPr>
+              <w:keepNext w:val="0"/>
+              <w:keepLines w:val="0"/>
+              <w:spacing w:after="60"/>
+            </w:pPr>
+            <w:r>
+              <w:rPr>
+                <w:rFonts w:ascii="Courier New" w:hAnsi="Courier New"/>
+                <w:b w:val="0"/>
+                <w:i w:val="0"/>
+                <w:sz w:val="18"/>
+              </w:rPr>
+              <w:t>python -m pip check</w:t>
+            </w:r>
+          </w:p>
+        </w:tc>
+        <w:tc>
+          <w:tcPr>
+            <w:tcW w:type="dxa" w:w="7026"/>
+          </w:tcPr>
+          <w:p>
+            <w:pPr>
+              <w:keepNext w:val="0"/>
+              <w:keepLines w:val="0"/>
+              <w:spacing w:after="60"/>
+            </w:pPr>
+            <w:r>
+              <w:rPr>
+                <w:b w:val="0"/>
+                <w:i w:val="0"/>
+                <w:sz w:val="18"/>
+              </w:rPr>
+              <w:t>No broken requirements found</w:t>
+            </w:r>
+          </w:p>
+        </w:tc>
+      </w:tr>
+      <w:tr>
+        <w:tc>
+          <w:tcPr>
+            <w:tcW w:type="dxa" w:w="3011"/>
+          </w:tcPr>
+          <w:p>
+            <w:pPr>
+              <w:keepNext w:val="0"/>
+              <w:keepLines w:val="0"/>
+              <w:spacing w:after="60"/>
+            </w:pPr>
+            <w:r>
+              <w:rPr>
+                <w:rFonts w:ascii="Courier New" w:hAnsi="Courier New"/>
+                <w:b w:val="0"/>
+                <w:i w:val="0"/>
+                <w:sz w:val="18"/>
+              </w:rPr>
+              <w:t>npm ci</w:t>
+            </w:r>
+            <w:r>
+              <w:rPr>
+                <w:b w:val="0"/>
+                <w:i w:val="0"/>
+                <w:sz w:val="18"/>
+              </w:rPr>
+              <w:t xml:space="preserve"> on Node 22.17.0</w:t>
+            </w:r>
+          </w:p>
+        </w:tc>
+        <w:tc>
+          <w:tcPr>
+            <w:tcW w:type="dxa" w:w="7026"/>
+          </w:tcPr>
+          <w:p>
+            <w:pPr>
+              <w:keepNext w:val="0"/>
+              <w:keepLines w:val="0"/>
+              <w:spacing w:after="60"/>
+            </w:pPr>
+            <w:r>
+              <w:rPr>
+                <w:b w:val="0"/>
+                <w:i w:val="0"/>
+                <w:sz w:val="18"/>
+              </w:rPr>
+              <w:t>Success; legacy CRA deprecation/audit notices retained in the install log</w:t>
+            </w:r>
+          </w:p>
+        </w:tc>
+      </w:tr>
+      <w:tr>
+        <w:tc>
+          <w:tcPr>
+            <w:tcW w:type="dxa" w:w="3011"/>
+          </w:tcPr>
+          <w:p>
+            <w:pPr>
+              <w:keepNext w:val="0"/>
+              <w:keepLines w:val="0"/>
+              <w:spacing w:after="60"/>
+            </w:pPr>
+            <w:r>
+              <w:rPr>
+                <w:rFonts w:ascii="Courier New" w:hAnsi="Courier New"/>
+                <w:b w:val="0"/>
+                <w:i w:val="0"/>
+                <w:sz w:val="18"/>
+              </w:rPr>
+              <w:t>npm run build</w:t>
+            </w:r>
+          </w:p>
+        </w:tc>
+        <w:tc>
+          <w:tcPr>
+            <w:tcW w:type="dxa" w:w="7026"/>
+          </w:tcPr>
+          <w:p>
+            <w:pPr>
+              <w:keepNext w:val="0"/>
+              <w:keepLines w:val="0"/>
+              <w:spacing w:after="60"/>
+            </w:pPr>
+            <w:r>
+              <w:rPr>
+                <w:b w:val="0"/>
+                <w:i w:val="0"/>
+                <w:sz w:val="18"/>
+              </w:rPr>
+              <w:t>Compiled successfully</w:t>
+            </w:r>
+          </w:p>
+        </w:tc>
+      </w:tr>
+      <w:tr>
+        <w:tc>
+          <w:tcPr>
+            <w:tcW w:type="dxa" w:w="3011"/>
+          </w:tcPr>
+          <w:p>
+            <w:pPr>
+              <w:keepNext w:val="0"/>
+              <w:keepLines w:val="0"/>
+              <w:spacing w:after="60"/>
+            </w:pPr>
+            <w:r>
+              <w:rPr>
+                <w:b w:val="0"/>
+                <w:i w:val="0"/>
+                <w:sz w:val="18"/>
+              </w:rPr>
+              <w:t>Unit suite</w:t>
+            </w:r>
+          </w:p>
+        </w:tc>
+        <w:tc>
+          <w:tcPr>
+            <w:tcW w:type="dxa" w:w="7026"/>
+          </w:tcPr>
+          <w:p>
+            <w:pPr>
+              <w:keepNext w:val="0"/>
+              <w:keepLines w:val="0"/>
+              <w:spacing w:after="60"/>
+            </w:pPr>
+            <w:r>
+              <w:rPr>
+                <w:b w:val="0"/>
+                <w:i w:val="0"/>
+                <w:sz w:val="18"/>
+              </w:rPr>
+              <w:t>306 passed in 6.06 s; network blocked by fixture sentinel</w:t>
+            </w:r>
+          </w:p>
+        </w:tc>
+      </w:tr>
+      <w:tr>
+        <w:tc>
+          <w:tcPr>
+            <w:tcW w:type="dxa" w:w="3011"/>
+          </w:tcPr>
+          <w:p>
+            <w:pPr>
+              <w:keepNext w:val="0"/>
+              <w:keepLines w:val="0"/>
+              <w:spacing w:after="60"/>
+            </w:pPr>
+            <w:r>
+              <w:rPr>
+                <w:b w:val="0"/>
+                <w:i w:val="0"/>
+                <w:sz w:val="18"/>
+              </w:rPr>
+              <w:t>Functional suite run 1 / run 2</w:t>
+            </w:r>
+          </w:p>
+        </w:tc>
+        <w:tc>
+          <w:tcPr>
+            <w:tcW w:type="dxa" w:w="7026"/>
+          </w:tcPr>
+          <w:p>
+            <w:pPr>
+              <w:keepNext w:val="0"/>
+              <w:keepLines w:val="0"/>
+              <w:spacing w:after="60"/>
+            </w:pPr>
+            <w:r>
+              <w:rPr>
+                <w:b w:val="0"/>
+                <w:i w:val="0"/>
+                <w:sz w:val="18"/>
+              </w:rPr>
+              <w:t>10 passed in 4.63 s / 10 passed in 4.00 s; no reset between</w:t>
+            </w:r>
+          </w:p>
+        </w:tc>
+      </w:tr>
+      <w:tr>
+        <w:tc>
+          <w:tcPr>
+            <w:tcW w:type="dxa" w:w="3011"/>
+          </w:tcPr>
+          <w:p>
+            <w:pPr>
+              <w:keepNext w:val="0"/>
+              <w:keepLines w:val="0"/>
+              <w:spacing w:after="60"/>
+            </w:pPr>
+            <w:r>
+              <w:rPr>
+                <w:b w:val="0"/>
+                <w:i w:val="0"/>
+                <w:sz w:val="18"/>
+              </w:rPr>
+              <w:t>Guarded seed run 1 / run 2</w:t>
+            </w:r>
+          </w:p>
+        </w:tc>
+        <w:tc>
+          <w:tcPr>
+            <w:tcW w:type="dxa" w:w="7026"/>
+          </w:tcPr>
+          <w:p>
+            <w:pPr>
+              <w:keepNext w:val="0"/>
+              <w:keepLines w:val="0"/>
+              <w:spacing w:after="60"/>
+            </w:pPr>
+            <w:r>
+              <w:rPr>
+                <w:b w:val="0"/>
+                <w:i w:val="0"/>
+                <w:sz w:val="18"/>
+              </w:rPr>
+              <w:t>Stable 2 vendors / 6 users / 5 items / 2 carts / 9 orders</w:t>
+            </w:r>
+          </w:p>
+        </w:tc>
+      </w:tr>
+      <w:tr>
+        <w:tc>
+          <w:tcPr>
+            <w:tcW w:type="dxa" w:w="3011"/>
+          </w:tcPr>
+          <w:p>
+            <w:pPr>
+              <w:keepNext w:val="0"/>
+              <w:keepLines w:val="0"/>
+              <w:spacing w:after="60"/>
+            </w:pPr>
+            <w:r>
+              <w:rPr>
+                <w:b w:val="0"/>
+                <w:i w:val="0"/>
+                <w:sz w:val="18"/>
+              </w:rPr>
+              <w:t>Browser suite run 1 / run 2</w:t>
+            </w:r>
+          </w:p>
+        </w:tc>
+        <w:tc>
+          <w:tcPr>
+            <w:tcW w:type="dxa" w:w="7026"/>
+          </w:tcPr>
+          <w:p>
+            <w:pPr>
+              <w:keepNext w:val="0"/>
+              <w:keepLines w:val="0"/>
+              <w:spacing w:after="60"/>
+            </w:pPr>
+            <w:r>
+              <w:rPr>
+                <w:b w:val="0"/>
+                <w:i w:val="0"/>
+                <w:sz w:val="18"/>
+              </w:rPr>
+              <w:t>1 passed in 15.39 s / 1 passed in 11.45 s; no reset between; existing UUID warning</w:t>
+            </w:r>
+          </w:p>
+        </w:tc>
+      </w:tr>
+      <w:tr>
+        <w:tc>
+          <w:tcPr>
+            <w:tcW w:type="dxa" w:w="3011"/>
+          </w:tcPr>
+          <w:p>
+            <w:pPr>
+              <w:keepNext w:val="0"/>
+              <w:keepLines w:val="0"/>
+              <w:spacing w:after="60"/>
+            </w:pPr>
+            <w:r>
+              <w:rPr>
+                <w:b w:val="0"/>
+                <w:i w:val="0"/>
+                <w:sz w:val="18"/>
+              </w:rPr>
+              <w:t>Artifact access</w:t>
+            </w:r>
+          </w:p>
+        </w:tc>
+        <w:tc>
+          <w:tcPr>
+            <w:tcW w:type="dxa" w:w="7026"/>
+          </w:tcPr>
+          <w:p>
+            <w:pPr>
+              <w:keepNext w:val="0"/>
+              <w:keepLines w:val="0"/>
+              <w:spacing w:after="60"/>
+            </w:pPr>
+            <w:r>
+              <w:rPr>
+                <w:b w:val="0"/>
+                <w:i w:val="0"/>
+                <w:sz w:val="18"/>
+              </w:rPr>
+              <w:t>DOCX/PDF, performance CSVs and narration script present and readable</w:t>
+            </w:r>
+          </w:p>
+        </w:tc>
+      </w:tr>
+    </w:tbl>
+    <w:p>
+      <w:pPr>
+        <w:spacing w:after="0"/>
+      </w:pPr>
+    </w:p>
+    <w:p>
+      <w:pPr/>
+      <w:r>
+        <w:rPr>
+          <w:b w:val="0"/>
+          <w:i w:val="0"/>
+        </w:rPr>
+        <w:t xml:space="preserve">Exact output is in </w:t>
+      </w:r>
+      <w:r>
+        <w:rPr>
+          <w:rFonts w:ascii="Courier New" w:hAnsi="Courier New"/>
+          <w:b w:val="0"/>
+          <w:i w:val="0"/>
+          <w:sz w:val="18"/>
+        </w:rPr>
+        <w:t>clone-*.log</w:t>
+      </w:r>
+      <w:r>
+        <w:rPr>
+          <w:b w:val="0"/>
+          <w:i w:val="0"/>
+        </w:rPr>
+        <w:t xml:space="preserve">. After both browser runs, canonical seed data was restored and both servers were restarted from the working repositories for the user's demonstration. This was not a reset between verification runs. The original local development database was not cleared. The legacy CRA dependency notices were recorded; no forced dependency migration was performed because it would change the required lab build toolchain. The earlier Qwen fresh-clone rehearsal remains in </w:t>
       </w:r>
       <w:r>
         <w:rPr>

</xml_diff>

<commit_message>
docs: verify frontend assessment requirements and refresh report evidence
</commit_message>
<xml_diff>
--- a/docs/report/SkipQ_Report_Draft.docx
+++ b/docs/report/SkipQ_Report_Draft.docx
@@ -602,7 +602,7 @@
           <w:b w:val="0"/>
           <w:i w:val="0"/>
         </w:rPr>
-        <w:t xml:space="preserve"> The offline suite (306 tests, network-blocked by a socket sentinel) supplies records and stubs only the persistence boundary; the named methods run for real. </w:t>
+        <w:t xml:space="preserve"> The offline suite (313 tests, network-blocked by a socket sentinel) supplies records and stubs only the persistence boundary; the named methods run for real. </w:t>
       </w:r>
       <w:r>
         <w:rPr>
@@ -962,7 +962,7 @@
           <w:b w:val="0"/>
           <w:i w:val="0"/>
         </w:rPr>
-        <w:t xml:space="preserve">The frontend is CRA with React Router 6; all routes live in </w:t>
+        <w:t xml:space="preserve">The frontend is CRA with React Router 6; routes live in </w:t>
       </w:r>
       <w:r>
         <w:rPr>
@@ -1208,7 +1208,7 @@
           <w:b w:val="0"/>
           <w:i w:val="0"/>
         </w:rPr>
-        <w:t xml:space="preserve">. Sold-out and closed state are visible before the diner can act; the checkout key is minted when the page loads and retained across retries of the same attempt; the stale-cart refusal screen offers Review / Refresh-and-retry; and the vendor's order-detail controls render strictly from the response's </w:t>
+        <w:t xml:space="preserve">. Sold-out and closed state, including unavailable cart lines, are visible before acting; the checkout key is minted when the page loads and retained across retries of the same attempt; the stale-cart refusal screen offers Review / Refresh-and-retry; and the vendor's order-detail controls render strictly from the response's </w:t>
       </w:r>
       <w:r>
         <w:rPr>
@@ -1349,7 +1349,7 @@
           <w:b w:val="0"/>
           <w:i w:val="0"/>
         </w:rPr>
-        <w:t xml:space="preserve"> The Playwright suite signs the diner and the vendor in through the real login screen in two isolated browser contexts — no token is injected into either browser. The diner clears the seeded cart, adds one item and checks out through the screen that mints the checkout key itself; the paid screen displays the new queue number, and the vendor's polling queue surfaces that exact number before Accept, Mark ready and Mark collected on the vendor's screens. After each transition the diner's tracking screen — polling on its own timer in the other context — is observed to display Preparing, then the Ready-for-collection notice, then terminal Collected. An in-process functional test cannot establish this: the Flask test client does not render React routing or DOM banners, does not exercise the checkout key the UI mints, and cannot show two independently polling browsers converging on the persisted state. Run 1 passed in 12.02 s and run 2 in 11.48 s against the same seeded guarded database, no reset between runs (</w:t>
+        <w:t xml:space="preserve"> The Playwright suite signs the diner and the vendor in through the real login screen in two isolated browser contexts — no token is injected into either browser. The diner clears the seeded cart, adds one item and checks out through the screen that mints the checkout key itself; the paid screen displays the new queue number, and the vendor's polling queue surfaces that exact number before Accept, Mark ready and Mark collected on the vendor's screens. After each transition the diner's tracking screen — polling on its own timer in the other context — is observed to display Preparing, then the Ready-for-collection notice, then terminal Collected. An in-process functional test cannot establish this: the Flask test client does not render React routing or DOM banners, does not exercise the checkout key the UI mints, and cannot show two independently polling browsers converging on the persisted state. Run 1 passed in 11.28 s and run 2 in 11.36 s against the same seeded guarded database, no reset between runs (</w:t>
       </w:r>
       <w:r>
         <w:rPr>
@@ -1358,7 +1358,7 @@
           <w:i w:val="0"/>
           <w:sz w:val="18"/>
         </w:rPr>
-        <w:t>docs/evidence/browser-lifecycle/run-1.log</w:t>
+        <w:t>docs/evidence/frontend-quality/browser-1.log</w:t>
       </w:r>
       <w:r>
         <w:rPr>
@@ -1374,7 +1374,7 @@
           <w:i w:val="0"/>
           <w:sz w:val="18"/>
         </w:rPr>
-        <w:t>run-2.log</w:t>
+        <w:t>browser-2.log</w:t>
       </w:r>
       <w:r>
         <w:rPr>
@@ -1657,7 +1657,7 @@
           <w:b w:val="0"/>
           <w:i w:val="0"/>
         </w:rPr>
-        <w:t xml:space="preserve">) and must Review or Refresh-and-retry. Who experiences it: any diner whose menu changes while they browse — the refusal names the reason, not the offending line or its fix. </w:t>
+        <w:t xml:space="preserve">) and must Review or Refresh-and-retry. Who experiences it: any diner whose menu changes while they browse — the refusal explains the cause, but editing individual lines still requires leaving checkout. </w:t>
       </w:r>
       <w:r>
         <w:rPr>
@@ -2902,7 +2902,7 @@
                 <w:i w:val="0"/>
                 <w:sz w:val="18"/>
               </w:rPr>
-              <w:t>Preorder time and registration are removed from the selected scope. Added: open/closed/sold-out state visible before the action, explicit simulation success/failure with retry, pending-submit feedback, the stale-cart refusal screen, and a readable Ready banner. The Payment Success screen is merged into Order Tracking so the queue number and live status live on one screen; US10's history reuses the Order List/Detail screens (see C4).</w:t>
+              <w:t>Preorder time and registration are removed from the selected scope. Added: open/closed/sold-out state visible before the action, explicit simulation success/failure with retry, pending-submit feedback, the stale-cart refusal screen, and a readable Ready banner. Cart/checkout now display known unavailable lines and stall closure before payment; failed reads offer retry instead of endless loading. Payment Success is a state within Checkout with its queue number and a link to the separate Order Tracking screen; US10's history reuses the Order List/Detail screens (see C4).</w:t>
             </w:r>
           </w:p>
         </w:tc>
@@ -3402,7 +3402,7 @@
                 <w:i w:val="0"/>
                 <w:sz w:val="18"/>
               </w:rPr>
-              <w:t>Added the open/close switch and closed banner, current-state permitted controls (only the allowed next statuses are offered), the paid queue staying accessible after closure, and the refund/early-no-show/refused-transition displays. Business-insights and profile editing (US11) are outside the selected scope.</w:t>
+              <w:t>Added the open/close switch and closed banner, current-state permitted controls (only the allowed next statuses are offered), the paid queue staying accessible after closure, and the refund/early-no-show/refused-transition displays. The queue keeps polling when empty or wholly terminal so incoming orders become visible; Ready explains the 30-minute no-show wait. Business-insights and profile editing (US11) are outside the selected scope.</w:t>
             </w:r>
           </w:p>
         </w:tc>
@@ -3970,7 +3970,7 @@
                 <w:i w:val="0"/>
                 <w:sz w:val="18"/>
               </w:rPr>
-              <w:t>Keep the seeded Login only; add the role redirect, protected navigation, shared token-expiry feedback, and logout. UI route gating is usability; the server remains the security boundary.</w:t>
+              <w:t>Keep the seeded Login only; add the role redirect, protected navigation, shared token-expiry feedback, and logout. Sign-in has a synchronous pending guard and returns to the requested route within the correct persona area. UI route gating is usability; the server remains the security boundary.</w:t>
             </w:r>
           </w:p>
         </w:tc>
@@ -6001,6 +6001,88 @@
                 <w:sz w:val="17"/>
               </w:rPr>
               <w:t>Checkout now displays actionable errors and retains the same retry key; menu/cart mutations use the existing synchronous in-flight guard; Unicode tokens return 401 before lookup. Four frontend diagnostic checks passed after meaningful failing runs; four token regressions were added. Current offline unit suite is 306 cases; functional/browser pairs and the demo rehearsal pass. All four original-GBA support classifications remain partially supported. See docs/assessment/codex-handover.md.</w:t>
+            </w:r>
+          </w:p>
+        </w:tc>
+      </w:tr>
+      <w:tr>
+        <w:tc>
+          <w:tcPr>
+            <w:tcW w:type="dxa" w:w="1405"/>
+          </w:tcPr>
+          <w:p>
+            <w:pPr>
+              <w:keepNext w:val="0"/>
+              <w:keepLines w:val="0"/>
+              <w:spacing w:after="60"/>
+            </w:pPr>
+            <w:r>
+              <w:rPr>
+                <w:b w:val="0"/>
+                <w:i w:val="0"/>
+                <w:sz w:val="17"/>
+              </w:rPr>
+              <w:t>2026-10-07</w:t>
+            </w:r>
+          </w:p>
+        </w:tc>
+        <w:tc>
+          <w:tcPr>
+            <w:tcW w:type="dxa" w:w="2308"/>
+          </w:tcPr>
+          <w:p>
+            <w:pPr>
+              <w:keepNext w:val="0"/>
+              <w:keepLines w:val="0"/>
+              <w:spacing w:after="60"/>
+            </w:pPr>
+            <w:r>
+              <w:rPr>
+                <w:b w:val="0"/>
+                <w:i w:val="0"/>
+                <w:sz w:val="17"/>
+              </w:rPr>
+              <w:t>C1/C2/C3</w:t>
+            </w:r>
+          </w:p>
+        </w:tc>
+        <w:tc>
+          <w:tcPr>
+            <w:tcW w:type="dxa" w:w="3613"/>
+          </w:tcPr>
+          <w:p>
+            <w:pPr>
+              <w:keepNext w:val="0"/>
+              <w:keepLines w:val="0"/>
+              <w:spacing w:after="60"/>
+            </w:pPr>
+            <w:r>
+              <w:rPr>
+                <w:b w:val="0"/>
+                <w:i w:val="0"/>
+                <w:sz w:val="17"/>
+              </w:rPr>
+              <w:t>Frontend review found invisible navigation, unguarded sign-in/vendor mutations, perpetual failed-read loading, missing cart availability/trading state and an incoming queue that stopped polling when empty/terminal</w:t>
+            </w:r>
+          </w:p>
+        </w:tc>
+        <w:tc>
+          <w:tcPr>
+            <w:tcW w:type="dxa" w:w="2710"/>
+          </w:tcPr>
+          <w:p>
+            <w:pPr>
+              <w:keepNext w:val="0"/>
+              <w:keepLines w:val="0"/>
+              <w:spacing w:after="60"/>
+            </w:pPr>
+            <w:r>
+              <w:rPr>
+                <w:b w:val="0"/>
+                <w:i w:val="0"/>
+                <w:sz w:val="17"/>
+              </w:rPr>
+              <w:t>Corrected these behaviours using the existing architecture; known unavailable/closed state is shown before payment, pending controls are guarded, read failures offer recovery, and incoming queues keep polling. Current proof: 313 unit cases; 24 browser diagnostics; 26/37/15 diner/vendor/history UI checks; repeated functional and assessed browser lifecycle; refreshed authentic screenshots. The GBA support classifications remain partially supported. See docs/assessment/frontend-quality-review.md.</w:t>
             </w:r>
           </w:p>
         </w:tc>
@@ -13256,36 +13338,44 @@
                 <w:i w:val="0"/>
                 <w:sz w:val="18"/>
               </w:rPr>
+              <w:t>/</w:t>
+            </w:r>
+          </w:p>
+        </w:tc>
+        <w:tc>
+          <w:tcPr>
+            <w:tcW w:type="dxa" w:w="3914"/>
+          </w:tcPr>
+          <w:p>
+            <w:pPr>
+              <w:keepNext w:val="0"/>
+              <w:keepLines w:val="0"/>
+              <w:spacing w:after="60"/>
+            </w:pPr>
+            <w:r>
+              <w:rPr>
+                <w:b w:val="0"/>
+                <w:i w:val="0"/>
+                <w:sz w:val="18"/>
+              </w:rPr>
+              <w:t xml:space="preserve">Redirect to </w:t>
+            </w:r>
+            <w:r>
+              <w:rPr>
+                <w:rFonts w:ascii="Courier New" w:hAnsi="Courier New"/>
+                <w:b w:val="0"/>
+                <w:i w:val="0"/>
+                <w:sz w:val="18"/>
+              </w:rPr>
               <w:t>/login</w:t>
             </w:r>
-          </w:p>
-        </w:tc>
-        <w:tc>
-          <w:tcPr>
-            <w:tcW w:type="dxa" w:w="3914"/>
-          </w:tcPr>
-          <w:p>
-            <w:pPr>
-              <w:keepNext w:val="0"/>
-              <w:keepLines w:val="0"/>
-              <w:spacing w:after="60"/>
-            </w:pPr>
-            <w:r>
-              <w:rPr>
-                <w:rFonts w:ascii="Courier New" w:hAnsi="Courier New"/>
-                <w:b w:val="0"/>
-                <w:i w:val="0"/>
-                <w:sz w:val="18"/>
-              </w:rPr>
-              <w:t>LoginPage</w:t>
-            </w:r>
-            <w:r>
-              <w:rPr>
-                <w:b w:val="0"/>
-                <w:i w:val="0"/>
-                <w:sz w:val="18"/>
-              </w:rPr>
-              <w:t xml:space="preserve"> — seeded-account sign-in with the backend's refusal text</w:t>
+            <w:r>
+              <w:rPr>
+                <w:b w:val="0"/>
+                <w:i w:val="0"/>
+                <w:sz w:val="18"/>
+              </w:rPr>
+              <w:t>, which routes a signed-in persona to their home</w:t>
             </w:r>
           </w:p>
         </w:tc>
@@ -13328,7 +13418,7 @@
                 <w:i w:val="0"/>
                 <w:sz w:val="18"/>
               </w:rPr>
-              <w:t>/diner/stalls</w:t>
+              <w:t>/login</w:t>
             </w:r>
           </w:p>
         </w:tc>
@@ -13349,15 +13439,15 @@
                 <w:i w:val="0"/>
                 <w:sz w:val="18"/>
               </w:rPr>
-              <w:t>StallsPage</w:t>
-            </w:r>
-            <w:r>
-              <w:rPr>
-                <w:b w:val="0"/>
-                <w:i w:val="0"/>
-                <w:sz w:val="18"/>
-              </w:rPr>
-              <w:t xml:space="preserve"> — open-stall discovery</w:t>
+              <w:t>LoginPage</w:t>
+            </w:r>
+            <w:r>
+              <w:rPr>
+                <w:b w:val="0"/>
+                <w:i w:val="0"/>
+                <w:sz w:val="18"/>
+              </w:rPr>
+              <w:t xml:space="preserve"> — seeded-account sign-in with the backend's refusal text</w:t>
             </w:r>
           </w:p>
         </w:tc>
@@ -13377,7 +13467,7 @@
                 <w:i w:val="0"/>
                 <w:sz w:val="18"/>
               </w:rPr>
-              <w:t>diner</w:t>
+              <w:t>public</w:t>
             </w:r>
           </w:p>
         </w:tc>
@@ -13400,7 +13490,7 @@
                 <w:i w:val="0"/>
                 <w:sz w:val="18"/>
               </w:rPr>
-              <w:t>/diner/stalls/:stallId</w:t>
+              <w:t>/diner/stalls</w:t>
             </w:r>
           </w:p>
         </w:tc>
@@ -13421,15 +13511,15 @@
                 <w:i w:val="0"/>
                 <w:sz w:val="18"/>
               </w:rPr>
-              <w:t>MenuPage</w:t>
-            </w:r>
-            <w:r>
-              <w:rPr>
-                <w:b w:val="0"/>
-                <w:i w:val="0"/>
-                <w:sz w:val="18"/>
-              </w:rPr>
-              <w:t xml:space="preserve"> — one stall's menu</w:t>
+              <w:t>StallsPage</w:t>
+            </w:r>
+            <w:r>
+              <w:rPr>
+                <w:b w:val="0"/>
+                <w:i w:val="0"/>
+                <w:sz w:val="18"/>
+              </w:rPr>
+              <w:t xml:space="preserve"> — open-stall discovery</w:t>
             </w:r>
           </w:p>
         </w:tc>
@@ -13472,6 +13562,78 @@
                 <w:i w:val="0"/>
                 <w:sz w:val="18"/>
               </w:rPr>
+              <w:t>/diner/stalls/:stallId</w:t>
+            </w:r>
+          </w:p>
+        </w:tc>
+        <w:tc>
+          <w:tcPr>
+            <w:tcW w:type="dxa" w:w="3914"/>
+          </w:tcPr>
+          <w:p>
+            <w:pPr>
+              <w:keepNext w:val="0"/>
+              <w:keepLines w:val="0"/>
+              <w:spacing w:after="60"/>
+            </w:pPr>
+            <w:r>
+              <w:rPr>
+                <w:rFonts w:ascii="Courier New" w:hAnsi="Courier New"/>
+                <w:b w:val="0"/>
+                <w:i w:val="0"/>
+                <w:sz w:val="18"/>
+              </w:rPr>
+              <w:t>MenuPage</w:t>
+            </w:r>
+            <w:r>
+              <w:rPr>
+                <w:b w:val="0"/>
+                <w:i w:val="0"/>
+                <w:sz w:val="18"/>
+              </w:rPr>
+              <w:t xml:space="preserve"> — one stall's menu</w:t>
+            </w:r>
+          </w:p>
+        </w:tc>
+        <w:tc>
+          <w:tcPr>
+            <w:tcW w:type="dxa" w:w="4316"/>
+          </w:tcPr>
+          <w:p>
+            <w:pPr>
+              <w:keepNext w:val="0"/>
+              <w:keepLines w:val="0"/>
+              <w:spacing w:after="60"/>
+            </w:pPr>
+            <w:r>
+              <w:rPr>
+                <w:b w:val="0"/>
+                <w:i w:val="0"/>
+                <w:sz w:val="18"/>
+              </w:rPr>
+              <w:t>diner</w:t>
+            </w:r>
+          </w:p>
+        </w:tc>
+      </w:tr>
+      <w:tr>
+        <w:tc>
+          <w:tcPr>
+            <w:tcW w:type="dxa" w:w="1807"/>
+          </w:tcPr>
+          <w:p>
+            <w:pPr>
+              <w:keepNext w:val="0"/>
+              <w:keepLines w:val="0"/>
+              <w:spacing w:after="60"/>
+            </w:pPr>
+            <w:r>
+              <w:rPr>
+                <w:rFonts w:ascii="Courier New" w:hAnsi="Courier New"/>
+                <w:b w:val="0"/>
+                <w:i w:val="0"/>
+                <w:sz w:val="18"/>
+              </w:rPr>
               <w:t>/diner/cart</w:t>
             </w:r>
           </w:p>
@@ -13501,7 +13663,7 @@
                 <w:i w:val="0"/>
                 <w:sz w:val="18"/>
               </w:rPr>
-              <w:t xml:space="preserve"> — cart, server total, fingerprint</w:t>
+              <w:t xml:space="preserve"> — cart, availability and server total</w:t>
             </w:r>
           </w:p>
         </w:tc>
@@ -14902,7 +15064,24 @@
                 <w:i w:val="0"/>
                 <w:sz w:val="17"/>
               </w:rPr>
-              <w:t>, rendered inside both persona layouts and the login screen.</w:t>
+              <w:t xml:space="preserve">, rendered inside both persona layouts and the login screen; </w:t>
+            </w:r>
+            <w:r>
+              <w:rPr>
+                <w:rFonts w:ascii="Courier New" w:hAnsi="Courier New"/>
+                <w:b w:val="0"/>
+                <w:i w:val="0"/>
+                <w:sz w:val="17"/>
+              </w:rPr>
+              <w:t>src/components/LoadState.jsx</w:t>
+            </w:r>
+            <w:r>
+              <w:rPr>
+                <w:b w:val="0"/>
+                <w:i w:val="0"/>
+                <w:sz w:val="17"/>
+              </w:rPr>
+              <w:t xml:space="preserve"> offers retry after a failed read instead of leaving a loading placeholder.</w:t>
             </w:r>
           </w:p>
         </w:tc>
@@ -16127,7 +16306,7 @@
         <w:spacing w:after="240"/>
       </w:pPr>
       <w:r>
-        <w:t>Figure F6. Cart after stepper/removal edits: 2× M1, total $13.00, fingerprint shown</w:t>
+        <w:t>Figure F6. Cart after stepper/removal edits: 2× M1, total $13.00, server-computed total</w:t>
         <w:br/>
         <w:t>Source: docs/evidence/screenshots/task8-05-cart-edited.png</w:t>
       </w:r>
@@ -16184,7 +16363,7 @@
         <w:spacing w:after="240"/>
       </w:pPr>
       <w:r>
-        <w:t>Figure F7. Checkout summary, 64-char server fingerprint, PayNow selected</w:t>
+        <w:t>Figure F7. Checkout summary, payable total, PayNow selected; fingerprint remains internal</w:t>
         <w:br/>
         <w:t>Source: docs/evidence/screenshots/task8-06-checkout.png</w:t>
       </w:r>
@@ -22329,6 +22508,70 @@
       </w:r>
     </w:p>
     <w:p>
+      <w:pPr>
+        <w:pStyle w:val="Heading2"/>
+      </w:pPr>
+      <w:r>
+        <w:rPr>
+          <w:b w:val="0"/>
+          <w:i w:val="0"/>
+        </w:rPr>
+        <w:t>P17 — Frontend assessment quality review (Q1, Q2–Q6; Q7 preparation)</w:t>
+      </w:r>
+    </w:p>
+    <w:p>
+      <w:pPr/>
+      <w:r>
+        <w:rPr>
+          <w:b w:val="0"/>
+          <w:i w:val="0"/>
+        </w:rPr>
+        <w:t>Exact user prompt:</w:t>
+      </w:r>
+    </w:p>
+    <w:p>
+      <w:pPr>
+        <w:spacing w:after="0" w:line="240" w:lineRule="auto"/>
+      </w:pPr>
+      <w:r>
+        <w:rPr>
+          <w:rFonts w:ascii="Courier New" w:hAnsi="Courier New"/>
+          <w:sz w:val="16"/>
+        </w:rPr>
+        <w:t>can you help me to ensure the frontend is up tonstandard so i will not lose point due to it</w:t>
+      </w:r>
+    </w:p>
+    <w:p>
+      <w:pPr/>
+      <w:r>
+        <w:rPr>
+          <w:b w:val="0"/>
+          <w:i w:val="0"/>
+        </w:rPr>
+        <w:t>Codex reviewed the original Q5/Q6 requirements, the existing approved design and all frontend source, reproduced observable defects through the running browser, and directly implemented the corrections without delegating to another agent. Outputs: readable navigation, public entry/return-path handling, guarded sign-in/vendor actions, shared failed-read recovery, known unavailable/closed cart and checkout state, payment-time controls, incoming-order queue polling, clearer Ready guidance and mobile wrapping. Cart JSON retains its existing vendor ID and adds derived stall presentation data; inactive items are unavailable. Product dependencies were unchanged.</w:t>
+      </w:r>
+    </w:p>
+    <w:p>
+      <w:pPr/>
+      <w:r>
+        <w:rPr>
+          <w:b w:val="0"/>
+          <w:i w:val="0"/>
+        </w:rPr>
+        <w:t>Verification: meaningful failing browser checks are retained in red.log, queue-red.log, removed-red.log and closed-red.log; failing unit cases are in cart-availability-red.log/cart-stall-red.log. The corrected supplementary browser review passed 24 checks and restored its guarded records. Original local diner/vendor/history QA scripts were adapted into portable guarded copies and rerun (26/37/15 passing checks); a stale technical-copy assertion failed in the first diner run and was replaced with visible failure feedback plus an assertion on actual emitted retry keys, with the failure log preserved. This is supplementary UI verification, not an implementation of Q4(c)'s designed H01–H11 functional suite.</w:t>
+      </w:r>
+    </w:p>
+    <w:p>
+      <w:pPr/>
+      <w:r>
+        <w:rPr>
+          <w:b w:val="0"/>
+          <w:i w:val="0"/>
+        </w:rPr>
+        <w:t>Final offline suite: 313 passed; functional suite: 10 passed twice without reset between (4.27/3.88 s); assessed real-API browser lifecycle: 1 passed twice without reset between (11.28/11.36 s); production build successful; 30 desktop/small-screen layouts had no horizontal overflow or uncaught page errors. Both actual demo refusals and the complete same-order lifecycle passed. All persona screenshots, route table, flow explanations, Q1 screen-gap notes, recording sequence and report drafts were refreshed. Diagnostic HTTP faults are explicitly labelled; no fabricated evidence, narrated video, push or submission is claimed. Existing historical disclosure gaps remain visible.</w:t>
+      </w:r>
+    </w:p>
+    <w:p>
       <w:r>
         <w:br w:type="page"/>
       </w:r>
@@ -26637,7 +26880,7 @@
           <w:b w:val="0"/>
           <w:i w:val="0"/>
         </w:rPr>
-        <w:t xml:space="preserve"> — narrative source, approximately 2,982 words; Q7(b) 471 words; Q6 verdict 88 words (appendices/tables/figures excluded).</w:t>
+        <w:t xml:space="preserve"> — narrative source, approximately 2,700 whitespace-separated narrative words; Q7(b) 472 words; Q6 verdict 88 words (appendices/tables/figures excluded).</w:t>
       </w:r>
     </w:p>
     <w:p>
@@ -27583,6 +27826,74 @@
           <w:i w:val="0"/>
         </w:rPr>
         <w:t>The working-repository servers were started for verification on 127.0.0.1:5001 (skipq_system_test) and 127.0.0.1:5173. Development data was not cleared. Re-run the documented start commands if these processes have stopped.</w:t>
+      </w:r>
+    </w:p>
+    <w:p>
+      <w:pPr>
+        <w:pStyle w:val="Heading2"/>
+      </w:pPr>
+      <w:r>
+        <w:rPr>
+          <w:b w:val="0"/>
+          <w:i w:val="0"/>
+        </w:rPr>
+        <w:t>Subsequent frontend assessment review</w:t>
+      </w:r>
+    </w:p>
+    <w:p>
+      <w:pPr/>
+      <w:r>
+        <w:rPr>
+          <w:b w:val="0"/>
+          <w:i w:val="0"/>
+        </w:rPr>
+        <w:t xml:space="preserve">The user's frontend quality request is recorded in P17. This review supersedes the earlier final counts above: </w:t>
+      </w:r>
+      <w:r>
+        <w:rPr>
+          <w:b/>
+          <w:i w:val="0"/>
+        </w:rPr>
+        <w:t>313 unit passed; 24 targeted browser checks passed; functional 10 passed twice; assessed browser 1 passed twice; production build and full demo rehearsal passed.</w:t>
+      </w:r>
+      <w:r>
+        <w:rPr>
+          <w:b w:val="0"/>
+          <w:i w:val="0"/>
+        </w:rPr>
+        <w:t xml:space="preserve"> Thirty layouts at 1280/375/320 pixels showed no horizontal overflow or uncaught page errors. Known closed/unavailable cart state, navigation, request guards, read recovery and incoming-queue polling were corrected; the report screenshots and recording sequence were refreshed. See </w:t>
+      </w:r>
+      <w:r>
+        <w:rPr>
+          <w:rFonts w:ascii="Courier New" w:hAnsi="Courier New"/>
+          <w:b w:val="0"/>
+          <w:i w:val="0"/>
+          <w:sz w:val="18"/>
+        </w:rPr>
+        <w:t>frontend-quality-review.md</w:t>
+      </w:r>
+      <w:r>
+        <w:rPr>
+          <w:b w:val="0"/>
+          <w:i w:val="0"/>
+        </w:rPr>
+        <w:t xml:space="preserve"> and </w:t>
+      </w:r>
+      <w:r>
+        <w:rPr>
+          <w:rFonts w:ascii="Courier New" w:hAnsi="Courier New"/>
+          <w:b w:val="0"/>
+          <w:i w:val="0"/>
+          <w:sz w:val="18"/>
+        </w:rPr>
+        <w:t>docs/evidence/frontend-quality/</w:t>
+      </w:r>
+      <w:r>
+        <w:rPr>
+          <w:b w:val="0"/>
+          <w:i w:val="0"/>
+        </w:rPr>
+        <w:t xml:space="preserve"> for exact proof and measurement limits. This stage changes no product dependency or installation prerequisite; the earlier independent clean-clone installation evidence remains historical, and current app behaviour was verified from the working repositories. Human actions and publishing boundaries remain unchanged.</w:t>
       </w:r>
     </w:p>
     <w:sectPr>

</xml_diff>

<commit_message>
docs: add verified narrated live demo and link report artifacts
</commit_message>
<xml_diff>
--- a/docs/report/SkipQ_Report_Draft.docx
+++ b/docs/report/SkipQ_Report_Draft.docx
@@ -1554,53 +1554,52 @@
           <w:b w:val="0"/>
           <w:i w:val="0"/>
         </w:rPr>
-        <w:t xml:space="preserve"> Preparation for the narrated ≤8-minute 720p MP4 is in </w:t>
-      </w:r>
-      <w:r>
-        <w:rPr>
-          <w:rFonts w:ascii="Courier New" w:hAnsi="Courier New"/>
-          <w:b w:val="0"/>
-          <w:i w:val="0"/>
-          <w:sz w:val="18"/>
-        </w:rPr>
-        <w:t>q7-screencast/</w:t>
-      </w:r>
-      <w:r>
-        <w:rPr>
-          <w:b w:val="0"/>
-          <w:i w:val="0"/>
-        </w:rPr>
-        <w:t xml:space="preserve"> (backend repository): a timed narration script with the expected visible outcome stated before each step, the demo-data checklist, the recording steps, and a scripted demo run that executed the exact script headlessly and verified each visible refusal (</w:t>
-      </w:r>
-      <w:r>
-        <w:rPr>
-          <w:rFonts w:ascii="Courier New" w:hAnsi="Courier New"/>
-          <w:b w:val="0"/>
-          <w:i w:val="0"/>
-          <w:sz w:val="18"/>
-        </w:rPr>
-        <w:t>q7-screencast/demo-run-log.md</w:t>
-      </w:r>
-      <w:r>
-        <w:rPr>
-          <w:b w:val="0"/>
-          <w:i w:val="0"/>
-        </w:rPr>
-        <w:t xml:space="preserve">). The narrated recording itself is made by the student: </w:t>
-      </w:r>
-      <w:r>
-        <w:rPr>
-          <w:b/>
-          <w:i w:val="0"/>
-        </w:rPr>
-        <w:t>[RECORDING LINK PENDING — human-only]</w:t>
-      </w:r>
-      <w:r>
-        <w:rPr>
-          <w:b w:val="0"/>
-          <w:i w:val="0"/>
-        </w:rPr>
-        <w:t>.</w:t>
+        <w:t xml:space="preserve"> </w:t>
+      </w:r>
+      <w:hyperlink r:id="rId11">
+        <w:r>
+          <w:rPr>
+            <w:color w:val="174469"/>
+          </w:rPr>
+          <w:t>Narrated demonstration MP4</w:t>
+        </w:r>
+      </w:hyperlink>
+      <w:r>
+        <w:rPr>
+          <w:b w:val="0"/>
+          <w:i w:val="0"/>
+        </w:rPr>
+        <w:t xml:space="preserve">: 6:26, 1280×720, 7.9 MB, with captions. It records real UI actions across both signed-in roles, the same order through collection and both announced checkout refusals; payment failure/retry and elapsed waits are retained. Browser actions are automated and narration is computer-generated, disclosed on screen and in </w:t>
+      </w:r>
+      <w:hyperlink r:id="rId12">
+        <w:r>
+          <w:rPr>
+            <w:color w:val="174469"/>
+          </w:rPr>
+          <w:t>production notes</w:t>
+        </w:r>
+      </w:hyperlink>
+      <w:r>
+        <w:rPr>
+          <w:b w:val="0"/>
+          <w:i w:val="0"/>
+        </w:rPr>
+        <w:t>. Full audio/video decoding and live UI checks passed (</w:t>
+      </w:r>
+      <w:hyperlink r:id="rId13">
+        <w:r>
+          <w:rPr>
+            <w:color w:val="174469"/>
+          </w:rPr>
+          <w:t>verification</w:t>
+        </w:r>
+      </w:hyperlink>
+      <w:r>
+        <w:rPr>
+          <w:b w:val="0"/>
+          <w:i w:val="0"/>
+        </w:rPr>
+        <w:t>). Student review, authorized publication and outside-owner playback/access checks remain pending.</w:t>
       </w:r>
     </w:p>
     <w:p>
@@ -6129,7 +6128,7 @@
         </w:rPr>
         <w:t xml:space="preserve">Backend source: </w:t>
       </w:r>
-      <w:hyperlink r:id="rId11">
+      <w:hyperlink r:id="rId14">
         <w:r>
           <w:rPr>
             <w:color w:val="174469"/>
@@ -6260,7 +6259,7 @@
         </w:rPr>
         <w:t xml:space="preserve">Frontend source: </w:t>
       </w:r>
-      <w:hyperlink r:id="rId12">
+      <w:hyperlink r:id="rId15">
         <w:r>
           <w:rPr>
             <w:color w:val="174469"/>
@@ -7098,7 +7097,7 @@
         </w:rPr>
         <w:t xml:space="preserve">Foundation error handling follows the response-preserving pattern in the </w:t>
       </w:r>
-      <w:hyperlink r:id="rId13">
+      <w:hyperlink r:id="rId16">
         <w:r>
           <w:rPr>
             <w:color w:val="174469"/>
@@ -7113,7 +7112,7 @@
         </w:rPr>
         <w:t xml:space="preserve">. Explicit fixture teardown follows </w:t>
       </w:r>
-      <w:hyperlink r:id="rId14">
+      <w:hyperlink r:id="rId17">
         <w:r>
           <w:rPr>
             <w:color w:val="174469"/>
@@ -16007,167 +16006,6 @@
                 <pic:pic>
                   <pic:nvPicPr>
                     <pic:cNvPr id="0" name="task7-01-login.png"/>
-                    <pic:cNvPicPr/>
-                  </pic:nvPicPr>
-                  <pic:blipFill>
-                    <a:blip r:embed="rId15"/>
-                    <a:stretch>
-                      <a:fillRect/>
-                    </a:stretch>
-                  </pic:blipFill>
-                  <pic:spPr>
-                    <a:xfrm>
-                      <a:off x="0" y="0"/>
-                      <a:ext cx="6080760" cy="3420428"/>
-                    </a:xfrm>
-                    <a:prstGeom prst="rect"/>
-                  </pic:spPr>
-                </pic:pic>
-              </a:graphicData>
-            </a:graphic>
-          </wp:inline>
-        </w:drawing>
-      </w:r>
-    </w:p>
-    <w:p>
-      <w:pPr>
-        <w:pStyle w:val="Caption"/>
-        <w:keepLines/>
-        <w:spacing w:after="240"/>
-      </w:pPr>
-      <w:r>
-        <w:t>Figure F1. task7 01 login</w:t>
-        <w:br/>
-        <w:t>Source: docs/evidence/screenshots/task7-01-login.png</w:t>
-      </w:r>
-    </w:p>
-    <w:p>
-      <w:pPr>
-        <w:keepNext/>
-        <w:jc w:val="center"/>
-      </w:pPr>
-      <w:r>
-        <w:drawing>
-          <wp:inline xmlns:a="http://schemas.openxmlformats.org/drawingml/2006/main" xmlns:pic="http://schemas.openxmlformats.org/drawingml/2006/picture">
-            <wp:extent cx="6080760" cy="3420428"/>
-            <wp:docPr id="2" name="Picture 2"/>
-            <wp:cNvGraphicFramePr>
-              <a:graphicFrameLocks noChangeAspect="1"/>
-            </wp:cNvGraphicFramePr>
-            <a:graphic>
-              <a:graphicData uri="http://schemas.openxmlformats.org/drawingml/2006/picture">
-                <pic:pic>
-                  <pic:nvPicPr>
-                    <pic:cNvPr id="0" name="task8-01-stalls.png"/>
-                    <pic:cNvPicPr/>
-                  </pic:nvPicPr>
-                  <pic:blipFill>
-                    <a:blip r:embed="rId16"/>
-                    <a:stretch>
-                      <a:fillRect/>
-                    </a:stretch>
-                  </pic:blipFill>
-                  <pic:spPr>
-                    <a:xfrm>
-                      <a:off x="0" y="0"/>
-                      <a:ext cx="6080760" cy="3420428"/>
-                    </a:xfrm>
-                    <a:prstGeom prst="rect"/>
-                  </pic:spPr>
-                </pic:pic>
-              </a:graphicData>
-            </a:graphic>
-          </wp:inline>
-        </w:drawing>
-      </w:r>
-    </w:p>
-    <w:p>
-      <w:pPr>
-        <w:pStyle w:val="Caption"/>
-        <w:keepLines/>
-        <w:spacing w:after="240"/>
-      </w:pPr>
-      <w:r>
-        <w:t>Figure F2. Diner login lands on the open-stall list (Charcoal Grill, Open)</w:t>
-        <w:br/>
-        <w:t>Source: docs/evidence/screenshots/task8-01-stalls.png</w:t>
-      </w:r>
-    </w:p>
-    <w:p>
-      <w:r>
-        <w:br w:type="page"/>
-      </w:r>
-    </w:p>
-    <w:p>
-      <w:pPr>
-        <w:keepNext/>
-        <w:jc w:val="center"/>
-      </w:pPr>
-      <w:r>
-        <w:drawing>
-          <wp:inline xmlns:a="http://schemas.openxmlformats.org/drawingml/2006/main" xmlns:pic="http://schemas.openxmlformats.org/drawingml/2006/picture">
-            <wp:extent cx="6080760" cy="3420428"/>
-            <wp:docPr id="3" name="Picture 3"/>
-            <wp:cNvGraphicFramePr>
-              <a:graphicFrameLocks noChangeAspect="1"/>
-            </wp:cNvGraphicFramePr>
-            <a:graphic>
-              <a:graphicData uri="http://schemas.openxmlformats.org/drawingml/2006/picture">
-                <pic:pic>
-                  <pic:nvPicPr>
-                    <pic:cNvPr id="0" name="task8-02-menu-sold-out.png"/>
-                    <pic:cNvPicPr/>
-                  </pic:nvPicPr>
-                  <pic:blipFill>
-                    <a:blip r:embed="rId17"/>
-                    <a:stretch>
-                      <a:fillRect/>
-                    </a:stretch>
-                  </pic:blipFill>
-                  <pic:spPr>
-                    <a:xfrm>
-                      <a:off x="0" y="0"/>
-                      <a:ext cx="6080760" cy="3420428"/>
-                    </a:xfrm>
-                    <a:prstGeom prst="rect"/>
-                  </pic:spPr>
-                </pic:pic>
-              </a:graphicData>
-            </a:graphic>
-          </wp:inline>
-        </w:drawing>
-      </w:r>
-    </w:p>
-    <w:p>
-      <w:pPr>
-        <w:pStyle w:val="Caption"/>
-        <w:keepLines/>
-        <w:spacing w:after="240"/>
-      </w:pPr>
-      <w:r>
-        <w:t>Figure F3. Seeded sold-out Pineapple Tart greyed with the disabled "Sold out" control</w:t>
-        <w:br/>
-        <w:t>Source: docs/evidence/screenshots/task8-02-menu-sold-out.png</w:t>
-      </w:r>
-    </w:p>
-    <w:p>
-      <w:pPr>
-        <w:keepNext/>
-        <w:jc w:val="center"/>
-      </w:pPr>
-      <w:r>
-        <w:drawing>
-          <wp:inline xmlns:a="http://schemas.openxmlformats.org/drawingml/2006/main" xmlns:pic="http://schemas.openxmlformats.org/drawingml/2006/picture">
-            <wp:extent cx="6080760" cy="3420428"/>
-            <wp:docPr id="4" name="Picture 4"/>
-            <wp:cNvGraphicFramePr>
-              <a:graphicFrameLocks noChangeAspect="1"/>
-            </wp:cNvGraphicFramePr>
-            <a:graphic>
-              <a:graphicData uri="http://schemas.openxmlformats.org/drawingml/2006/picture">
-                <pic:pic>
-                  <pic:nvPicPr>
-                    <pic:cNvPr id="0" name="task8-03-sold-out-toast.png"/>
                     <pic:cNvPicPr/>
                   </pic:nvPicPr>
                   <pic:blipFill>
@@ -16197,14 +16035,9 @@
         <w:spacing w:after="240"/>
       </w:pPr>
       <w:r>
-        <w:t>Figure F4. Toast for the newly observed sold-out change, menu still listing the item</w:t>
+        <w:t>Figure F1. task7 01 login</w:t>
         <w:br/>
-        <w:t>Source: docs/evidence/screenshots/task8-03-sold-out-toast.png</w:t>
-      </w:r>
-    </w:p>
-    <w:p>
-      <w:r>
-        <w:br w:type="page"/>
+        <w:t>Source: docs/evidence/screenshots/task7-01-login.png</w:t>
       </w:r>
     </w:p>
     <w:p>
@@ -16216,7 +16049,7 @@
         <w:drawing>
           <wp:inline xmlns:a="http://schemas.openxmlformats.org/drawingml/2006/main" xmlns:pic="http://schemas.openxmlformats.org/drawingml/2006/picture">
             <wp:extent cx="6080760" cy="3420428"/>
-            <wp:docPr id="5" name="Picture 5"/>
+            <wp:docPr id="2" name="Picture 2"/>
             <wp:cNvGraphicFramePr>
               <a:graphicFrameLocks noChangeAspect="1"/>
             </wp:cNvGraphicFramePr>
@@ -16224,7 +16057,7 @@
               <a:graphicData uri="http://schemas.openxmlformats.org/drawingml/2006/picture">
                 <pic:pic>
                   <pic:nvPicPr>
-                    <pic:cNvPr id="0" name="task8-04-menu-after-add.png"/>
+                    <pic:cNvPr id="0" name="task8-01-stalls.png"/>
                     <pic:cNvPicPr/>
                   </pic:nvPicPr>
                   <pic:blipFill>
@@ -16254,9 +16087,14 @@
         <w:spacing w:after="240"/>
       </w:pPr>
       <w:r>
-        <w:t>Figure F5. "Add another (in cart: 2)" increment confirmed; cart total card $22.00</w:t>
+        <w:t>Figure F2. Diner login lands on the open-stall list (Charcoal Grill, Open)</w:t>
         <w:br/>
-        <w:t>Source: docs/evidence/screenshots/task8-04-menu-after-add.png</w:t>
+        <w:t>Source: docs/evidence/screenshots/task8-01-stalls.png</w:t>
+      </w:r>
+    </w:p>
+    <w:p>
+      <w:r>
+        <w:br w:type="page"/>
       </w:r>
     </w:p>
     <w:p>
@@ -16268,7 +16106,7 @@
         <w:drawing>
           <wp:inline xmlns:a="http://schemas.openxmlformats.org/drawingml/2006/main" xmlns:pic="http://schemas.openxmlformats.org/drawingml/2006/picture">
             <wp:extent cx="6080760" cy="3420428"/>
-            <wp:docPr id="6" name="Picture 6"/>
+            <wp:docPr id="3" name="Picture 3"/>
             <wp:cNvGraphicFramePr>
               <a:graphicFrameLocks noChangeAspect="1"/>
             </wp:cNvGraphicFramePr>
@@ -16276,7 +16114,7 @@
               <a:graphicData uri="http://schemas.openxmlformats.org/drawingml/2006/picture">
                 <pic:pic>
                   <pic:nvPicPr>
-                    <pic:cNvPr id="0" name="task8-05-cart-edited.png"/>
+                    <pic:cNvPr id="0" name="task8-02-menu-sold-out.png"/>
                     <pic:cNvPicPr/>
                   </pic:nvPicPr>
                   <pic:blipFill>
@@ -16306,14 +16144,9 @@
         <w:spacing w:after="240"/>
       </w:pPr>
       <w:r>
-        <w:t>Figure F6. Cart after stepper/removal edits: 2× M1, total $13.00, server-computed total</w:t>
+        <w:t>Figure F3. Seeded sold-out Pineapple Tart greyed with the disabled "Sold out" control</w:t>
         <w:br/>
-        <w:t>Source: docs/evidence/screenshots/task8-05-cart-edited.png</w:t>
-      </w:r>
-    </w:p>
-    <w:p>
-      <w:r>
-        <w:br w:type="page"/>
+        <w:t>Source: docs/evidence/screenshots/task8-02-menu-sold-out.png</w:t>
       </w:r>
     </w:p>
     <w:p>
@@ -16325,7 +16158,7 @@
         <w:drawing>
           <wp:inline xmlns:a="http://schemas.openxmlformats.org/drawingml/2006/main" xmlns:pic="http://schemas.openxmlformats.org/drawingml/2006/picture">
             <wp:extent cx="6080760" cy="3420428"/>
-            <wp:docPr id="7" name="Picture 7"/>
+            <wp:docPr id="4" name="Picture 4"/>
             <wp:cNvGraphicFramePr>
               <a:graphicFrameLocks noChangeAspect="1"/>
             </wp:cNvGraphicFramePr>
@@ -16333,7 +16166,7 @@
               <a:graphicData uri="http://schemas.openxmlformats.org/drawingml/2006/picture">
                 <pic:pic>
                   <pic:nvPicPr>
-                    <pic:cNvPr id="0" name="task8-06-checkout.png"/>
+                    <pic:cNvPr id="0" name="task8-03-sold-out-toast.png"/>
                     <pic:cNvPicPr/>
                   </pic:nvPicPr>
                   <pic:blipFill>
@@ -16363,9 +16196,14 @@
         <w:spacing w:after="240"/>
       </w:pPr>
       <w:r>
-        <w:t>Figure F7. Checkout summary, payable total, PayNow selected; fingerprint remains internal</w:t>
+        <w:t>Figure F4. Toast for the newly observed sold-out change, menu still listing the item</w:t>
         <w:br/>
-        <w:t>Source: docs/evidence/screenshots/task8-06-checkout.png</w:t>
+        <w:t>Source: docs/evidence/screenshots/task8-03-sold-out-toast.png</w:t>
+      </w:r>
+    </w:p>
+    <w:p>
+      <w:r>
+        <w:br w:type="page"/>
       </w:r>
     </w:p>
     <w:p>
@@ -16377,7 +16215,7 @@
         <w:drawing>
           <wp:inline xmlns:a="http://schemas.openxmlformats.org/drawingml/2006/main" xmlns:pic="http://schemas.openxmlformats.org/drawingml/2006/picture">
             <wp:extent cx="6080760" cy="3420428"/>
-            <wp:docPr id="8" name="Picture 8"/>
+            <wp:docPr id="5" name="Picture 5"/>
             <wp:cNvGraphicFramePr>
               <a:graphicFrameLocks noChangeAspect="1"/>
             </wp:cNvGraphicFramePr>
@@ -16385,7 +16223,7 @@
               <a:graphicData uri="http://schemas.openxmlformats.org/drawingml/2006/picture">
                 <pic:pic>
                   <pic:nvPicPr>
-                    <pic:cNvPr id="0" name="task8-07-checkout-stale-refused.png"/>
+                    <pic:cNvPr id="0" name="task8-04-menu-after-add.png"/>
                     <pic:cNvPicPr/>
                   </pic:nvPicPr>
                   <pic:blipFill>
@@ -16415,14 +16253,9 @@
         <w:spacing w:after="240"/>
       </w:pPr>
       <w:r>
-        <w:t>Figure F8. Stale-cart refusal ("Your cart total changed since it was loaded…") with Review / Refresh-and-retry and the retained-key notice</w:t>
+        <w:t>Figure F5. "Add another (in cart: 2)" increment confirmed; cart total card $22.00</w:t>
         <w:br/>
-        <w:t>Source: docs/evidence/screenshots/task8-07-checkout-stale-refused.png</w:t>
-      </w:r>
-    </w:p>
-    <w:p>
-      <w:r>
-        <w:br w:type="page"/>
+        <w:t>Source: docs/evidence/screenshots/task8-04-menu-after-add.png</w:t>
       </w:r>
     </w:p>
     <w:p>
@@ -16434,7 +16267,7 @@
         <w:drawing>
           <wp:inline xmlns:a="http://schemas.openxmlformats.org/drawingml/2006/main" xmlns:pic="http://schemas.openxmlformats.org/drawingml/2006/picture">
             <wp:extent cx="6080760" cy="3420428"/>
-            <wp:docPr id="9" name="Picture 9"/>
+            <wp:docPr id="6" name="Picture 6"/>
             <wp:cNvGraphicFramePr>
               <a:graphicFrameLocks noChangeAspect="1"/>
             </wp:cNvGraphicFramePr>
@@ -16442,7 +16275,7 @@
               <a:graphicData uri="http://schemas.openxmlformats.org/drawingml/2006/picture">
                 <pic:pic>
                   <pic:nvPicPr>
-                    <pic:cNvPr id="0" name="task8-08-checkout-success.png"/>
+                    <pic:cNvPr id="0" name="task8-05-cart-edited.png"/>
                     <pic:cNvPicPr/>
                   </pic:nvPicPr>
                   <pic:blipFill>
@@ -16472,9 +16305,14 @@
         <w:spacing w:after="240"/>
       </w:pPr>
       <w:r>
-        <w:t>Figure F9. Payment successful: queue number, order id, Pending, PayNow Paid, $14.50</w:t>
+        <w:t>Figure F6. Cart after stepper/removal edits: 2× M1, total $13.00, server-computed total</w:t>
         <w:br/>
-        <w:t>Source: docs/evidence/screenshots/task8-08-checkout-success.png</w:t>
+        <w:t>Source: docs/evidence/screenshots/task8-05-cart-edited.png</w:t>
+      </w:r>
+    </w:p>
+    <w:p>
+      <w:r>
+        <w:br w:type="page"/>
       </w:r>
     </w:p>
     <w:p>
@@ -16486,7 +16324,7 @@
         <w:drawing>
           <wp:inline xmlns:a="http://schemas.openxmlformats.org/drawingml/2006/main" xmlns:pic="http://schemas.openxmlformats.org/drawingml/2006/picture">
             <wp:extent cx="6080760" cy="3420428"/>
-            <wp:docPr id="10" name="Picture 10"/>
+            <wp:docPr id="7" name="Picture 7"/>
             <wp:cNvGraphicFramePr>
               <a:graphicFrameLocks noChangeAspect="1"/>
             </wp:cNvGraphicFramePr>
@@ -16494,7 +16332,7 @@
               <a:graphicData uri="http://schemas.openxmlformats.org/drawingml/2006/picture">
                 <pic:pic>
                   <pic:nvPicPr>
-                    <pic:cNvPr id="0" name="task8-09-tracking-pending.png"/>
+                    <pic:cNvPr id="0" name="task8-06-checkout.png"/>
                     <pic:cNvPicPr/>
                   </pic:nvPicPr>
                   <pic:blipFill>
@@ -16524,14 +16362,9 @@
         <w:spacing w:after="240"/>
       </w:pPr>
       <w:r>
-        <w:t>Figure F10. Tracking page: queue number, Pending badge, snapshot lines, payment state</w:t>
+        <w:t>Figure F7. Checkout summary, payable total, PayNow selected; fingerprint remains internal</w:t>
         <w:br/>
-        <w:t>Source: docs/evidence/screenshots/task8-09-tracking-pending.png</w:t>
-      </w:r>
-    </w:p>
-    <w:p>
-      <w:r>
-        <w:br w:type="page"/>
+        <w:t>Source: docs/evidence/screenshots/task8-06-checkout.png</w:t>
       </w:r>
     </w:p>
     <w:p>
@@ -16543,7 +16376,7 @@
         <w:drawing>
           <wp:inline xmlns:a="http://schemas.openxmlformats.org/drawingml/2006/main" xmlns:pic="http://schemas.openxmlformats.org/drawingml/2006/picture">
             <wp:extent cx="6080760" cy="3420428"/>
-            <wp:docPr id="11" name="Picture 11"/>
+            <wp:docPr id="8" name="Picture 8"/>
             <wp:cNvGraphicFramePr>
               <a:graphicFrameLocks noChangeAspect="1"/>
             </wp:cNvGraphicFramePr>
@@ -16551,7 +16384,7 @@
               <a:graphicData uri="http://schemas.openxmlformats.org/drawingml/2006/picture">
                 <pic:pic>
                   <pic:nvPicPr>
-                    <pic:cNvPr id="0" name="task8-10-tracking-ready.png"/>
+                    <pic:cNvPr id="0" name="task8-07-checkout-stale-refused.png"/>
                     <pic:cNvPicPr/>
                   </pic:nvPicPr>
                   <pic:blipFill>
@@ -16581,9 +16414,14 @@
         <w:spacing w:after="240"/>
       </w:pPr>
       <w:r>
-        <w:t>Figure F11. Ready badge with the green "Your order is ready. Collect it at the counter." banner</w:t>
+        <w:t>Figure F8. Stale-cart refusal ("Your cart total changed since it was loaded…") with Review / Refresh-and-retry and the retained-key notice</w:t>
         <w:br/>
-        <w:t>Source: docs/evidence/screenshots/task8-10-tracking-ready.png</w:t>
+        <w:t>Source: docs/evidence/screenshots/task8-07-checkout-stale-refused.png</w:t>
+      </w:r>
+    </w:p>
+    <w:p>
+      <w:r>
+        <w:br w:type="page"/>
       </w:r>
     </w:p>
     <w:p>
@@ -16595,7 +16433,7 @@
         <w:drawing>
           <wp:inline xmlns:a="http://schemas.openxmlformats.org/drawingml/2006/main" xmlns:pic="http://schemas.openxmlformats.org/drawingml/2006/picture">
             <wp:extent cx="6080760" cy="3420428"/>
-            <wp:docPr id="12" name="Picture 12"/>
+            <wp:docPr id="9" name="Picture 9"/>
             <wp:cNvGraphicFramePr>
               <a:graphicFrameLocks noChangeAspect="1"/>
             </wp:cNvGraphicFramePr>
@@ -16603,7 +16441,7 @@
               <a:graphicData uri="http://schemas.openxmlformats.org/drawingml/2006/picture">
                 <pic:pic>
                   <pic:nvPicPr>
-                    <pic:cNvPr id="0" name="task8-11-tracking-collected.png"/>
+                    <pic:cNvPr id="0" name="task8-08-checkout-success.png"/>
                     <pic:cNvPicPr/>
                   </pic:nvPicPr>
                   <pic:blipFill>
@@ -16633,14 +16471,9 @@
         <w:spacing w:after="240"/>
       </w:pPr>
       <w:r>
-        <w:t>Figure F12. Terminal Collected notice (polling now stopped)</w:t>
+        <w:t>Figure F9. Payment successful: queue number, order id, Pending, PayNow Paid, $14.50</w:t>
         <w:br/>
-        <w:t>Source: docs/evidence/screenshots/task8-11-tracking-collected.png</w:t>
-      </w:r>
-    </w:p>
-    <w:p>
-      <w:r>
-        <w:br w:type="page"/>
+        <w:t>Source: docs/evidence/screenshots/task8-08-checkout-success.png</w:t>
       </w:r>
     </w:p>
     <w:p>
@@ -16652,7 +16485,7 @@
         <w:drawing>
           <wp:inline xmlns:a="http://schemas.openxmlformats.org/drawingml/2006/main" xmlns:pic="http://schemas.openxmlformats.org/drawingml/2006/picture">
             <wp:extent cx="6080760" cy="3420428"/>
-            <wp:docPr id="13" name="Picture 13"/>
+            <wp:docPr id="10" name="Picture 10"/>
             <wp:cNvGraphicFramePr>
               <a:graphicFrameLocks noChangeAspect="1"/>
             </wp:cNvGraphicFramePr>
@@ -16660,7 +16493,7 @@
               <a:graphicData uri="http://schemas.openxmlformats.org/drawingml/2006/picture">
                 <pic:pic>
                   <pic:nvPicPr>
-                    <pic:cNvPr id="0" name="task8-12-payment-failed.png"/>
+                    <pic:cNvPr id="0" name="task8-09-tracking-pending.png"/>
                     <pic:cNvPicPr/>
                   </pic:nvPicPr>
                   <pic:blipFill>
@@ -16690,9 +16523,14 @@
         <w:spacing w:after="240"/>
       </w:pPr>
       <w:r>
-        <w:t>Figure F13. Simulated payment failure with the retained-checkout-key retry notice</w:t>
+        <w:t>Figure F10. Tracking page: queue number, Pending badge, snapshot lines, payment state</w:t>
         <w:br/>
-        <w:t>Source: docs/evidence/screenshots/task8-12-payment-failed.png</w:t>
+        <w:t>Source: docs/evidence/screenshots/task8-09-tracking-pending.png</w:t>
+      </w:r>
+    </w:p>
+    <w:p>
+      <w:r>
+        <w:br w:type="page"/>
       </w:r>
     </w:p>
     <w:p>
@@ -16704,7 +16542,7 @@
         <w:drawing>
           <wp:inline xmlns:a="http://schemas.openxmlformats.org/drawingml/2006/main" xmlns:pic="http://schemas.openxmlformats.org/drawingml/2006/picture">
             <wp:extent cx="6080760" cy="3420428"/>
-            <wp:docPr id="14" name="Picture 14"/>
+            <wp:docPr id="11" name="Picture 11"/>
             <wp:cNvGraphicFramePr>
               <a:graphicFrameLocks noChangeAspect="1"/>
             </wp:cNvGraphicFramePr>
@@ -16712,7 +16550,7 @@
               <a:graphicData uri="http://schemas.openxmlformats.org/drawingml/2006/picture">
                 <pic:pic>
                   <pic:nvPicPr>
-                    <pic:cNvPr id="0" name="task8-13-payment-retry-success.png"/>
+                    <pic:cNvPr id="0" name="task8-10-tracking-ready.png"/>
                     <pic:cNvPicPr/>
                   </pic:nvPicPr>
                   <pic:blipFill>
@@ -16742,14 +16580,9 @@
         <w:spacing w:after="240"/>
       </w:pPr>
       <w:r>
-        <w:t>Figure F14. Retry under the same key: payment successful, one order stored</w:t>
+        <w:t>Figure F11. Ready badge with the green "Your order is ready. Collect it at the counter." banner</w:t>
         <w:br/>
-        <w:t>Source: docs/evidence/screenshots/task8-13-payment-retry-success.png</w:t>
-      </w:r>
-    </w:p>
-    <w:p>
-      <w:r>
-        <w:br w:type="page"/>
+        <w:t>Source: docs/evidence/screenshots/task8-10-tracking-ready.png</w:t>
       </w:r>
     </w:p>
     <w:p>
@@ -16761,7 +16594,7 @@
         <w:drawing>
           <wp:inline xmlns:a="http://schemas.openxmlformats.org/drawingml/2006/main" xmlns:pic="http://schemas.openxmlformats.org/drawingml/2006/picture">
             <wp:extent cx="6080760" cy="3420428"/>
-            <wp:docPr id="15" name="Picture 15"/>
+            <wp:docPr id="12" name="Picture 12"/>
             <wp:cNvGraphicFramePr>
               <a:graphicFrameLocks noChangeAspect="1"/>
             </wp:cNvGraphicFramePr>
@@ -16769,7 +16602,7 @@
               <a:graphicData uri="http://schemas.openxmlformats.org/drawingml/2006/picture">
                 <pic:pic>
                   <pic:nvPicPr>
-                    <pic:cNvPr id="0" name="task8-14-double-click-single-order.png"/>
+                    <pic:cNvPr id="0" name="task8-11-tracking-collected.png"/>
                     <pic:cNvPicPr/>
                   </pic:nvPicPr>
                   <pic:blipFill>
@@ -16799,9 +16632,14 @@
         <w:spacing w:after="240"/>
       </w:pPr>
       <w:r>
-        <w:t>Figure F15. Double-click result screen; exactly one order exists for the attempt</w:t>
+        <w:t>Figure F12. Terminal Collected notice (polling now stopped)</w:t>
         <w:br/>
-        <w:t>Source: docs/evidence/screenshots/task8-14-double-click-single-order.png</w:t>
+        <w:t>Source: docs/evidence/screenshots/task8-11-tracking-collected.png</w:t>
+      </w:r>
+    </w:p>
+    <w:p>
+      <w:r>
+        <w:br w:type="page"/>
       </w:r>
     </w:p>
     <w:p>
@@ -16813,7 +16651,7 @@
         <w:drawing>
           <wp:inline xmlns:a="http://schemas.openxmlformats.org/drawingml/2006/main" xmlns:pic="http://schemas.openxmlformats.org/drawingml/2006/picture">
             <wp:extent cx="6080760" cy="3420428"/>
-            <wp:docPr id="16" name="Picture 16"/>
+            <wp:docPr id="13" name="Picture 13"/>
             <wp:cNvGraphicFramePr>
               <a:graphicFrameLocks noChangeAspect="1"/>
             </wp:cNvGraphicFramePr>
@@ -16821,7 +16659,7 @@
               <a:graphicData uri="http://schemas.openxmlformats.org/drawingml/2006/picture">
                 <pic:pic>
                   <pic:nvPicPr>
-                    <pic:cNvPr id="0" name="task8-15-stale-sold-out-refused.png"/>
+                    <pic:cNvPr id="0" name="task8-12-payment-failed.png"/>
                     <pic:cNvPicPr/>
                   </pic:nvPicPr>
                   <pic:blipFill>
@@ -16851,14 +16689,9 @@
         <w:spacing w:after="240"/>
       </w:pPr>
       <w:r>
-        <w:t>Figure F16. Checkout refused because a line sold out before payment</w:t>
+        <w:t>Figure F13. Simulated payment failure with the retained-checkout-key retry notice</w:t>
         <w:br/>
-        <w:t>Source: docs/evidence/screenshots/task8-15-stale-sold-out-refused.png</w:t>
-      </w:r>
-    </w:p>
-    <w:p>
-      <w:r>
-        <w:br w:type="page"/>
+        <w:t>Source: docs/evidence/screenshots/task8-12-payment-failed.png</w:t>
       </w:r>
     </w:p>
     <w:p>
@@ -16870,7 +16703,7 @@
         <w:drawing>
           <wp:inline xmlns:a="http://schemas.openxmlformats.org/drawingml/2006/main" xmlns:pic="http://schemas.openxmlformats.org/drawingml/2006/picture">
             <wp:extent cx="6080760" cy="3420428"/>
-            <wp:docPr id="17" name="Picture 17"/>
+            <wp:docPr id="14" name="Picture 14"/>
             <wp:cNvGraphicFramePr>
               <a:graphicFrameLocks noChangeAspect="1"/>
             </wp:cNvGraphicFramePr>
@@ -16878,7 +16711,7 @@
               <a:graphicData uri="http://schemas.openxmlformats.org/drawingml/2006/picture">
                 <pic:pic>
                   <pic:nvPicPr>
-                    <pic:cNvPr id="0" name="task8-16-after-removal-paid.png"/>
+                    <pic:cNvPr id="0" name="task8-13-payment-retry-success.png"/>
                     <pic:cNvPicPr/>
                   </pic:nvPicPr>
                   <pic:blipFill>
@@ -16908,9 +16741,14 @@
         <w:spacing w:after="240"/>
       </w:pPr>
       <w:r>
-        <w:t>Figure F17. Remaining line paid out after the sold-out line was removed</w:t>
+        <w:t>Figure F14. Retry under the same key: payment successful, one order stored</w:t>
         <w:br/>
-        <w:t>Source: docs/evidence/screenshots/task8-16-after-removal-paid.png</w:t>
+        <w:t>Source: docs/evidence/screenshots/task8-13-payment-retry-success.png</w:t>
+      </w:r>
+    </w:p>
+    <w:p>
+      <w:r>
+        <w:br w:type="page"/>
       </w:r>
     </w:p>
     <w:p>
@@ -16922,7 +16760,7 @@
         <w:drawing>
           <wp:inline xmlns:a="http://schemas.openxmlformats.org/drawingml/2006/main" xmlns:pic="http://schemas.openxmlformats.org/drawingml/2006/picture">
             <wp:extent cx="6080760" cy="3420428"/>
-            <wp:docPr id="18" name="Picture 18"/>
+            <wp:docPr id="15" name="Picture 15"/>
             <wp:cNvGraphicFramePr>
               <a:graphicFrameLocks noChangeAspect="1"/>
             </wp:cNvGraphicFramePr>
@@ -16930,7 +16768,7 @@
               <a:graphicData uri="http://schemas.openxmlformats.org/drawingml/2006/picture">
                 <pic:pic>
                   <pic:nvPicPr>
-                    <pic:cNvPr id="0" name="task8-17-cross-stall-refused.png"/>
+                    <pic:cNvPr id="0" name="task8-14-double-click-single-order.png"/>
                     <pic:cNvPicPr/>
                   </pic:nvPicPr>
                   <pic:blipFill>
@@ -16960,14 +16798,9 @@
         <w:spacing w:after="240"/>
       </w:pPr>
       <w:r>
-        <w:t>Figure F18. Cross-stall add refusal naming the stall already in the cart</w:t>
+        <w:t>Figure F15. Double-click result screen; exactly one order exists for the attempt</w:t>
         <w:br/>
-        <w:t>Source: docs/evidence/screenshots/task8-17-cross-stall-refused.png</w:t>
-      </w:r>
-    </w:p>
-    <w:p>
-      <w:r>
-        <w:br w:type="page"/>
+        <w:t>Source: docs/evidence/screenshots/task8-14-double-click-single-order.png</w:t>
       </w:r>
     </w:p>
     <w:p>
@@ -16979,7 +16812,7 @@
         <w:drawing>
           <wp:inline xmlns:a="http://schemas.openxmlformats.org/drawingml/2006/main" xmlns:pic="http://schemas.openxmlformats.org/drawingml/2006/picture">
             <wp:extent cx="6080760" cy="3420428"/>
-            <wp:docPr id="19" name="Picture 19"/>
+            <wp:docPr id="16" name="Picture 16"/>
             <wp:cNvGraphicFramePr>
               <a:graphicFrameLocks noChangeAspect="1"/>
             </wp:cNvGraphicFramePr>
@@ -16987,7 +16820,7 @@
               <a:graphicData uri="http://schemas.openxmlformats.org/drawingml/2006/picture">
                 <pic:pic>
                   <pic:nvPicPr>
-                    <pic:cNvPr id="0" name="task8-18-forged-token-sign-in.png"/>
+                    <pic:cNvPr id="0" name="task8-15-stale-sold-out-refused.png"/>
                     <pic:cNvPicPr/>
                   </pic:nvPicPr>
                   <pic:blipFill>
@@ -17017,9 +16850,14 @@
         <w:spacing w:after="240"/>
       </w:pPr>
       <w:r>
-        <w:t>Figure F19. Forged-token 401: session cleared, sign-in presented</w:t>
+        <w:t>Figure F16. Checkout refused because a line sold out before payment</w:t>
         <w:br/>
-        <w:t>Source: docs/evidence/screenshots/task8-18-forged-token-sign-in.png</w:t>
+        <w:t>Source: docs/evidence/screenshots/task8-15-stale-sold-out-refused.png</w:t>
+      </w:r>
+    </w:p>
+    <w:p>
+      <w:r>
+        <w:br w:type="page"/>
       </w:r>
     </w:p>
     <w:p>
@@ -17031,7 +16869,7 @@
         <w:drawing>
           <wp:inline xmlns:a="http://schemas.openxmlformats.org/drawingml/2006/main" xmlns:pic="http://schemas.openxmlformats.org/drawingml/2006/picture">
             <wp:extent cx="6080760" cy="3420428"/>
-            <wp:docPr id="20" name="Picture 20"/>
+            <wp:docPr id="17" name="Picture 17"/>
             <wp:cNvGraphicFramePr>
               <a:graphicFrameLocks noChangeAspect="1"/>
             </wp:cNvGraphicFramePr>
@@ -17039,7 +16877,7 @@
               <a:graphicData uri="http://schemas.openxmlformats.org/drawingml/2006/picture">
                 <pic:pic>
                   <pic:nvPicPr>
-                    <pic:cNvPr id="0" name="task9-01-vendor-menu-open.png"/>
+                    <pic:cNvPr id="0" name="task8-16-after-removal-paid.png"/>
                     <pic:cNvPicPr/>
                   </pic:nvPicPr>
                   <pic:blipFill>
@@ -17069,14 +16907,9 @@
         <w:spacing w:after="240"/>
       </w:pPr>
       <w:r>
-        <w:t>Figure F20. Vendor login lands on the own menu: stall name, Open badge, 3 active items, seeded Pineapple Tart badged Sold out</w:t>
+        <w:t>Figure F17. Remaining line paid out after the sold-out line was removed</w:t>
         <w:br/>
-        <w:t>Source: docs/evidence/screenshots/task9-01-vendor-menu-open.png</w:t>
-      </w:r>
-    </w:p>
-    <w:p>
-      <w:r>
-        <w:br w:type="page"/>
+        <w:t>Source: docs/evidence/screenshots/task8-16-after-removal-paid.png</w:t>
       </w:r>
     </w:p>
     <w:p>
@@ -17088,7 +16921,7 @@
         <w:drawing>
           <wp:inline xmlns:a="http://schemas.openxmlformats.org/drawingml/2006/main" xmlns:pic="http://schemas.openxmlformats.org/drawingml/2006/picture">
             <wp:extent cx="6080760" cy="3420428"/>
-            <wp:docPr id="21" name="Picture 21"/>
+            <wp:docPr id="18" name="Picture 18"/>
             <wp:cNvGraphicFramePr>
               <a:graphicFrameLocks noChangeAspect="1"/>
             </wp:cNvGraphicFramePr>
@@ -17096,7 +16929,7 @@
               <a:graphicData uri="http://schemas.openxmlformats.org/drawingml/2006/picture">
                 <pic:pic>
                   <pic:nvPicPr>
-                    <pic:cNvPr id="0" name="task9-02-closed-banner.png"/>
+                    <pic:cNvPr id="0" name="task8-17-cross-stall-refused.png"/>
                     <pic:cNvPicPr/>
                   </pic:nvPicPr>
                   <pic:blipFill>
@@ -17126,9 +16959,14 @@
         <w:spacing w:after="240"/>
       </w:pPr>
       <w:r>
-        <w:t>Figure F21. After the switch: Closed badge and the closure banner (new orders refused, paid queue stays accessible)</w:t>
+        <w:t>Figure F18. Cross-stall add refusal naming the stall already in the cart</w:t>
         <w:br/>
-        <w:t>Source: docs/evidence/screenshots/task9-02-closed-banner.png</w:t>
+        <w:t>Source: docs/evidence/screenshots/task8-17-cross-stall-refused.png</w:t>
+      </w:r>
+    </w:p>
+    <w:p>
+      <w:r>
+        <w:br w:type="page"/>
       </w:r>
     </w:p>
     <w:p>
@@ -17140,7 +16978,7 @@
         <w:drawing>
           <wp:inline xmlns:a="http://schemas.openxmlformats.org/drawingml/2006/main" xmlns:pic="http://schemas.openxmlformats.org/drawingml/2006/picture">
             <wp:extent cx="6080760" cy="3420428"/>
-            <wp:docPr id="22" name="Picture 22"/>
+            <wp:docPr id="19" name="Picture 19"/>
             <wp:cNvGraphicFramePr>
               <a:graphicFrameLocks noChangeAspect="1"/>
             </wp:cNvGraphicFramePr>
@@ -17148,7 +16986,7 @@
               <a:graphicData uri="http://schemas.openxmlformats.org/drawingml/2006/picture">
                 <pic:pic>
                   <pic:nvPicPr>
-                    <pic:cNvPr id="0" name="task9-03-diner-closed-stall.png"/>
+                    <pic:cNvPr id="0" name="task8-18-forged-token-sign-in.png"/>
                     <pic:cNvPicPr/>
                   </pic:nvPicPr>
                   <pic:blipFill>
@@ -17178,14 +17016,9 @@
         <w:spacing w:after="240"/>
       </w:pPr>
       <w:r>
-        <w:t>Figure F22. The diner's direct-link view of the closed stall: closure notice, every Add control disabled</w:t>
+        <w:t>Figure F19. Forged-token 401: session cleared, sign-in presented</w:t>
         <w:br/>
-        <w:t>Source: docs/evidence/screenshots/task9-03-diner-closed-stall.png</w:t>
-      </w:r>
-    </w:p>
-    <w:p>
-      <w:r>
-        <w:br w:type="page"/>
+        <w:t>Source: docs/evidence/screenshots/task8-18-forged-token-sign-in.png</w:t>
       </w:r>
     </w:p>
     <w:p>
@@ -17197,7 +17030,7 @@
         <w:drawing>
           <wp:inline xmlns:a="http://schemas.openxmlformats.org/drawingml/2006/main" xmlns:pic="http://schemas.openxmlformats.org/drawingml/2006/picture">
             <wp:extent cx="6080760" cy="3420428"/>
-            <wp:docPr id="23" name="Picture 23"/>
+            <wp:docPr id="20" name="Picture 20"/>
             <wp:cNvGraphicFramePr>
               <a:graphicFrameLocks noChangeAspect="1"/>
             </wp:cNvGraphicFramePr>
@@ -17205,7 +17038,7 @@
               <a:graphicData uri="http://schemas.openxmlformats.org/drawingml/2006/picture">
                 <pic:pic>
                   <pic:nvPicPr>
-                    <pic:cNvPr id="0" name="task9-04-form-rejection.png"/>
+                    <pic:cNvPr id="0" name="task9-01-vendor-menu-open.png"/>
                     <pic:cNvPicPr/>
                   </pic:nvPicPr>
                   <pic:blipFill>
@@ -17235,9 +17068,14 @@
         <w:spacing w:after="240"/>
       </w:pPr>
       <w:r>
-        <w:t>Figure F23. The create form showing the backend's own 400 message for a malformed price</w:t>
+        <w:t>Figure F20. Vendor login lands on the own menu: stall name, Open badge, 3 active items, seeded Pineapple Tart badged Sold out</w:t>
         <w:br/>
-        <w:t>Source: docs/evidence/screenshots/task9-04-form-rejection.png</w:t>
+        <w:t>Source: docs/evidence/screenshots/task9-01-vendor-menu-open.png</w:t>
+      </w:r>
+    </w:p>
+    <w:p>
+      <w:r>
+        <w:br w:type="page"/>
       </w:r>
     </w:p>
     <w:p>
@@ -17249,7 +17087,7 @@
         <w:drawing>
           <wp:inline xmlns:a="http://schemas.openxmlformats.org/drawingml/2006/main" xmlns:pic="http://schemas.openxmlformats.org/drawingml/2006/picture">
             <wp:extent cx="6080760" cy="3420428"/>
-            <wp:docPr id="24" name="Picture 24"/>
+            <wp:docPr id="21" name="Picture 21"/>
             <wp:cNvGraphicFramePr>
               <a:graphicFrameLocks noChangeAspect="1"/>
             </wp:cNvGraphicFramePr>
@@ -17257,7 +17095,7 @@
               <a:graphicData uri="http://schemas.openxmlformats.org/drawingml/2006/picture">
                 <pic:pic>
                   <pic:nvPicPr>
-                    <pic:cNvPr id="0" name="task9-05-item-created.png"/>
+                    <pic:cNvPr id="0" name="task9-02-closed-banner.png"/>
                     <pic:cNvPicPr/>
                   </pic:nvPicPr>
                   <pic:blipFill>
@@ -17287,14 +17125,9 @@
         <w:spacing w:after="240"/>
       </w:pPr>
       <w:r>
-        <w:t>Figure F24. The run-created item listed with its $9.99 price and the success banner</w:t>
+        <w:t>Figure F21. After the switch: Closed badge and the closure banner (new orders refused, paid queue stays accessible)</w:t>
         <w:br/>
-        <w:t>Source: docs/evidence/screenshots/task9-05-item-created.png</w:t>
-      </w:r>
-    </w:p>
-    <w:p>
-      <w:r>
-        <w:br w:type="page"/>
+        <w:t>Source: docs/evidence/screenshots/task9-02-closed-banner.png</w:t>
       </w:r>
     </w:p>
     <w:p>
@@ -17306,7 +17139,7 @@
         <w:drawing>
           <wp:inline xmlns:a="http://schemas.openxmlformats.org/drawingml/2006/main" xmlns:pic="http://schemas.openxmlformats.org/drawingml/2006/picture">
             <wp:extent cx="6080760" cy="3420428"/>
-            <wp:docPr id="25" name="Picture 25"/>
+            <wp:docPr id="22" name="Picture 22"/>
             <wp:cNvGraphicFramePr>
               <a:graphicFrameLocks noChangeAspect="1"/>
             </wp:cNvGraphicFramePr>
@@ -17314,7 +17147,7 @@
               <a:graphicData uri="http://schemas.openxmlformats.org/drawingml/2006/picture">
                 <pic:pic>
                   <pic:nvPicPr>
-                    <pic:cNvPr id="0" name="task9-06-item-edited.png"/>
+                    <pic:cNvPr id="0" name="task9-03-diner-closed-stall.png"/>
                     <pic:cNvPicPr/>
                   </pic:nvPicPr>
                   <pic:blipFill>
@@ -17344,9 +17177,14 @@
         <w:spacing w:after="240"/>
       </w:pPr>
       <w:r>
-        <w:t>Figure F25. The renamed/repriced item ($10.50) after the edit form saved</w:t>
+        <w:t>Figure F22. The diner's direct-link view of the closed stall: closure notice, every Add control disabled</w:t>
         <w:br/>
-        <w:t>Source: docs/evidence/screenshots/task9-06-item-edited.png</w:t>
+        <w:t>Source: docs/evidence/screenshots/task9-03-diner-closed-stall.png</w:t>
+      </w:r>
+    </w:p>
+    <w:p>
+      <w:r>
+        <w:br w:type="page"/>
       </w:r>
     </w:p>
     <w:p>
@@ -17358,7 +17196,7 @@
         <w:drawing>
           <wp:inline xmlns:a="http://schemas.openxmlformats.org/drawingml/2006/main" xmlns:pic="http://schemas.openxmlformats.org/drawingml/2006/picture">
             <wp:extent cx="6080760" cy="3420428"/>
-            <wp:docPr id="26" name="Picture 26"/>
+            <wp:docPr id="23" name="Picture 23"/>
             <wp:cNvGraphicFramePr>
               <a:graphicFrameLocks noChangeAspect="1"/>
             </wp:cNvGraphicFramePr>
@@ -17366,7 +17204,7 @@
               <a:graphicData uri="http://schemas.openxmlformats.org/drawingml/2006/picture">
                 <pic:pic>
                   <pic:nvPicPr>
-                    <pic:cNvPr id="0" name="task9-07-m2-sold-out.png"/>
+                    <pic:cNvPr id="0" name="task9-04-form-rejection.png"/>
                     <pic:cNvPicPr/>
                   </pic:nvPicPr>
                   <pic:blipFill>
@@ -17396,14 +17234,9 @@
         <w:spacing w:after="240"/>
       </w:pPr>
       <w:r>
-        <w:t>Figure F26. A seeded item marked sold out from its row control (badge + success banner)</w:t>
+        <w:t>Figure F23. The create form showing the backend's own 400 message for a malformed price</w:t>
         <w:br/>
-        <w:t>Source: docs/evidence/screenshots/task9-07-m2-sold-out.png</w:t>
-      </w:r>
-    </w:p>
-    <w:p>
-      <w:r>
-        <w:br w:type="page"/>
+        <w:t>Source: docs/evidence/screenshots/task9-04-form-rejection.png</w:t>
       </w:r>
     </w:p>
     <w:p>
@@ -17415,7 +17248,7 @@
         <w:drawing>
           <wp:inline xmlns:a="http://schemas.openxmlformats.org/drawingml/2006/main" xmlns:pic="http://schemas.openxmlformats.org/drawingml/2006/picture">
             <wp:extent cx="6080760" cy="3420428"/>
-            <wp:docPr id="27" name="Picture 27"/>
+            <wp:docPr id="24" name="Picture 24"/>
             <wp:cNvGraphicFramePr>
               <a:graphicFrameLocks noChangeAspect="1"/>
             </wp:cNvGraphicFramePr>
@@ -17423,7 +17256,7 @@
               <a:graphicData uri="http://schemas.openxmlformats.org/drawingml/2006/picture">
                 <pic:pic>
                   <pic:nvPicPr>
-                    <pic:cNvPr id="0" name="task9-08-orders-queue.png"/>
+                    <pic:cNvPr id="0" name="task9-05-item-created.png"/>
                     <pic:cNvPicPr/>
                   </pic:nvPicPr>
                   <pic:blipFill>
@@ -17453,9 +17286,14 @@
         <w:spacing w:after="240"/>
       </w:pPr>
       <w:r>
-        <w:t>Figure F27. The paid queue: 8 own-stall orders newest-first, other-stall order absent, status badges</w:t>
+        <w:t>Figure F24. The run-created item listed with its $9.99 price and the success banner</w:t>
         <w:br/>
-        <w:t>Source: docs/evidence/screenshots/task9-08-orders-queue.png</w:t>
+        <w:t>Source: docs/evidence/screenshots/task9-05-item-created.png</w:t>
+      </w:r>
+    </w:p>
+    <w:p>
+      <w:r>
+        <w:br w:type="page"/>
       </w:r>
     </w:p>
     <w:p>
@@ -17467,7 +17305,7 @@
         <w:drawing>
           <wp:inline xmlns:a="http://schemas.openxmlformats.org/drawingml/2006/main" xmlns:pic="http://schemas.openxmlformats.org/drawingml/2006/picture">
             <wp:extent cx="6080760" cy="3420428"/>
-            <wp:docPr id="28" name="Picture 28"/>
+            <wp:docPr id="25" name="Picture 25"/>
             <wp:cNvGraphicFramePr>
               <a:graphicFrameLocks noChangeAspect="1"/>
             </wp:cNvGraphicFramePr>
@@ -17475,7 +17313,7 @@
               <a:graphicData uri="http://schemas.openxmlformats.org/drawingml/2006/picture">
                 <pic:pic>
                   <pic:nvPicPr>
-                    <pic:cNvPr id="0" name="task9-09-pending-controls.png"/>
+                    <pic:cNvPr id="0" name="task9-06-item-edited.png"/>
                     <pic:cNvPicPr/>
                   </pic:nvPicPr>
                   <pic:blipFill>
@@ -17505,14 +17343,9 @@
         <w:spacing w:after="240"/>
       </w:pPr>
       <w:r>
-        <w:t>Figure F28. A Pending order: exactly Accept order / Reject order</w:t>
+        <w:t>Figure F25. The renamed/repriced item ($10.50) after the edit form saved</w:t>
         <w:br/>
-        <w:t>Source: docs/evidence/screenshots/task9-09-pending-controls.png</w:t>
-      </w:r>
-    </w:p>
-    <w:p>
-      <w:r>
-        <w:br w:type="page"/>
+        <w:t>Source: docs/evidence/screenshots/task9-06-item-edited.png</w:t>
       </w:r>
     </w:p>
     <w:p>
@@ -17524,7 +17357,7 @@
         <w:drawing>
           <wp:inline xmlns:a="http://schemas.openxmlformats.org/drawingml/2006/main" xmlns:pic="http://schemas.openxmlformats.org/drawingml/2006/picture">
             <wp:extent cx="6080760" cy="3420428"/>
-            <wp:docPr id="29" name="Picture 29"/>
+            <wp:docPr id="26" name="Picture 26"/>
             <wp:cNvGraphicFramePr>
               <a:graphicFrameLocks noChangeAspect="1"/>
             </wp:cNvGraphicFramePr>
@@ -17532,7 +17365,7 @@
               <a:graphicData uri="http://schemas.openxmlformats.org/drawingml/2006/picture">
                 <pic:pic>
                   <pic:nvPicPr>
-                    <pic:cNvPr id="0" name="task9-10-preparing-controls.png"/>
+                    <pic:cNvPr id="0" name="task9-07-m2-sold-out.png"/>
                     <pic:cNvPicPr/>
                   </pic:nvPicPr>
                   <pic:blipFill>
@@ -17562,9 +17395,14 @@
         <w:spacing w:after="240"/>
       </w:pPr>
       <w:r>
-        <w:t>Figure F29. A Preparing order: exactly Mark ready (rejection no longer offered)</w:t>
+        <w:t>Figure F26. A seeded item marked sold out from its row control (badge + success banner)</w:t>
         <w:br/>
-        <w:t>Source: docs/evidence/screenshots/task9-10-preparing-controls.png</w:t>
+        <w:t>Source: docs/evidence/screenshots/task9-07-m2-sold-out.png</w:t>
+      </w:r>
+    </w:p>
+    <w:p>
+      <w:r>
+        <w:br w:type="page"/>
       </w:r>
     </w:p>
     <w:p>
@@ -17576,7 +17414,7 @@
         <w:drawing>
           <wp:inline xmlns:a="http://schemas.openxmlformats.org/drawingml/2006/main" xmlns:pic="http://schemas.openxmlformats.org/drawingml/2006/picture">
             <wp:extent cx="6080760" cy="3420428"/>
-            <wp:docPr id="30" name="Picture 30"/>
+            <wp:docPr id="27" name="Picture 27"/>
             <wp:cNvGraphicFramePr>
               <a:graphicFrameLocks noChangeAspect="1"/>
             </wp:cNvGraphicFramePr>
@@ -17584,7 +17422,7 @@
               <a:graphicData uri="http://schemas.openxmlformats.org/drawingml/2006/picture">
                 <pic:pic>
                   <pic:nvPicPr>
-                    <pic:cNvPr id="0" name="task9-11-ready-no-noshow.png"/>
+                    <pic:cNvPr id="0" name="task9-08-orders-queue.png"/>
                     <pic:cNvPicPr/>
                   </pic:nvPicPr>
                   <pic:blipFill>
@@ -17614,14 +17452,9 @@
         <w:spacing w:after="240"/>
       </w:pPr>
       <w:r>
-        <w:t>Figure F30. Ready +5 min: Mark collected only — the NoShow control is still hidden</w:t>
+        <w:t>Figure F27. The paid queue: 8 own-stall orders newest-first, other-stall order absent, status badges</w:t>
         <w:br/>
-        <w:t>Source: docs/evidence/screenshots/task9-11-ready-no-noshow.png</w:t>
-      </w:r>
-    </w:p>
-    <w:p>
-      <w:r>
-        <w:br w:type="page"/>
+        <w:t>Source: docs/evidence/screenshots/task9-08-orders-queue.png</w:t>
       </w:r>
     </w:p>
     <w:p>
@@ -17633,7 +17466,7 @@
         <w:drawing>
           <wp:inline xmlns:a="http://schemas.openxmlformats.org/drawingml/2006/main" xmlns:pic="http://schemas.openxmlformats.org/drawingml/2006/picture">
             <wp:extent cx="6080760" cy="3420428"/>
-            <wp:docPr id="31" name="Picture 31"/>
+            <wp:docPr id="28" name="Picture 28"/>
             <wp:cNvGraphicFramePr>
               <a:graphicFrameLocks noChangeAspect="1"/>
             </wp:cNvGraphicFramePr>
@@ -17641,7 +17474,7 @@
               <a:graphicData uri="http://schemas.openxmlformats.org/drawingml/2006/picture">
                 <pic:pic>
                   <pic:nvPicPr>
-                    <pic:cNvPr id="0" name="task9-12-ready-with-noshow.png"/>
+                    <pic:cNvPr id="0" name="task9-09-pending-controls.png"/>
                     <pic:cNvPicPr/>
                   </pic:nvPicPr>
                   <pic:blipFill>
@@ -17671,9 +17504,14 @@
         <w:spacing w:after="240"/>
       </w:pPr>
       <w:r>
-        <w:t>Figure F31. Ready +35 min: both Mark collected and Mark no-show are offered</w:t>
+        <w:t>Figure F28. A Pending order: exactly Accept order / Reject order</w:t>
         <w:br/>
-        <w:t>Source: docs/evidence/screenshots/task9-12-ready-with-noshow.png</w:t>
+        <w:t>Source: docs/evidence/screenshots/task9-09-pending-controls.png</w:t>
+      </w:r>
+    </w:p>
+    <w:p>
+      <w:r>
+        <w:br w:type="page"/>
       </w:r>
     </w:p>
     <w:p>
@@ -17685,7 +17523,7 @@
         <w:drawing>
           <wp:inline xmlns:a="http://schemas.openxmlformats.org/drawingml/2006/main" xmlns:pic="http://schemas.openxmlformats.org/drawingml/2006/picture">
             <wp:extent cx="6080760" cy="3420428"/>
-            <wp:docPr id="32" name="Picture 32"/>
+            <wp:docPr id="29" name="Picture 29"/>
             <wp:cNvGraphicFramePr>
               <a:graphicFrameLocks noChangeAspect="1"/>
             </wp:cNvGraphicFramePr>
@@ -17693,7 +17531,7 @@
               <a:graphicData uri="http://schemas.openxmlformats.org/drawingml/2006/picture">
                 <pic:pic>
                   <pic:nvPicPr>
-                    <pic:cNvPr id="0" name="task9-13-terminal-cancelled.png"/>
+                    <pic:cNvPr id="0" name="task9-10-preparing-controls.png"/>
                     <pic:cNvPicPr/>
                   </pic:nvPicPr>
                   <pic:blipFill>
@@ -17723,14 +17561,9 @@
         <w:spacing w:after="240"/>
       </w:pPr>
       <w:r>
-        <w:t>Figure F32. Cancelled order: read-only, "This order is final", refund shown with time</w:t>
+        <w:t>Figure F29. A Preparing order: exactly Mark ready (rejection no longer offered)</w:t>
         <w:br/>
-        <w:t>Source: docs/evidence/screenshots/task9-13-terminal-cancelled.png</w:t>
-      </w:r>
-    </w:p>
-    <w:p>
-      <w:r>
-        <w:br w:type="page"/>
+        <w:t>Source: docs/evidence/screenshots/task9-10-preparing-controls.png</w:t>
       </w:r>
     </w:p>
     <w:p>
@@ -17742,7 +17575,7 @@
         <w:drawing>
           <wp:inline xmlns:a="http://schemas.openxmlformats.org/drawingml/2006/main" xmlns:pic="http://schemas.openxmlformats.org/drawingml/2006/picture">
             <wp:extent cx="6080760" cy="3420428"/>
-            <wp:docPr id="33" name="Picture 33"/>
+            <wp:docPr id="30" name="Picture 30"/>
             <wp:cNvGraphicFramePr>
               <a:graphicFrameLocks noChangeAspect="1"/>
             </wp:cNvGraphicFramePr>
@@ -17750,7 +17583,7 @@
               <a:graphicData uri="http://schemas.openxmlformats.org/drawingml/2006/picture">
                 <pic:pic>
                   <pic:nvPicPr>
-                    <pic:cNvPr id="0" name="task9-14-terminal-noshow.png"/>
+                    <pic:cNvPr id="0" name="task9-11-ready-no-noshow.png"/>
                     <pic:cNvPicPr/>
                   </pic:nvPicPr>
                   <pic:blipFill>
@@ -17780,9 +17613,14 @@
         <w:spacing w:after="240"/>
       </w:pPr>
       <w:r>
-        <w:t>Figure F33. NoShow order: read-only, payment-stays-paid notice</w:t>
+        <w:t>Figure F30. Ready +5 min: Mark collected only — the NoShow control is still hidden</w:t>
         <w:br/>
-        <w:t>Source: docs/evidence/screenshots/task9-14-terminal-noshow.png</w:t>
+        <w:t>Source: docs/evidence/screenshots/task9-11-ready-no-noshow.png</w:t>
+      </w:r>
+    </w:p>
+    <w:p>
+      <w:r>
+        <w:br w:type="page"/>
       </w:r>
     </w:p>
     <w:p>
@@ -17794,7 +17632,7 @@
         <w:drawing>
           <wp:inline xmlns:a="http://schemas.openxmlformats.org/drawingml/2006/main" xmlns:pic="http://schemas.openxmlformats.org/drawingml/2006/picture">
             <wp:extent cx="6080760" cy="3420428"/>
-            <wp:docPr id="34" name="Picture 34"/>
+            <wp:docPr id="31" name="Picture 31"/>
             <wp:cNvGraphicFramePr>
               <a:graphicFrameLocks noChangeAspect="1"/>
             </wp:cNvGraphicFramePr>
@@ -17802,7 +17640,7 @@
               <a:graphicData uri="http://schemas.openxmlformats.org/drawingml/2006/picture">
                 <pic:pic>
                   <pic:nvPicPr>
-                    <pic:cNvPr id="0" name="task9-15-terminal-collected-snapshot.png"/>
+                    <pic:cNvPr id="0" name="task9-12-ready-with-noshow.png"/>
                     <pic:cNvPicPr/>
                   </pic:nvPicPr>
                   <pic:blipFill>
@@ -17832,14 +17670,9 @@
         <w:spacing w:after="240"/>
       </w:pPr>
       <w:r>
-        <w:t>Figure F34. Collected order: read-only, stale purchase snapshot (Grilled Chicken Rice $6.00)</w:t>
+        <w:t>Figure F31. Ready +35 min: both Mark collected and Mark no-show are offered</w:t>
         <w:br/>
-        <w:t>Source: docs/evidence/screenshots/task9-15-terminal-collected-snapshot.png</w:t>
-      </w:r>
-    </w:p>
-    <w:p>
-      <w:r>
-        <w:br w:type="page"/>
+        <w:t>Source: docs/evidence/screenshots/task9-12-ready-with-noshow.png</w:t>
       </w:r>
     </w:p>
     <w:p>
@@ -17851,7 +17684,7 @@
         <w:drawing>
           <wp:inline xmlns:a="http://schemas.openxmlformats.org/drawingml/2006/main" xmlns:pic="http://schemas.openxmlformats.org/drawingml/2006/picture">
             <wp:extent cx="6080760" cy="3420428"/>
-            <wp:docPr id="35" name="Picture 35"/>
+            <wp:docPr id="32" name="Picture 32"/>
             <wp:cNvGraphicFramePr>
               <a:graphicFrameLocks noChangeAspect="1"/>
             </wp:cNvGraphicFramePr>
@@ -17859,7 +17692,7 @@
               <a:graphicData uri="http://schemas.openxmlformats.org/drawingml/2006/picture">
                 <pic:pic>
                   <pic:nvPicPr>
-                    <pic:cNvPr id="0" name="task9-16-forbidden-order.png"/>
+                    <pic:cNvPr id="0" name="task9-13-terminal-cancelled.png"/>
                     <pic:cNvPicPr/>
                   </pic:nvPicPr>
                   <pic:blipFill>
@@ -17889,9 +17722,14 @@
         <w:spacing w:after="240"/>
       </w:pPr>
       <w:r>
-        <w:t>Figure F35. Another stall's order: the 403 screen, no order data rendered</w:t>
+        <w:t>Figure F32. Cancelled order: read-only, "This order is final", refund shown with time</w:t>
         <w:br/>
-        <w:t>Source: docs/evidence/screenshots/task9-16-forbidden-order.png</w:t>
+        <w:t>Source: docs/evidence/screenshots/task9-13-terminal-cancelled.png</w:t>
+      </w:r>
+    </w:p>
+    <w:p>
+      <w:r>
+        <w:br w:type="page"/>
       </w:r>
     </w:p>
     <w:p>
@@ -17903,7 +17741,7 @@
         <w:drawing>
           <wp:inline xmlns:a="http://schemas.openxmlformats.org/drawingml/2006/main" xmlns:pic="http://schemas.openxmlformats.org/drawingml/2006/picture">
             <wp:extent cx="6080760" cy="3420428"/>
-            <wp:docPr id="36" name="Picture 36"/>
+            <wp:docPr id="33" name="Picture 33"/>
             <wp:cNvGraphicFramePr>
               <a:graphicFrameLocks noChangeAspect="1"/>
             </wp:cNvGraphicFramePr>
@@ -17911,7 +17749,7 @@
               <a:graphicData uri="http://schemas.openxmlformats.org/drawingml/2006/picture">
                 <pic:pic>
                   <pic:nvPicPr>
-                    <pic:cNvPr id="0" name="task9-17-closed-queue-accessible.png"/>
+                    <pic:cNvPr id="0" name="task9-14-terminal-noshow.png"/>
                     <pic:cNvPicPr/>
                   </pic:nvPicPr>
                   <pic:blipFill>
@@ -17941,14 +17779,9 @@
         <w:spacing w:after="240"/>
       </w:pPr>
       <w:r>
-        <w:t>Figure F36. While the stall is closed: closure banner plus the full paid queue with every Manage control enabled</w:t>
+        <w:t>Figure F33. NoShow order: read-only, payment-stays-paid notice</w:t>
         <w:br/>
-        <w:t>Source: docs/evidence/screenshots/task9-17-closed-queue-accessible.png</w:t>
-      </w:r>
-    </w:p>
-    <w:p>
-      <w:r>
-        <w:br w:type="page"/>
+        <w:t>Source: docs/evidence/screenshots/task9-14-terminal-noshow.png</w:t>
       </w:r>
     </w:p>
     <w:p>
@@ -17960,7 +17793,7 @@
         <w:drawing>
           <wp:inline xmlns:a="http://schemas.openxmlformats.org/drawingml/2006/main" xmlns:pic="http://schemas.openxmlformats.org/drawingml/2006/picture">
             <wp:extent cx="6080760" cy="3420428"/>
-            <wp:docPr id="37" name="Picture 37"/>
+            <wp:docPr id="34" name="Picture 34"/>
             <wp:cNvGraphicFramePr>
               <a:graphicFrameLocks noChangeAspect="1"/>
             </wp:cNvGraphicFramePr>
@@ -17968,7 +17801,7 @@
               <a:graphicData uri="http://schemas.openxmlformats.org/drawingml/2006/picture">
                 <pic:pic>
                   <pic:nvPicPr>
-                    <pic:cNvPr id="0" name="task9-18-diner-checkout-success.png"/>
+                    <pic:cNvPr id="0" name="task9-15-terminal-collected-snapshot.png"/>
                     <pic:cNvPicPr/>
                   </pic:nvPicPr>
                   <pic:blipFill>
@@ -17998,9 +17831,14 @@
         <w:spacing w:after="240"/>
       </w:pPr>
       <w:r>
-        <w:t>Figure F37. The diner context: the seeded cart ($15.50) paid, fresh queue number shown</w:t>
+        <w:t>Figure F34. Collected order: read-only, stale purchase snapshot (Grilled Chicken Rice $6.00)</w:t>
         <w:br/>
-        <w:t>Source: docs/evidence/screenshots/task9-18-diner-checkout-success.png</w:t>
+        <w:t>Source: docs/evidence/screenshots/task9-15-terminal-collected-snapshot.png</w:t>
+      </w:r>
+    </w:p>
+    <w:p>
+      <w:r>
+        <w:br w:type="page"/>
       </w:r>
     </w:p>
     <w:p>
@@ -18012,7 +17850,7 @@
         <w:drawing>
           <wp:inline xmlns:a="http://schemas.openxmlformats.org/drawingml/2006/main" xmlns:pic="http://schemas.openxmlformats.org/drawingml/2006/picture">
             <wp:extent cx="6080760" cy="3420428"/>
-            <wp:docPr id="38" name="Picture 38"/>
+            <wp:docPr id="35" name="Picture 35"/>
             <wp:cNvGraphicFramePr>
               <a:graphicFrameLocks noChangeAspect="1"/>
             </wp:cNvGraphicFramePr>
@@ -18020,7 +17858,7 @@
               <a:graphicData uri="http://schemas.openxmlformats.org/drawingml/2006/picture">
                 <pic:pic>
                   <pic:nvPicPr>
-                    <pic:cNvPr id="0" name="task9-19-vendor-accepted.png"/>
+                    <pic:cNvPr id="0" name="task9-16-forbidden-order.png"/>
                     <pic:cNvPicPr/>
                   </pic:nvPicPr>
                   <pic:blipFill>
@@ -18050,14 +17888,9 @@
         <w:spacing w:after="240"/>
       </w:pPr>
       <w:r>
-        <w:t>Figure F38. The vendor detail of the same order after Accept: Preparing badge, success notice</w:t>
+        <w:t>Figure F35. Another stall's order: the 403 screen, no order data rendered</w:t>
         <w:br/>
-        <w:t>Source: docs/evidence/screenshots/task9-19-vendor-accepted.png</w:t>
-      </w:r>
-    </w:p>
-    <w:p>
-      <w:r>
-        <w:br w:type="page"/>
+        <w:t>Source: docs/evidence/screenshots/task9-16-forbidden-order.png</w:t>
       </w:r>
     </w:p>
     <w:p>
@@ -18069,7 +17902,7 @@
         <w:drawing>
           <wp:inline xmlns:a="http://schemas.openxmlformats.org/drawingml/2006/main" xmlns:pic="http://schemas.openxmlformats.org/drawingml/2006/picture">
             <wp:extent cx="6080760" cy="3420428"/>
-            <wp:docPr id="39" name="Picture 39"/>
+            <wp:docPr id="36" name="Picture 36"/>
             <wp:cNvGraphicFramePr>
               <a:graphicFrameLocks noChangeAspect="1"/>
             </wp:cNvGraphicFramePr>
@@ -18077,7 +17910,7 @@
               <a:graphicData uri="http://schemas.openxmlformats.org/drawingml/2006/picture">
                 <pic:pic>
                   <pic:nvPicPr>
-                    <pic:cNvPr id="0" name="task9-20-diner-preparing.png"/>
+                    <pic:cNvPr id="0" name="task9-17-closed-queue-accessible.png"/>
                     <pic:cNvPicPr/>
                   </pic:nvPicPr>
                   <pic:blipFill>
@@ -18107,9 +17940,14 @@
         <w:spacing w:after="240"/>
       </w:pPr>
       <w:r>
-        <w:t>Figure F39. The diner's tracking page observing Preparing (polling, no manual refresh)</w:t>
+        <w:t>Figure F36. While the stall is closed: closure banner plus the full paid queue with every Manage control enabled</w:t>
         <w:br/>
-        <w:t>Source: docs/evidence/screenshots/task9-20-diner-preparing.png</w:t>
+        <w:t>Source: docs/evidence/screenshots/task9-17-closed-queue-accessible.png</w:t>
+      </w:r>
+    </w:p>
+    <w:p>
+      <w:r>
+        <w:br w:type="page"/>
       </w:r>
     </w:p>
     <w:p>
@@ -18121,7 +17959,7 @@
         <w:drawing>
           <wp:inline xmlns:a="http://schemas.openxmlformats.org/drawingml/2006/main" xmlns:pic="http://schemas.openxmlformats.org/drawingml/2006/picture">
             <wp:extent cx="6080760" cy="3420428"/>
-            <wp:docPr id="40" name="Picture 40"/>
+            <wp:docPr id="37" name="Picture 37"/>
             <wp:cNvGraphicFramePr>
               <a:graphicFrameLocks noChangeAspect="1"/>
             </wp:cNvGraphicFramePr>
@@ -18129,7 +17967,7 @@
               <a:graphicData uri="http://schemas.openxmlformats.org/drawingml/2006/picture">
                 <pic:pic>
                   <pic:nvPicPr>
-                    <pic:cNvPr id="0" name="task9-21-diner-ready-banner.png"/>
+                    <pic:cNvPr id="0" name="task9-18-diner-checkout-success.png"/>
                     <pic:cNvPicPr/>
                   </pic:nvPicPr>
                   <pic:blipFill>
@@ -18159,14 +17997,9 @@
         <w:spacing w:after="240"/>
       </w:pPr>
       <w:r>
-        <w:t>Figure F40. The Ready-for-collection banner on the diner's tracking page after Mark ready</w:t>
+        <w:t>Figure F37. The diner context: the seeded cart ($15.50) paid, fresh queue number shown</w:t>
         <w:br/>
-        <w:t>Source: docs/evidence/screenshots/task9-21-diner-ready-banner.png</w:t>
-      </w:r>
-    </w:p>
-    <w:p>
-      <w:r>
-        <w:br w:type="page"/>
+        <w:t>Source: docs/evidence/screenshots/task9-18-diner-checkout-success.png</w:t>
       </w:r>
     </w:p>
     <w:p>
@@ -18178,7 +18011,7 @@
         <w:drawing>
           <wp:inline xmlns:a="http://schemas.openxmlformats.org/drawingml/2006/main" xmlns:pic="http://schemas.openxmlformats.org/drawingml/2006/picture">
             <wp:extent cx="6080760" cy="3420428"/>
-            <wp:docPr id="41" name="Picture 41"/>
+            <wp:docPr id="38" name="Picture 38"/>
             <wp:cNvGraphicFramePr>
               <a:graphicFrameLocks noChangeAspect="1"/>
             </wp:cNvGraphicFramePr>
@@ -18186,7 +18019,7 @@
               <a:graphicData uri="http://schemas.openxmlformats.org/drawingml/2006/picture">
                 <pic:pic>
                   <pic:nvPicPr>
-                    <pic:cNvPr id="0" name="task9-22-vendor-collected.png"/>
+                    <pic:cNvPr id="0" name="task9-19-vendor-accepted.png"/>
                     <pic:cNvPicPr/>
                   </pic:nvPicPr>
                   <pic:blipFill>
@@ -18216,9 +18049,14 @@
         <w:spacing w:after="240"/>
       </w:pPr>
       <w:r>
-        <w:t>Figure F41. The vendor detail after Mark collected: terminal, read-only notice</w:t>
+        <w:t>Figure F38. The vendor detail of the same order after Accept: Preparing badge, success notice</w:t>
         <w:br/>
-        <w:t>Source: docs/evidence/screenshots/task9-22-vendor-collected.png</w:t>
+        <w:t>Source: docs/evidence/screenshots/task9-19-vendor-accepted.png</w:t>
+      </w:r>
+    </w:p>
+    <w:p>
+      <w:r>
+        <w:br w:type="page"/>
       </w:r>
     </w:p>
     <w:p>
@@ -18230,7 +18068,7 @@
         <w:drawing>
           <wp:inline xmlns:a="http://schemas.openxmlformats.org/drawingml/2006/main" xmlns:pic="http://schemas.openxmlformats.org/drawingml/2006/picture">
             <wp:extent cx="6080760" cy="3420428"/>
-            <wp:docPr id="42" name="Picture 42"/>
+            <wp:docPr id="39" name="Picture 39"/>
             <wp:cNvGraphicFramePr>
               <a:graphicFrameLocks noChangeAspect="1"/>
             </wp:cNvGraphicFramePr>
@@ -18238,7 +18076,7 @@
               <a:graphicData uri="http://schemas.openxmlformats.org/drawingml/2006/picture">
                 <pic:pic>
                   <pic:nvPicPr>
-                    <pic:cNvPr id="0" name="task9-23-diner-collected.png"/>
+                    <pic:cNvPr id="0" name="task9-20-diner-preparing.png"/>
                     <pic:cNvPicPr/>
                   </pic:nvPicPr>
                   <pic:blipFill>
@@ -18268,14 +18106,9 @@
         <w:spacing w:after="240"/>
       </w:pPr>
       <w:r>
-        <w:t>Figure F42. The diner's terminal Collected notice for the same order</w:t>
+        <w:t>Figure F39. The diner's tracking page observing Preparing (polling, no manual refresh)</w:t>
         <w:br/>
-        <w:t>Source: docs/evidence/screenshots/task9-23-diner-collected.png</w:t>
-      </w:r>
-    </w:p>
-    <w:p>
-      <w:r>
-        <w:br w:type="page"/>
+        <w:t>Source: docs/evidence/screenshots/task9-20-diner-preparing.png</w:t>
       </w:r>
     </w:p>
     <w:p>
@@ -18287,7 +18120,7 @@
         <w:drawing>
           <wp:inline xmlns:a="http://schemas.openxmlformats.org/drawingml/2006/main" xmlns:pic="http://schemas.openxmlformats.org/drawingml/2006/picture">
             <wp:extent cx="6080760" cy="3420428"/>
-            <wp:docPr id="43" name="Picture 43"/>
+            <wp:docPr id="40" name="Picture 40"/>
             <wp:cNvGraphicFramePr>
               <a:graphicFrameLocks noChangeAspect="1"/>
             </wp:cNvGraphicFramePr>
@@ -18295,7 +18128,7 @@
               <a:graphicData uri="http://schemas.openxmlformats.org/drawingml/2006/picture">
                 <pic:pic>
                   <pic:nvPicPr>
-                    <pic:cNvPr id="0" name="task9-24-cancel-refund.png"/>
+                    <pic:cNvPr id="0" name="task9-21-diner-ready-banner.png"/>
                     <pic:cNvPicPr/>
                   </pic:nvPicPr>
                   <pic:blipFill>
@@ -18325,9 +18158,14 @@
         <w:spacing w:after="240"/>
       </w:pPr>
       <w:r>
-        <w:t>Figure F43. The vendor rejecting the seeded Pending order: Cancelled badge, refund shown</w:t>
+        <w:t>Figure F40. The Ready-for-collection banner on the diner's tracking page after Mark ready</w:t>
         <w:br/>
-        <w:t>Source: docs/evidence/screenshots/task9-24-cancel-refund.png</w:t>
+        <w:t>Source: docs/evidence/screenshots/task9-21-diner-ready-banner.png</w:t>
+      </w:r>
+    </w:p>
+    <w:p>
+      <w:r>
+        <w:br w:type="page"/>
       </w:r>
     </w:p>
     <w:p>
@@ -18339,7 +18177,7 @@
         <w:drawing>
           <wp:inline xmlns:a="http://schemas.openxmlformats.org/drawingml/2006/main" xmlns:pic="http://schemas.openxmlformats.org/drawingml/2006/picture">
             <wp:extent cx="6080760" cy="3420428"/>
-            <wp:docPr id="44" name="Picture 44"/>
+            <wp:docPr id="41" name="Picture 41"/>
             <wp:cNvGraphicFramePr>
               <a:graphicFrameLocks noChangeAspect="1"/>
             </wp:cNvGraphicFramePr>
@@ -18347,7 +18185,7 @@
               <a:graphicData uri="http://schemas.openxmlformats.org/drawingml/2006/picture">
                 <pic:pic>
                   <pic:nvPicPr>
-                    <pic:cNvPr id="0" name="task9-25-diner-cancelled.png"/>
+                    <pic:cNvPr id="0" name="task9-22-vendor-collected.png"/>
                     <pic:cNvPicPr/>
                   </pic:nvPicPr>
                   <pic:blipFill>
@@ -18377,14 +18215,9 @@
         <w:spacing w:after="240"/>
       </w:pPr>
       <w:r>
-        <w:t>Figure F44. The diner's cancellation notice with the refunded $13.00 amount</w:t>
+        <w:t>Figure F41. The vendor detail after Mark collected: terminal, read-only notice</w:t>
         <w:br/>
-        <w:t>Source: docs/evidence/screenshots/task9-25-diner-cancelled.png</w:t>
-      </w:r>
-    </w:p>
-    <w:p>
-      <w:r>
-        <w:br w:type="page"/>
+        <w:t>Source: docs/evidence/screenshots/task9-22-vendor-collected.png</w:t>
       </w:r>
     </w:p>
     <w:p>
@@ -18396,7 +18229,7 @@
         <w:drawing>
           <wp:inline xmlns:a="http://schemas.openxmlformats.org/drawingml/2006/main" xmlns:pic="http://schemas.openxmlformats.org/drawingml/2006/picture">
             <wp:extent cx="6080760" cy="3420428"/>
-            <wp:docPr id="45" name="Picture 45"/>
+            <wp:docPr id="42" name="Picture 42"/>
             <wp:cNvGraphicFramePr>
               <a:graphicFrameLocks noChangeAspect="1"/>
             </wp:cNvGraphicFramePr>
@@ -18404,7 +18237,7 @@
               <a:graphicData uri="http://schemas.openxmlformats.org/drawingml/2006/picture">
                 <pic:pic>
                   <pic:nvPicPr>
-                    <pic:cNvPr id="0" name="task9-26-vendor-noshow.png"/>
+                    <pic:cNvPr id="0" name="task9-23-diner-collected.png"/>
                     <pic:cNvPicPr/>
                   </pic:nvPicPr>
                   <pic:blipFill>
@@ -18434,9 +18267,14 @@
         <w:spacing w:after="240"/>
       </w:pPr>
       <w:r>
-        <w:t>Figure F45. Mark no-show accepted past the 30-minute boundary: NoShow badge, stays-paid notice</w:t>
+        <w:t>Figure F42. The diner's terminal Collected notice for the same order</w:t>
         <w:br/>
-        <w:t>Source: docs/evidence/screenshots/task9-26-vendor-noshow.png</w:t>
+        <w:t>Source: docs/evidence/screenshots/task9-23-diner-collected.png</w:t>
+      </w:r>
+    </w:p>
+    <w:p>
+      <w:r>
+        <w:br w:type="page"/>
       </w:r>
     </w:p>
     <w:p>
@@ -18448,7 +18286,7 @@
         <w:drawing>
           <wp:inline xmlns:a="http://schemas.openxmlformats.org/drawingml/2006/main" xmlns:pic="http://schemas.openxmlformats.org/drawingml/2006/picture">
             <wp:extent cx="6080760" cy="3420428"/>
-            <wp:docPr id="46" name="Picture 46"/>
+            <wp:docPr id="43" name="Picture 43"/>
             <wp:cNvGraphicFramePr>
               <a:graphicFrameLocks noChangeAspect="1"/>
             </wp:cNvGraphicFramePr>
@@ -18456,7 +18294,7 @@
               <a:graphicData uri="http://schemas.openxmlformats.org/drawingml/2006/picture">
                 <pic:pic>
                   <pic:nvPicPr>
-                    <pic:cNvPr id="0" name="task9-27-diner-noshow.png"/>
+                    <pic:cNvPr id="0" name="task9-24-cancel-refund.png"/>
                     <pic:cNvPicPr/>
                   </pic:nvPicPr>
                   <pic:blipFill>
@@ -18486,14 +18324,9 @@
         <w:spacing w:after="240"/>
       </w:pPr>
       <w:r>
-        <w:t>Figure F46. The diner's no-show notice ("The payment stays paid.")</w:t>
+        <w:t>Figure F43. The vendor rejecting the seeded Pending order: Cancelled badge, refund shown</w:t>
         <w:br/>
-        <w:t>Source: docs/evidence/screenshots/task9-27-diner-noshow.png</w:t>
-      </w:r>
-    </w:p>
-    <w:p>
-      <w:r>
-        <w:br w:type="page"/>
+        <w:t>Source: docs/evidence/screenshots/task9-24-cancel-refund.png</w:t>
       </w:r>
     </w:p>
     <w:p>
@@ -18505,7 +18338,7 @@
         <w:drawing>
           <wp:inline xmlns:a="http://schemas.openxmlformats.org/drawingml/2006/main" xmlns:pic="http://schemas.openxmlformats.org/drawingml/2006/picture">
             <wp:extent cx="6080760" cy="3420428"/>
-            <wp:docPr id="47" name="Picture 47"/>
+            <wp:docPr id="44" name="Picture 44"/>
             <wp:cNvGraphicFramePr>
               <a:graphicFrameLocks noChangeAspect="1"/>
             </wp:cNvGraphicFramePr>
@@ -18513,7 +18346,7 @@
               <a:graphicData uri="http://schemas.openxmlformats.org/drawingml/2006/picture">
                 <pic:pic>
                   <pic:nvPicPr>
-                    <pic:cNvPr id="0" name="task10-01-orders-all.png"/>
+                    <pic:cNvPr id="0" name="task9-25-diner-cancelled.png"/>
                     <pic:cNvPicPr/>
                   </pic:nvPicPr>
                   <pic:blipFill>
@@ -18543,9 +18376,14 @@
         <w:spacing w:after="240"/>
       </w:pPr>
       <w:r>
-        <w:t>Figure F47. All (default): the diner's 8 own orders across all six statuses, newest-first, another diner's order absent</w:t>
+        <w:t>Figure F44. The diner's cancellation notice with the refunded $13.00 amount</w:t>
         <w:br/>
-        <w:t>Source: docs/evidence/screenshots/task10-01-orders-all.png</w:t>
+        <w:t>Source: docs/evidence/screenshots/task9-25-diner-cancelled.png</w:t>
+      </w:r>
+    </w:p>
+    <w:p>
+      <w:r>
+        <w:br w:type="page"/>
       </w:r>
     </w:p>
     <w:p>
@@ -18557,7 +18395,7 @@
         <w:drawing>
           <wp:inline xmlns:a="http://schemas.openxmlformats.org/drawingml/2006/main" xmlns:pic="http://schemas.openxmlformats.org/drawingml/2006/picture">
             <wp:extent cx="6080760" cy="3420428"/>
-            <wp:docPr id="48" name="Picture 48"/>
+            <wp:docPr id="45" name="Picture 45"/>
             <wp:cNvGraphicFramePr>
               <a:graphicFrameLocks noChangeAspect="1"/>
             </wp:cNvGraphicFramePr>
@@ -18565,7 +18403,7 @@
               <a:graphicData uri="http://schemas.openxmlformats.org/drawingml/2006/picture">
                 <pic:pic>
                   <pic:nvPicPr>
-                    <pic:cNvPr id="0" name="task10-02-orders-current.png"/>
+                    <pic:cNvPr id="0" name="task9-26-vendor-noshow.png"/>
                     <pic:cNvPicPr/>
                   </pic:nvPicPr>
                   <pic:blipFill>
@@ -18595,14 +18433,9 @@
         <w:spacing w:after="240"/>
       </w:pPr>
       <w:r>
-        <w:t>Figure F48. Current filter: only the 5 Pending/Preparing/Ready orders</w:t>
+        <w:t>Figure F45. Mark no-show accepted past the 30-minute boundary: NoShow badge, stays-paid notice</w:t>
         <w:br/>
-        <w:t>Source: docs/evidence/screenshots/task10-02-orders-current.png</w:t>
-      </w:r>
-    </w:p>
-    <w:p>
-      <w:r>
-        <w:br w:type="page"/>
+        <w:t>Source: docs/evidence/screenshots/task9-26-vendor-noshow.png</w:t>
       </w:r>
     </w:p>
     <w:p>
@@ -18614,7 +18447,7 @@
         <w:drawing>
           <wp:inline xmlns:a="http://schemas.openxmlformats.org/drawingml/2006/main" xmlns:pic="http://schemas.openxmlformats.org/drawingml/2006/picture">
             <wp:extent cx="6080760" cy="3420428"/>
-            <wp:docPr id="49" name="Picture 49"/>
+            <wp:docPr id="46" name="Picture 46"/>
             <wp:cNvGraphicFramePr>
               <a:graphicFrameLocks noChangeAspect="1"/>
             </wp:cNvGraphicFramePr>
@@ -18622,7 +18455,7 @@
               <a:graphicData uri="http://schemas.openxmlformats.org/drawingml/2006/picture">
                 <pic:pic>
                   <pic:nvPicPr>
-                    <pic:cNvPr id="0" name="task10-03-orders-past.png"/>
+                    <pic:cNvPr id="0" name="task9-27-diner-noshow.png"/>
                     <pic:cNvPicPr/>
                   </pic:nvPicPr>
                   <pic:blipFill>
@@ -18652,9 +18485,14 @@
         <w:spacing w:after="240"/>
       </w:pPr>
       <w:r>
-        <w:t>Figure F49. Past filter: exactly the 3 terminal orders, newest-first (this view never polls)</w:t>
+        <w:t>Figure F46. The diner's no-show notice ("The payment stays paid.")</w:t>
         <w:br/>
-        <w:t>Source: docs/evidence/screenshots/task10-03-orders-past.png</w:t>
+        <w:t>Source: docs/evidence/screenshots/task9-27-diner-noshow.png</w:t>
+      </w:r>
+    </w:p>
+    <w:p>
+      <w:r>
+        <w:br w:type="page"/>
       </w:r>
     </w:p>
     <w:p>
@@ -18666,7 +18504,7 @@
         <w:drawing>
           <wp:inline xmlns:a="http://schemas.openxmlformats.org/drawingml/2006/main" xmlns:pic="http://schemas.openxmlformats.org/drawingml/2006/picture">
             <wp:extent cx="6080760" cy="3420428"/>
-            <wp:docPr id="50" name="Picture 50"/>
+            <wp:docPr id="47" name="Picture 47"/>
             <wp:cNvGraphicFramePr>
               <a:graphicFrameLocks noChangeAspect="1"/>
             </wp:cNvGraphicFramePr>
@@ -18674,7 +18512,7 @@
               <a:graphicData uri="http://schemas.openxmlformats.org/drawingml/2006/picture">
                 <pic:pic>
                   <pic:nvPicPr>
-                    <pic:cNvPr id="0" name="task10-04-past-collected-snapshot.png"/>
+                    <pic:cNvPr id="0" name="task10-01-orders-all.png"/>
                     <pic:cNvPicPr/>
                   </pic:nvPicPr>
                   <pic:blipFill>
@@ -18704,14 +18542,9 @@
         <w:spacing w:after="240"/>
       </w:pPr>
       <w:r>
-        <w:t>Figure F50. Read-only past detail: Collected notice, stale snapshot (Grilled Chicken Rice $6.00)</w:t>
+        <w:t>Figure F47. All (default): the diner's 8 own orders across all six statuses, newest-first, another diner's order absent</w:t>
         <w:br/>
-        <w:t>Source: docs/evidence/screenshots/task10-04-past-collected-snapshot.png</w:t>
-      </w:r>
-    </w:p>
-    <w:p>
-      <w:r>
-        <w:br w:type="page"/>
+        <w:t>Source: docs/evidence/screenshots/task10-01-orders-all.png</w:t>
       </w:r>
     </w:p>
     <w:p>
@@ -18723,7 +18556,7 @@
         <w:drawing>
           <wp:inline xmlns:a="http://schemas.openxmlformats.org/drawingml/2006/main" xmlns:pic="http://schemas.openxmlformats.org/drawingml/2006/picture">
             <wp:extent cx="6080760" cy="3420428"/>
-            <wp:docPr id="51" name="Picture 51"/>
+            <wp:docPr id="48" name="Picture 48"/>
             <wp:cNvGraphicFramePr>
               <a:graphicFrameLocks noChangeAspect="1"/>
             </wp:cNvGraphicFramePr>
@@ -18731,7 +18564,7 @@
               <a:graphicData uri="http://schemas.openxmlformats.org/drawingml/2006/picture">
                 <pic:pic>
                   <pic:nvPicPr>
-                    <pic:cNvPr id="0" name="task10-05-past-cancelled-refund.png"/>
+                    <pic:cNvPr id="0" name="task10-02-orders-current.png"/>
                     <pic:cNvPicPr/>
                   </pic:nvPicPr>
                   <pic:blipFill>
@@ -18761,9 +18594,14 @@
         <w:spacing w:after="240"/>
       </w:pPr>
       <w:r>
-        <w:t>Figure F51. Read-only past detail: Cancelled notice with the refunded $2.50 and time</w:t>
+        <w:t>Figure F48. Current filter: only the 5 Pending/Preparing/Ready orders</w:t>
         <w:br/>
-        <w:t>Source: docs/evidence/screenshots/task10-05-past-cancelled-refund.png</w:t>
+        <w:t>Source: docs/evidence/screenshots/task10-02-orders-current.png</w:t>
+      </w:r>
+    </w:p>
+    <w:p>
+      <w:r>
+        <w:br w:type="page"/>
       </w:r>
     </w:p>
     <w:p>
@@ -18775,7 +18613,7 @@
         <w:drawing>
           <wp:inline xmlns:a="http://schemas.openxmlformats.org/drawingml/2006/main" xmlns:pic="http://schemas.openxmlformats.org/drawingml/2006/picture">
             <wp:extent cx="6080760" cy="3420428"/>
-            <wp:docPr id="52" name="Picture 52"/>
+            <wp:docPr id="49" name="Picture 49"/>
             <wp:cNvGraphicFramePr>
               <a:graphicFrameLocks noChangeAspect="1"/>
             </wp:cNvGraphicFramePr>
@@ -18783,7 +18621,7 @@
               <a:graphicData uri="http://schemas.openxmlformats.org/drawingml/2006/picture">
                 <pic:pic>
                   <pic:nvPicPr>
-                    <pic:cNvPr id="0" name="task10-06-current-snapshot-after-reprice.png"/>
+                    <pic:cNvPr id="0" name="task10-03-orders-past.png"/>
                     <pic:cNvPicPr/>
                   </pic:nvPicPr>
                   <pic:blipFill>
@@ -18813,14 +18651,9 @@
         <w:spacing w:after="240"/>
       </w:pPr>
       <w:r>
-        <w:t>Figure F52. An in-progress order keeping its $13.00 snapshot total after the menu item was live-repriced</w:t>
+        <w:t>Figure F49. Past filter: exactly the 3 terminal orders, newest-first (this view never polls)</w:t>
         <w:br/>
-        <w:t>Source: docs/evidence/screenshots/task10-06-current-snapshot-after-reprice.png</w:t>
-      </w:r>
-    </w:p>
-    <w:p>
-      <w:r>
-        <w:br w:type="page"/>
+        <w:t>Source: docs/evidence/screenshots/task10-03-orders-past.png</w:t>
       </w:r>
     </w:p>
     <w:p>
@@ -18832,7 +18665,7 @@
         <w:drawing>
           <wp:inline xmlns:a="http://schemas.openxmlformats.org/drawingml/2006/main" xmlns:pic="http://schemas.openxmlformats.org/drawingml/2006/picture">
             <wp:extent cx="6080760" cy="3420428"/>
-            <wp:docPr id="53" name="Picture 53"/>
+            <wp:docPr id="50" name="Picture 50"/>
             <wp:cNvGraphicFramePr>
               <a:graphicFrameLocks noChangeAspect="1"/>
             </wp:cNvGraphicFramePr>
@@ -18840,7 +18673,7 @@
               <a:graphicData uri="http://schemas.openxmlformats.org/drawingml/2006/picture">
                 <pic:pic>
                   <pic:nvPicPr>
-                    <pic:cNvPr id="0" name="task10-07-empty-diner-all.png"/>
+                    <pic:cNvPr id="0" name="task10-04-past-collected-snapshot.png"/>
                     <pic:cNvPicPr/>
                   </pic:nvPicPr>
                   <pic:blipFill>
@@ -18870,9 +18703,14 @@
         <w:spacing w:after="240"/>
       </w:pPr>
       <w:r>
-        <w:t>Figure F53. An order-free diner: "You have no orders yet." with the Browse open stalls link</w:t>
+        <w:t>Figure F50. Read-only past detail: Collected notice, stale snapshot (Grilled Chicken Rice $6.00)</w:t>
         <w:br/>
-        <w:t>Source: docs/evidence/screenshots/task10-07-empty-diner-all.png</w:t>
+        <w:t>Source: docs/evidence/screenshots/task10-04-past-collected-snapshot.png</w:t>
+      </w:r>
+    </w:p>
+    <w:p>
+      <w:r>
+        <w:br w:type="page"/>
       </w:r>
     </w:p>
     <w:p>
@@ -18884,7 +18722,7 @@
         <w:drawing>
           <wp:inline xmlns:a="http://schemas.openxmlformats.org/drawingml/2006/main" xmlns:pic="http://schemas.openxmlformats.org/drawingml/2006/picture">
             <wp:extent cx="6080760" cy="3420428"/>
-            <wp:docPr id="54" name="Picture 54"/>
+            <wp:docPr id="51" name="Picture 51"/>
             <wp:cNvGraphicFramePr>
               <a:graphicFrameLocks noChangeAspect="1"/>
             </wp:cNvGraphicFramePr>
@@ -18892,7 +18730,7 @@
               <a:graphicData uri="http://schemas.openxmlformats.org/drawingml/2006/picture">
                 <pic:pic>
                   <pic:nvPicPr>
-                    <pic:cNvPr id="0" name="task10-08-empty-diner-past.png"/>
+                    <pic:cNvPr id="0" name="task10-05-past-cancelled-refund.png"/>
                     <pic:cNvPicPr/>
                   </pic:nvPicPr>
                   <pic:blipFill>
@@ -18922,14 +18760,9 @@
         <w:spacing w:after="240"/>
       </w:pPr>
       <w:r>
-        <w:t>Figure F54. The same diner on Past: "No past orders yet."</w:t>
+        <w:t>Figure F51. Read-only past detail: Cancelled notice with the refunded $2.50 and time</w:t>
         <w:br/>
-        <w:t>Source: docs/evidence/screenshots/task10-08-empty-diner-past.png</w:t>
-      </w:r>
-    </w:p>
-    <w:p>
-      <w:r>
-        <w:br w:type="page"/>
+        <w:t>Source: docs/evidence/screenshots/task10-05-past-cancelled-refund.png</w:t>
       </w:r>
     </w:p>
     <w:p>
@@ -18941,7 +18774,7 @@
         <w:drawing>
           <wp:inline xmlns:a="http://schemas.openxmlformats.org/drawingml/2006/main" xmlns:pic="http://schemas.openxmlformats.org/drawingml/2006/picture">
             <wp:extent cx="6080760" cy="3420428"/>
-            <wp:docPr id="55" name="Picture 55"/>
+            <wp:docPr id="52" name="Picture 52"/>
             <wp:cNvGraphicFramePr>
               <a:graphicFrameLocks noChangeAspect="1"/>
             </wp:cNvGraphicFramePr>
@@ -18949,7 +18782,7 @@
               <a:graphicData uri="http://schemas.openxmlformats.org/drawingml/2006/picture">
                 <pic:pic>
                   <pic:nvPicPr>
-                    <pic:cNvPr id="0" name="task11-01-diner-payment-success-pending.png"/>
+                    <pic:cNvPr id="0" name="task10-06-current-snapshot-after-reprice.png"/>
                     <pic:cNvPicPr/>
                   </pic:nvPicPr>
                   <pic:blipFill>
@@ -18979,9 +18812,14 @@
         <w:spacing w:after="240"/>
       </w:pPr>
       <w:r>
-        <w:t>Figure F55. task11 01 diner payment success pending</w:t>
+        <w:t>Figure F52. An in-progress order keeping its $13.00 snapshot total after the menu item was live-repriced</w:t>
         <w:br/>
-        <w:t>Source: docs/evidence/screenshots/task11-01-diner-payment-success-pending.png</w:t>
+        <w:t>Source: docs/evidence/screenshots/task10-06-current-snapshot-after-reprice.png</w:t>
+      </w:r>
+    </w:p>
+    <w:p>
+      <w:r>
+        <w:br w:type="page"/>
       </w:r>
     </w:p>
     <w:p>
@@ -18993,7 +18831,7 @@
         <w:drawing>
           <wp:inline xmlns:a="http://schemas.openxmlformats.org/drawingml/2006/main" xmlns:pic="http://schemas.openxmlformats.org/drawingml/2006/picture">
             <wp:extent cx="6080760" cy="3420428"/>
-            <wp:docPr id="56" name="Picture 56"/>
+            <wp:docPr id="53" name="Picture 53"/>
             <wp:cNvGraphicFramePr>
               <a:graphicFrameLocks noChangeAspect="1"/>
             </wp:cNvGraphicFramePr>
@@ -19001,7 +18839,7 @@
               <a:graphicData uri="http://schemas.openxmlformats.org/drawingml/2006/picture">
                 <pic:pic>
                   <pic:nvPicPr>
-                    <pic:cNvPr id="0" name="task11-02-diner-pending.png"/>
+                    <pic:cNvPr id="0" name="task10-07-empty-diner-all.png"/>
                     <pic:cNvPicPr/>
                   </pic:nvPicPr>
                   <pic:blipFill>
@@ -19031,14 +18869,9 @@
         <w:spacing w:after="240"/>
       </w:pPr>
       <w:r>
-        <w:t>Figure F56. task11 02 diner pending</w:t>
+        <w:t>Figure F53. An order-free diner: "You have no orders yet." with the Browse open stalls link</w:t>
         <w:br/>
-        <w:t>Source: docs/evidence/screenshots/task11-02-diner-pending.png</w:t>
-      </w:r>
-    </w:p>
-    <w:p>
-      <w:r>
-        <w:br w:type="page"/>
+        <w:t>Source: docs/evidence/screenshots/task10-07-empty-diner-all.png</w:t>
       </w:r>
     </w:p>
     <w:p>
@@ -19050,7 +18883,7 @@
         <w:drawing>
           <wp:inline xmlns:a="http://schemas.openxmlformats.org/drawingml/2006/main" xmlns:pic="http://schemas.openxmlformats.org/drawingml/2006/picture">
             <wp:extent cx="6080760" cy="3420428"/>
-            <wp:docPr id="57" name="Picture 57"/>
+            <wp:docPr id="54" name="Picture 54"/>
             <wp:cNvGraphicFramePr>
               <a:graphicFrameLocks noChangeAspect="1"/>
             </wp:cNvGraphicFramePr>
@@ -19058,7 +18891,7 @@
               <a:graphicData uri="http://schemas.openxmlformats.org/drawingml/2006/picture">
                 <pic:pic>
                   <pic:nvPicPr>
-                    <pic:cNvPr id="0" name="task11-03-vendor-queue-with-new-pending-order.png"/>
+                    <pic:cNvPr id="0" name="task10-08-empty-diner-past.png"/>
                     <pic:cNvPicPr/>
                   </pic:nvPicPr>
                   <pic:blipFill>
@@ -19088,9 +18921,14 @@
         <w:spacing w:after="240"/>
       </w:pPr>
       <w:r>
-        <w:t>Figure F57. task11 03 vendor queue with new pending order</w:t>
+        <w:t>Figure F54. The same diner on Past: "No past orders yet."</w:t>
         <w:br/>
-        <w:t>Source: docs/evidence/screenshots/task11-03-vendor-queue-with-new-pending-order.png</w:t>
+        <w:t>Source: docs/evidence/screenshots/task10-08-empty-diner-past.png</w:t>
+      </w:r>
+    </w:p>
+    <w:p>
+      <w:r>
+        <w:br w:type="page"/>
       </w:r>
     </w:p>
     <w:p>
@@ -19102,7 +18940,7 @@
         <w:drawing>
           <wp:inline xmlns:a="http://schemas.openxmlformats.org/drawingml/2006/main" xmlns:pic="http://schemas.openxmlformats.org/drawingml/2006/picture">
             <wp:extent cx="6080760" cy="3420428"/>
-            <wp:docPr id="58" name="Picture 58"/>
+            <wp:docPr id="55" name="Picture 55"/>
             <wp:cNvGraphicFramePr>
               <a:graphicFrameLocks noChangeAspect="1"/>
             </wp:cNvGraphicFramePr>
@@ -19110,7 +18948,7 @@
               <a:graphicData uri="http://schemas.openxmlformats.org/drawingml/2006/picture">
                 <pic:pic>
                   <pic:nvPicPr>
-                    <pic:cNvPr id="0" name="task11-04-vendor-pending.png"/>
+                    <pic:cNvPr id="0" name="task11-01-diner-payment-success-pending.png"/>
                     <pic:cNvPicPr/>
                   </pic:nvPicPr>
                   <pic:blipFill>
@@ -19140,14 +18978,9 @@
         <w:spacing w:after="240"/>
       </w:pPr>
       <w:r>
-        <w:t>Figure F58. task11 04 vendor pending</w:t>
+        <w:t>Figure F55. task11 01 diner payment success pending</w:t>
         <w:br/>
-        <w:t>Source: docs/evidence/screenshots/task11-04-vendor-pending.png</w:t>
-      </w:r>
-    </w:p>
-    <w:p>
-      <w:r>
-        <w:br w:type="page"/>
+        <w:t>Source: docs/evidence/screenshots/task11-01-diner-payment-success-pending.png</w:t>
       </w:r>
     </w:p>
     <w:p>
@@ -19159,7 +18992,7 @@
         <w:drawing>
           <wp:inline xmlns:a="http://schemas.openxmlformats.org/drawingml/2006/main" xmlns:pic="http://schemas.openxmlformats.org/drawingml/2006/picture">
             <wp:extent cx="6080760" cy="3420428"/>
-            <wp:docPr id="59" name="Picture 59"/>
+            <wp:docPr id="56" name="Picture 56"/>
             <wp:cNvGraphicFramePr>
               <a:graphicFrameLocks noChangeAspect="1"/>
             </wp:cNvGraphicFramePr>
@@ -19167,7 +19000,7 @@
               <a:graphicData uri="http://schemas.openxmlformats.org/drawingml/2006/picture">
                 <pic:pic>
                   <pic:nvPicPr>
-                    <pic:cNvPr id="0" name="task11-05-vendor-preparing.png"/>
+                    <pic:cNvPr id="0" name="task11-02-diner-pending.png"/>
                     <pic:cNvPicPr/>
                   </pic:nvPicPr>
                   <pic:blipFill>
@@ -19197,9 +19030,14 @@
         <w:spacing w:after="240"/>
       </w:pPr>
       <w:r>
-        <w:t>Figure F59. task11 05 vendor preparing</w:t>
+        <w:t>Figure F56. task11 02 diner pending</w:t>
         <w:br/>
-        <w:t>Source: docs/evidence/screenshots/task11-05-vendor-preparing.png</w:t>
+        <w:t>Source: docs/evidence/screenshots/task11-02-diner-pending.png</w:t>
+      </w:r>
+    </w:p>
+    <w:p>
+      <w:r>
+        <w:br w:type="page"/>
       </w:r>
     </w:p>
     <w:p>
@@ -19211,7 +19049,7 @@
         <w:drawing>
           <wp:inline xmlns:a="http://schemas.openxmlformats.org/drawingml/2006/main" xmlns:pic="http://schemas.openxmlformats.org/drawingml/2006/picture">
             <wp:extent cx="6080760" cy="3420428"/>
-            <wp:docPr id="60" name="Picture 60"/>
+            <wp:docPr id="57" name="Picture 57"/>
             <wp:cNvGraphicFramePr>
               <a:graphicFrameLocks noChangeAspect="1"/>
             </wp:cNvGraphicFramePr>
@@ -19219,7 +19057,7 @@
               <a:graphicData uri="http://schemas.openxmlformats.org/drawingml/2006/picture">
                 <pic:pic>
                   <pic:nvPicPr>
-                    <pic:cNvPr id="0" name="task11-06-diner-preparing.png"/>
+                    <pic:cNvPr id="0" name="task11-03-vendor-queue-with-new-pending-order.png"/>
                     <pic:cNvPicPr/>
                   </pic:nvPicPr>
                   <pic:blipFill>
@@ -19249,14 +19087,9 @@
         <w:spacing w:after="240"/>
       </w:pPr>
       <w:r>
-        <w:t>Figure F60. task11 06 diner preparing</w:t>
+        <w:t>Figure F57. task11 03 vendor queue with new pending order</w:t>
         <w:br/>
-        <w:t>Source: docs/evidence/screenshots/task11-06-diner-preparing.png</w:t>
-      </w:r>
-    </w:p>
-    <w:p>
-      <w:r>
-        <w:br w:type="page"/>
+        <w:t>Source: docs/evidence/screenshots/task11-03-vendor-queue-with-new-pending-order.png</w:t>
       </w:r>
     </w:p>
     <w:p>
@@ -19268,7 +19101,7 @@
         <w:drawing>
           <wp:inline xmlns:a="http://schemas.openxmlformats.org/drawingml/2006/main" xmlns:pic="http://schemas.openxmlformats.org/drawingml/2006/picture">
             <wp:extent cx="6080760" cy="3420428"/>
-            <wp:docPr id="61" name="Picture 61"/>
+            <wp:docPr id="58" name="Picture 58"/>
             <wp:cNvGraphicFramePr>
               <a:graphicFrameLocks noChangeAspect="1"/>
             </wp:cNvGraphicFramePr>
@@ -19276,7 +19109,7 @@
               <a:graphicData uri="http://schemas.openxmlformats.org/drawingml/2006/picture">
                 <pic:pic>
                   <pic:nvPicPr>
-                    <pic:cNvPr id="0" name="task11-07-vendor-ready.png"/>
+                    <pic:cNvPr id="0" name="task11-04-vendor-pending.png"/>
                     <pic:cNvPicPr/>
                   </pic:nvPicPr>
                   <pic:blipFill>
@@ -19306,9 +19139,14 @@
         <w:spacing w:after="240"/>
       </w:pPr>
       <w:r>
-        <w:t>Figure F61. task11 07 vendor ready</w:t>
+        <w:t>Figure F58. task11 04 vendor pending</w:t>
         <w:br/>
-        <w:t>Source: docs/evidence/screenshots/task11-07-vendor-ready.png</w:t>
+        <w:t>Source: docs/evidence/screenshots/task11-04-vendor-pending.png</w:t>
+      </w:r>
+    </w:p>
+    <w:p>
+      <w:r>
+        <w:br w:type="page"/>
       </w:r>
     </w:p>
     <w:p>
@@ -19320,7 +19158,7 @@
         <w:drawing>
           <wp:inline xmlns:a="http://schemas.openxmlformats.org/drawingml/2006/main" xmlns:pic="http://schemas.openxmlformats.org/drawingml/2006/picture">
             <wp:extent cx="6080760" cy="3420428"/>
-            <wp:docPr id="62" name="Picture 62"/>
+            <wp:docPr id="59" name="Picture 59"/>
             <wp:cNvGraphicFramePr>
               <a:graphicFrameLocks noChangeAspect="1"/>
             </wp:cNvGraphicFramePr>
@@ -19328,7 +19166,7 @@
               <a:graphicData uri="http://schemas.openxmlformats.org/drawingml/2006/picture">
                 <pic:pic>
                   <pic:nvPicPr>
-                    <pic:cNvPr id="0" name="task11-08-diner-ready.png"/>
+                    <pic:cNvPr id="0" name="task11-05-vendor-preparing.png"/>
                     <pic:cNvPicPr/>
                   </pic:nvPicPr>
                   <pic:blipFill>
@@ -19358,14 +19196,9 @@
         <w:spacing w:after="240"/>
       </w:pPr>
       <w:r>
-        <w:t>Figure F62. task11 08 diner ready</w:t>
+        <w:t>Figure F59. task11 05 vendor preparing</w:t>
         <w:br/>
-        <w:t>Source: docs/evidence/screenshots/task11-08-diner-ready.png</w:t>
-      </w:r>
-    </w:p>
-    <w:p>
-      <w:r>
-        <w:br w:type="page"/>
+        <w:t>Source: docs/evidence/screenshots/task11-05-vendor-preparing.png</w:t>
       </w:r>
     </w:p>
     <w:p>
@@ -19377,7 +19210,7 @@
         <w:drawing>
           <wp:inline xmlns:a="http://schemas.openxmlformats.org/drawingml/2006/main" xmlns:pic="http://schemas.openxmlformats.org/drawingml/2006/picture">
             <wp:extent cx="6080760" cy="3420428"/>
-            <wp:docPr id="63" name="Picture 63"/>
+            <wp:docPr id="60" name="Picture 60"/>
             <wp:cNvGraphicFramePr>
               <a:graphicFrameLocks noChangeAspect="1"/>
             </wp:cNvGraphicFramePr>
@@ -19385,7 +19218,7 @@
               <a:graphicData uri="http://schemas.openxmlformats.org/drawingml/2006/picture">
                 <pic:pic>
                   <pic:nvPicPr>
-                    <pic:cNvPr id="0" name="task11-09-vendor-collected.png"/>
+                    <pic:cNvPr id="0" name="task11-06-diner-preparing.png"/>
                     <pic:cNvPicPr/>
                   </pic:nvPicPr>
                   <pic:blipFill>
@@ -19415,9 +19248,14 @@
         <w:spacing w:after="240"/>
       </w:pPr>
       <w:r>
-        <w:t>Figure F63. task11 09 vendor collected</w:t>
+        <w:t>Figure F60. task11 06 diner preparing</w:t>
         <w:br/>
-        <w:t>Source: docs/evidence/screenshots/task11-09-vendor-collected.png</w:t>
+        <w:t>Source: docs/evidence/screenshots/task11-06-diner-preparing.png</w:t>
+      </w:r>
+    </w:p>
+    <w:p>
+      <w:r>
+        <w:br w:type="page"/>
       </w:r>
     </w:p>
     <w:p>
@@ -19429,7 +19267,7 @@
         <w:drawing>
           <wp:inline xmlns:a="http://schemas.openxmlformats.org/drawingml/2006/main" xmlns:pic="http://schemas.openxmlformats.org/drawingml/2006/picture">
             <wp:extent cx="6080760" cy="3420428"/>
-            <wp:docPr id="64" name="Picture 64"/>
+            <wp:docPr id="61" name="Picture 61"/>
             <wp:cNvGraphicFramePr>
               <a:graphicFrameLocks noChangeAspect="1"/>
             </wp:cNvGraphicFramePr>
@@ -19437,7 +19275,7 @@
               <a:graphicData uri="http://schemas.openxmlformats.org/drawingml/2006/picture">
                 <pic:pic>
                   <pic:nvPicPr>
-                    <pic:cNvPr id="0" name="task11-10-diner-collected.png"/>
+                    <pic:cNvPr id="0" name="task11-07-vendor-ready.png"/>
                     <pic:cNvPicPr/>
                   </pic:nvPicPr>
                   <pic:blipFill>
@@ -19467,14 +19305,9 @@
         <w:spacing w:after="240"/>
       </w:pPr>
       <w:r>
-        <w:t>Figure F64. task11 10 diner collected</w:t>
+        <w:t>Figure F61. task11 07 vendor ready</w:t>
         <w:br/>
-        <w:t>Source: docs/evidence/screenshots/task11-10-diner-collected.png</w:t>
-      </w:r>
-    </w:p>
-    <w:p>
-      <w:r>
-        <w:br w:type="page"/>
+        <w:t>Source: docs/evidence/screenshots/task11-07-vendor-ready.png</w:t>
       </w:r>
     </w:p>
     <w:p>
@@ -19486,7 +19319,7 @@
         <w:drawing>
           <wp:inline xmlns:a="http://schemas.openxmlformats.org/drawingml/2006/main" xmlns:pic="http://schemas.openxmlformats.org/drawingml/2006/picture">
             <wp:extent cx="6080760" cy="3420428"/>
-            <wp:docPr id="65" name="Picture 65"/>
+            <wp:docPr id="62" name="Picture 62"/>
             <wp:cNvGraphicFramePr>
               <a:graphicFrameLocks noChangeAspect="1"/>
             </wp:cNvGraphicFramePr>
@@ -19494,7 +19327,7 @@
               <a:graphicData uri="http://schemas.openxmlformats.org/drawingml/2006/picture">
                 <pic:pic>
                   <pic:nvPicPr>
-                    <pic:cNvPr id="0" name="task11-11-diner-past-list.png"/>
+                    <pic:cNvPr id="0" name="task11-08-diner-ready.png"/>
                     <pic:cNvPicPr/>
                   </pic:nvPicPr>
                   <pic:blipFill>
@@ -19524,6 +19357,172 @@
         <w:spacing w:after="240"/>
       </w:pPr>
       <w:r>
+        <w:t>Figure F62. task11 08 diner ready</w:t>
+        <w:br/>
+        <w:t>Source: docs/evidence/screenshots/task11-08-diner-ready.png</w:t>
+      </w:r>
+    </w:p>
+    <w:p>
+      <w:r>
+        <w:br w:type="page"/>
+      </w:r>
+    </w:p>
+    <w:p>
+      <w:pPr>
+        <w:keepNext/>
+        <w:jc w:val="center"/>
+      </w:pPr>
+      <w:r>
+        <w:drawing>
+          <wp:inline xmlns:a="http://schemas.openxmlformats.org/drawingml/2006/main" xmlns:pic="http://schemas.openxmlformats.org/drawingml/2006/picture">
+            <wp:extent cx="6080760" cy="3420428"/>
+            <wp:docPr id="63" name="Picture 63"/>
+            <wp:cNvGraphicFramePr>
+              <a:graphicFrameLocks noChangeAspect="1"/>
+            </wp:cNvGraphicFramePr>
+            <a:graphic>
+              <a:graphicData uri="http://schemas.openxmlformats.org/drawingml/2006/picture">
+                <pic:pic>
+                  <pic:nvPicPr>
+                    <pic:cNvPr id="0" name="task11-09-vendor-collected.png"/>
+                    <pic:cNvPicPr/>
+                  </pic:nvPicPr>
+                  <pic:blipFill>
+                    <a:blip r:embed="rId80"/>
+                    <a:stretch>
+                      <a:fillRect/>
+                    </a:stretch>
+                  </pic:blipFill>
+                  <pic:spPr>
+                    <a:xfrm>
+                      <a:off x="0" y="0"/>
+                      <a:ext cx="6080760" cy="3420428"/>
+                    </a:xfrm>
+                    <a:prstGeom prst="rect"/>
+                  </pic:spPr>
+                </pic:pic>
+              </a:graphicData>
+            </a:graphic>
+          </wp:inline>
+        </w:drawing>
+      </w:r>
+    </w:p>
+    <w:p>
+      <w:pPr>
+        <w:pStyle w:val="Caption"/>
+        <w:keepLines/>
+        <w:spacing w:after="240"/>
+      </w:pPr>
+      <w:r>
+        <w:t>Figure F63. task11 09 vendor collected</w:t>
+        <w:br/>
+        <w:t>Source: docs/evidence/screenshots/task11-09-vendor-collected.png</w:t>
+      </w:r>
+    </w:p>
+    <w:p>
+      <w:pPr>
+        <w:keepNext/>
+        <w:jc w:val="center"/>
+      </w:pPr>
+      <w:r>
+        <w:drawing>
+          <wp:inline xmlns:a="http://schemas.openxmlformats.org/drawingml/2006/main" xmlns:pic="http://schemas.openxmlformats.org/drawingml/2006/picture">
+            <wp:extent cx="6080760" cy="3420428"/>
+            <wp:docPr id="64" name="Picture 64"/>
+            <wp:cNvGraphicFramePr>
+              <a:graphicFrameLocks noChangeAspect="1"/>
+            </wp:cNvGraphicFramePr>
+            <a:graphic>
+              <a:graphicData uri="http://schemas.openxmlformats.org/drawingml/2006/picture">
+                <pic:pic>
+                  <pic:nvPicPr>
+                    <pic:cNvPr id="0" name="task11-10-diner-collected.png"/>
+                    <pic:cNvPicPr/>
+                  </pic:nvPicPr>
+                  <pic:blipFill>
+                    <a:blip r:embed="rId81"/>
+                    <a:stretch>
+                      <a:fillRect/>
+                    </a:stretch>
+                  </pic:blipFill>
+                  <pic:spPr>
+                    <a:xfrm>
+                      <a:off x="0" y="0"/>
+                      <a:ext cx="6080760" cy="3420428"/>
+                    </a:xfrm>
+                    <a:prstGeom prst="rect"/>
+                  </pic:spPr>
+                </pic:pic>
+              </a:graphicData>
+            </a:graphic>
+          </wp:inline>
+        </w:drawing>
+      </w:r>
+    </w:p>
+    <w:p>
+      <w:pPr>
+        <w:pStyle w:val="Caption"/>
+        <w:keepLines/>
+        <w:spacing w:after="240"/>
+      </w:pPr>
+      <w:r>
+        <w:t>Figure F64. task11 10 diner collected</w:t>
+        <w:br/>
+        <w:t>Source: docs/evidence/screenshots/task11-10-diner-collected.png</w:t>
+      </w:r>
+    </w:p>
+    <w:p>
+      <w:r>
+        <w:br w:type="page"/>
+      </w:r>
+    </w:p>
+    <w:p>
+      <w:pPr>
+        <w:keepNext/>
+        <w:jc w:val="center"/>
+      </w:pPr>
+      <w:r>
+        <w:drawing>
+          <wp:inline xmlns:a="http://schemas.openxmlformats.org/drawingml/2006/main" xmlns:pic="http://schemas.openxmlformats.org/drawingml/2006/picture">
+            <wp:extent cx="6080760" cy="3420428"/>
+            <wp:docPr id="65" name="Picture 65"/>
+            <wp:cNvGraphicFramePr>
+              <a:graphicFrameLocks noChangeAspect="1"/>
+            </wp:cNvGraphicFramePr>
+            <a:graphic>
+              <a:graphicData uri="http://schemas.openxmlformats.org/drawingml/2006/picture">
+                <pic:pic>
+                  <pic:nvPicPr>
+                    <pic:cNvPr id="0" name="task11-11-diner-past-list.png"/>
+                    <pic:cNvPicPr/>
+                  </pic:nvPicPr>
+                  <pic:blipFill>
+                    <a:blip r:embed="rId82"/>
+                    <a:stretch>
+                      <a:fillRect/>
+                    </a:stretch>
+                  </pic:blipFill>
+                  <pic:spPr>
+                    <a:xfrm>
+                      <a:off x="0" y="0"/>
+                      <a:ext cx="6080760" cy="3420428"/>
+                    </a:xfrm>
+                    <a:prstGeom prst="rect"/>
+                  </pic:spPr>
+                </pic:pic>
+              </a:graphicData>
+            </a:graphic>
+          </wp:inline>
+        </w:drawing>
+      </w:r>
+    </w:p>
+    <w:p>
+      <w:pPr>
+        <w:pStyle w:val="Caption"/>
+        <w:keepLines/>
+        <w:spacing w:after="240"/>
+      </w:pPr>
+      <w:r>
         <w:t>Figure F65. task11 11 diner past list</w:t>
         <w:br/>
         <w:t>Source: docs/evidence/screenshots/task11-11-diner-past-list.png</w:t>
@@ -20064,7 +20063,7 @@
         </w:rPr>
         <w:t xml:space="preserve">, and passed the same tests. Final frontend/browser checks and their actual outcomes are recorded in </w:t>
       </w:r>
-      <w:hyperlink r:id="rId80">
+      <w:hyperlink r:id="rId83">
         <w:r>
           <w:rPr>
             <w:color w:val="174469"/>
@@ -20372,7 +20371,7 @@
         </w:rPr>
         <w:t xml:space="preserve">Output used: the prospective </w:t>
       </w:r>
-      <w:hyperlink r:id="rId81">
+      <w:hyperlink r:id="rId84">
         <w:r>
           <w:rPr>
             <w:color w:val="174469"/>
@@ -20437,7 +20436,7 @@
         </w:rPr>
         <w:t xml:space="preserve">Output used: six reviewed personal Qwen skills, persistent workspace/backend/frontend QWEN.md briefings, isolated document/video helper dependencies, an updated implementation handoff and a </w:t>
       </w:r>
-      <w:hyperlink r:id="rId82">
+      <w:hyperlink r:id="rId85">
         <w:r>
           <w:rPr>
             <w:color w:val="174469"/>
@@ -21881,7 +21880,7 @@
         </w:rPr>
         <w:t xml:space="preserve">The two planning requests below generated/reviewed planning text only. Subsequent request metadata and the available current plaintext requests are in </w:t>
       </w:r>
-      <w:hyperlink r:id="rId83">
+      <w:hyperlink r:id="rId86">
         <w:r>
           <w:rPr>
             <w:color w:val="174469"/>
@@ -22572,6 +22571,92 @@
       </w:r>
     </w:p>
     <w:p>
+      <w:pPr>
+        <w:pStyle w:val="Heading2"/>
+      </w:pPr>
+      <w:r>
+        <w:rPr>
+          <w:b w:val="0"/>
+          <w:i w:val="0"/>
+        </w:rPr>
+        <w:t>P18 — Q7(a): narrated live video production</w:t>
+      </w:r>
+    </w:p>
+    <w:p>
+      <w:pPr/>
+      <w:r>
+        <w:rPr>
+          <w:b w:val="0"/>
+          <w:i w:val="0"/>
+        </w:rPr>
+        <w:t>Exact user prompt:</w:t>
+      </w:r>
+    </w:p>
+    <w:p>
+      <w:pPr>
+        <w:spacing w:after="0" w:line="240" w:lineRule="auto"/>
+      </w:pPr>
+      <w:r>
+        <w:rPr>
+          <w:rFonts w:ascii="Courier New" w:hAnsi="Courier New"/>
+          <w:sz w:val="16"/>
+        </w:rPr>
+        <w:t>can you do a video demo for me covering evrrythung</w:t>
+      </w:r>
+    </w:p>
+    <w:p>
+      <w:pPr/>
+      <w:r>
+        <w:rPr>
+          <w:b w:val="0"/>
+          <w:i w:val="0"/>
+        </w:rPr>
+        <w:t xml:space="preserve">Codex produced the local </w:t>
+      </w:r>
+      <w:r>
+        <w:rPr>
+          <w:rFonts w:ascii="Courier New" w:hAnsi="Courier New"/>
+          <w:b w:val="0"/>
+          <w:i w:val="0"/>
+          <w:sz w:val="18"/>
+        </w:rPr>
+        <w:t>q7-screencast/screencast.mp4</w:t>
+      </w:r>
+      <w:r>
+        <w:rPr>
+          <w:b w:val="0"/>
+          <w:i w:val="0"/>
+        </w:rPr>
+        <w:t xml:space="preserve"> and its narration, captions, chapter list, capture/encoding sources and verification records. Browser actions use Playwright against the actual React/Flask/MongoDB application, with both roles signing in through separate browser sessions. The voice is computer-generated macOS Samantha, not the student's voice; opening/closing narration and a persistent on-screen label disclose both synthesized speech and automation. Expected outcomes are spoken in separate beats before both vendor-side changes. All elapsed capture intervals, polling and the deliberate simulated-payment failure/retry are retained. The final evidence slides summarize the earlier retained October 7 tests/load results, clearly labelled; no assessed suite or new load measurement was run for this video. No subagent was used.</w:t>
+      </w:r>
+    </w:p>
+    <w:p>
+      <w:pPr/>
+      <w:r>
+        <w:rPr>
+          <w:b w:val="0"/>
+          <w:i w:val="0"/>
+        </w:rPr>
+        <w:t xml:space="preserve">Fresh verification: 30 live chapters completed, all recorded UI assertions passed, both checkout refusals created no additional order, and the original guarded fixtures were restored exactly (2 vendors / 6 users / 5 items / 2 carts / 9 orders). Full MP4 audio/video decode exited zero: H.264/AAC, 1280×720, 6:26, 7,926,270 bytes, audio mean −16.1 dB. Thirty rendered chapter previews were visually reviewed. Speech contains 1,009 words; separate captions use proportional word timing, not forced alignment. The first encoder attempt failed when copying protected macOS font metadata; the failure is preserved in </w:t>
+      </w:r>
+      <w:r>
+        <w:rPr>
+          <w:rFonts w:ascii="Courier New" w:hAnsi="Courier New"/>
+          <w:b w:val="0"/>
+          <w:i w:val="0"/>
+          <w:sz w:val="18"/>
+        </w:rPr>
+        <w:t>video-encoding-first-failure.log</w:t>
+      </w:r>
+      <w:r>
+        <w:rPr>
+          <w:b w:val="0"/>
+          <w:i w:val="0"/>
+        </w:rPr>
+        <w:t>. Copying font bytes instead fixed encoding, without editing or repeating the successful UI take. Both READMEs, report source and handover link the local artifact and disclose its production. The DOCX/PDF were regenerated after this disclosure. Student review, missing personal inputs and historical prompt exports, authorized publishing, outside-owner playback/access and Canvas submission remain pending. No voice imitation, invented test results, hidden UI errors, push or submission is claimed.</w:t>
+      </w:r>
+    </w:p>
+    <w:p>
       <w:r>
         <w:br w:type="page"/>
       </w:r>
@@ -22607,7 +22692,7 @@
         </w:rPr>
         <w:t xml:space="preserve">The retained plaintext planning requests A01/A02 and their follow-up are in </w:t>
       </w:r>
-      <w:hyperlink r:id="rId84">
+      <w:hyperlink r:id="rId87">
         <w:r>
           <w:rPr>
             <w:color w:val="174469"/>
@@ -26072,7 +26157,7 @@
           <w:b w:val="0"/>
           <w:i w:val="0"/>
         </w:rPr>
-        <w:t>User instruction: “could u continue where qwen agent has left off?” Publishing, submission and narrated recording remain outside this continuation's authorized scope.</w:t>
+        <w:t>User instruction: “could u continue where qwen agent has left off?” Publishing, submission and narrated recording were initially outside that continuation's scope. The later video request authorizes a local recording, documented below.</w:t>
       </w:r>
     </w:p>
     <w:p>
@@ -27791,7 +27876,7 @@
           <w:b w:val="0"/>
           <w:i w:val="0"/>
         </w:rPr>
-        <w:t>Record a narrated MP4 of at most eight minutes at 720p following the script. Verify actual duration, resolution, MP4 encoding and file size; a script, screenshots or silent footage is not that deliverable. Add the accessible video link to the report and both READMEs.</w:t>
+        <w:t>Review the completed local MP4, which uses disclosed computer-generated narration and automated live UI actions. Choose it or a personally narrated replacement. Marker playback/access still needs checking after authorized publication; the local video is linked in the report and both READMEs.</w:t>
       </w:r>
     </w:p>
     <w:p>
@@ -27894,6 +27979,84 @@
           <w:i w:val="0"/>
         </w:rPr>
         <w:t xml:space="preserve"> for exact proof and measurement limits. This stage changes no product dependency or installation prerequisite; the earlier independent clean-clone installation evidence remains historical, and current app behaviour was verified from the working repositories. Human actions and publishing boundaries remain unchanged.</w:t>
+      </w:r>
+    </w:p>
+    <w:p>
+      <w:pPr>
+        <w:pStyle w:val="Heading2"/>
+      </w:pPr>
+      <w:r>
+        <w:rPr>
+          <w:b w:val="0"/>
+          <w:i w:val="0"/>
+        </w:rPr>
+        <w:t>Subsequent narrated video production</w:t>
+      </w:r>
+    </w:p>
+    <w:p>
+      <w:pPr/>
+      <w:r>
+        <w:rPr>
+          <w:b w:val="0"/>
+          <w:i w:val="0"/>
+        </w:rPr>
+        <w:t xml:space="preserve">The user requested a complete video demonstration (P18). </w:t>
+      </w:r>
+      <w:r>
+        <w:rPr>
+          <w:rFonts w:ascii="Courier New" w:hAnsi="Courier New"/>
+          <w:b w:val="0"/>
+          <w:i w:val="0"/>
+          <w:sz w:val="18"/>
+        </w:rPr>
+        <w:t>q7-screencast/screencast.mp4</w:t>
+      </w:r>
+      <w:r>
+        <w:rPr>
+          <w:b w:val="0"/>
+          <w:i w:val="0"/>
+        </w:rPr>
+        <w:t xml:space="preserve"> is now a verified </w:t>
+      </w:r>
+      <w:r>
+        <w:rPr>
+          <w:b/>
+          <w:i w:val="0"/>
+        </w:rPr>
+        <w:t>6:26, 1280×720, 7,926,270-byte H.264/AAC MP4</w:t>
+      </w:r>
+      <w:r>
+        <w:rPr>
+          <w:b w:val="0"/>
+          <w:i w:val="0"/>
+        </w:rPr>
+        <w:t>, with burned-in captions and separate SRT. It records actual automated browser actions, with disclosed computer-generated Samantha speech. Thirty chapters cover both sign-ins, the same new order through collection, both expected outcomes spoken before vendor changes, both visible checkout refusals and retained carts, payment failure/retry, history snapshots, vendor CRUD, cancellation/refund and a seeded older Ready order becoming NoShow. The final evidence slides explicitly summarize earlier retained results. No assessed suite was rerun for this video.</w:t>
+      </w:r>
+    </w:p>
+    <w:p>
+      <w:pPr/>
+      <w:r>
+        <w:rPr>
+          <w:b w:val="0"/>
+          <w:i w:val="0"/>
+        </w:rPr>
+        <w:t xml:space="preserve">All live UI assertions passed. Full audio/video decoding exited zero; rendered previews from all 30 chapters were inspected. Both expectations precede the rule-breaking vendor actions in the actual timeline. No elapsed capture time, error or retry was removed. The first encoder attempt failed on macOS protected font metadata; that failure is retained, and copying font bytes fixed it without re-recording or trimming. Only this take’s guarded fixture changes and created documents were restored/removed; canonical counts are 2/6/5/2/9 and original fixture equality passed. Production sources, narration, timestamp ledger and verification are under </w:t>
+      </w:r>
+      <w:r>
+        <w:rPr>
+          <w:rFonts w:ascii="Courier New" w:hAnsi="Courier New"/>
+          <w:b w:val="0"/>
+          <w:i w:val="0"/>
+          <w:sz w:val="18"/>
+        </w:rPr>
+        <w:t>q7-screencast/</w:t>
+      </w:r>
+      <w:r>
+        <w:rPr>
+          <w:b w:val="0"/>
+          <w:i w:val="0"/>
+        </w:rPr>
+        <w:t>. Student review, personal cover inputs, missing historical prompt exports, publication/access and submission remain pending. Nothing was pushed or submitted.</w:t>
       </w:r>
     </w:p>
     <w:sectPr>

</xml_diff>

<commit_message>
docs: align published assignment links and reports with main
</commit_message>
<xml_diff>
--- a/docs/report/SkipQ_Report_Draft.docx
+++ b/docs/report/SkipQ_Report_Draft.docx
@@ -1599,7 +1599,38 @@
           <w:b w:val="0"/>
           <w:i w:val="0"/>
         </w:rPr>
-        <w:t>). Student review, authorized publication and outside-owner playback/access checks remain pending.</w:t>
+        <w:t xml:space="preserve">). Both repositories are published on default </w:t>
+      </w:r>
+      <w:r>
+        <w:rPr>
+          <w:rFonts w:ascii="Courier New" w:hAnsi="Courier New"/>
+          <w:b w:val="0"/>
+          <w:i w:val="0"/>
+          <w:sz w:val="18"/>
+        </w:rPr>
+        <w:t>main</w:t>
+      </w:r>
+      <w:r>
+        <w:rPr>
+          <w:b w:val="0"/>
+          <w:i w:val="0"/>
+        </w:rPr>
+        <w:t xml:space="preserve">; </w:t>
+      </w:r>
+      <w:hyperlink r:id="rId14">
+        <w:r>
+          <w:rPr>
+            <w:color w:val="174469"/>
+          </w:rPr>
+          <w:t>anonymous access checks</w:t>
+        </w:r>
+      </w:hyperlink>
+      <w:r>
+        <w:rPr>
+          <w:b w:val="0"/>
+          <w:i w:val="0"/>
+        </w:rPr>
+        <w:t xml:space="preserve"> verified public repository pages and the complete video download, whose bytes match the decoded MP4. Student video review and submission remain pending.</w:t>
       </w:r>
     </w:p>
     <w:p>
@@ -6128,7 +6159,7 @@
         </w:rPr>
         <w:t xml:space="preserve">Backend source: </w:t>
       </w:r>
-      <w:hyperlink r:id="rId14">
+      <w:hyperlink r:id="rId15">
         <w:r>
           <w:rPr>
             <w:color w:val="174469"/>
@@ -6259,7 +6290,7 @@
         </w:rPr>
         <w:t xml:space="preserve">Frontend source: </w:t>
       </w:r>
-      <w:hyperlink r:id="rId15">
+      <w:hyperlink r:id="rId16">
         <w:r>
           <w:rPr>
             <w:color w:val="174469"/>
@@ -7097,7 +7128,7 @@
         </w:rPr>
         <w:t xml:space="preserve">Foundation error handling follows the response-preserving pattern in the </w:t>
       </w:r>
-      <w:hyperlink r:id="rId16">
+      <w:hyperlink r:id="rId17">
         <w:r>
           <w:rPr>
             <w:color w:val="174469"/>
@@ -7112,7 +7143,7 @@
         </w:rPr>
         <w:t xml:space="preserve">. Explicit fixture teardown follows </w:t>
       </w:r>
-      <w:hyperlink r:id="rId17">
+      <w:hyperlink r:id="rId18">
         <w:r>
           <w:rPr>
             <w:color w:val="174469"/>
@@ -16006,58 +16037,6 @@
                 <pic:pic>
                   <pic:nvPicPr>
                     <pic:cNvPr id="0" name="task7-01-login.png"/>
-                    <pic:cNvPicPr/>
-                  </pic:nvPicPr>
-                  <pic:blipFill>
-                    <a:blip r:embed="rId18"/>
-                    <a:stretch>
-                      <a:fillRect/>
-                    </a:stretch>
-                  </pic:blipFill>
-                  <pic:spPr>
-                    <a:xfrm>
-                      <a:off x="0" y="0"/>
-                      <a:ext cx="6080760" cy="3420428"/>
-                    </a:xfrm>
-                    <a:prstGeom prst="rect"/>
-                  </pic:spPr>
-                </pic:pic>
-              </a:graphicData>
-            </a:graphic>
-          </wp:inline>
-        </w:drawing>
-      </w:r>
-    </w:p>
-    <w:p>
-      <w:pPr>
-        <w:pStyle w:val="Caption"/>
-        <w:keepLines/>
-        <w:spacing w:after="240"/>
-      </w:pPr>
-      <w:r>
-        <w:t>Figure F1. task7 01 login</w:t>
-        <w:br/>
-        <w:t>Source: docs/evidence/screenshots/task7-01-login.png</w:t>
-      </w:r>
-    </w:p>
-    <w:p>
-      <w:pPr>
-        <w:keepNext/>
-        <w:jc w:val="center"/>
-      </w:pPr>
-      <w:r>
-        <w:drawing>
-          <wp:inline xmlns:a="http://schemas.openxmlformats.org/drawingml/2006/main" xmlns:pic="http://schemas.openxmlformats.org/drawingml/2006/picture">
-            <wp:extent cx="6080760" cy="3420428"/>
-            <wp:docPr id="2" name="Picture 2"/>
-            <wp:cNvGraphicFramePr>
-              <a:graphicFrameLocks noChangeAspect="1"/>
-            </wp:cNvGraphicFramePr>
-            <a:graphic>
-              <a:graphicData uri="http://schemas.openxmlformats.org/drawingml/2006/picture">
-                <pic:pic>
-                  <pic:nvPicPr>
-                    <pic:cNvPr id="0" name="task8-01-stalls.png"/>
                     <pic:cNvPicPr/>
                   </pic:nvPicPr>
                   <pic:blipFill>
@@ -16087,14 +16066,9 @@
         <w:spacing w:after="240"/>
       </w:pPr>
       <w:r>
-        <w:t>Figure F2. Diner login lands on the open-stall list (Charcoal Grill, Open)</w:t>
+        <w:t>Figure F1. task7 01 login</w:t>
         <w:br/>
-        <w:t>Source: docs/evidence/screenshots/task8-01-stalls.png</w:t>
-      </w:r>
-    </w:p>
-    <w:p>
-      <w:r>
-        <w:br w:type="page"/>
+        <w:t>Source: docs/evidence/screenshots/task7-01-login.png</w:t>
       </w:r>
     </w:p>
     <w:p>
@@ -16106,7 +16080,7 @@
         <w:drawing>
           <wp:inline xmlns:a="http://schemas.openxmlformats.org/drawingml/2006/main" xmlns:pic="http://schemas.openxmlformats.org/drawingml/2006/picture">
             <wp:extent cx="6080760" cy="3420428"/>
-            <wp:docPr id="3" name="Picture 3"/>
+            <wp:docPr id="2" name="Picture 2"/>
             <wp:cNvGraphicFramePr>
               <a:graphicFrameLocks noChangeAspect="1"/>
             </wp:cNvGraphicFramePr>
@@ -16114,7 +16088,7 @@
               <a:graphicData uri="http://schemas.openxmlformats.org/drawingml/2006/picture">
                 <pic:pic>
                   <pic:nvPicPr>
-                    <pic:cNvPr id="0" name="task8-02-menu-sold-out.png"/>
+                    <pic:cNvPr id="0" name="task8-01-stalls.png"/>
                     <pic:cNvPicPr/>
                   </pic:nvPicPr>
                   <pic:blipFill>
@@ -16144,9 +16118,14 @@
         <w:spacing w:after="240"/>
       </w:pPr>
       <w:r>
-        <w:t>Figure F3. Seeded sold-out Pineapple Tart greyed with the disabled "Sold out" control</w:t>
+        <w:t>Figure F2. Diner login lands on the open-stall list (Charcoal Grill, Open)</w:t>
         <w:br/>
-        <w:t>Source: docs/evidence/screenshots/task8-02-menu-sold-out.png</w:t>
+        <w:t>Source: docs/evidence/screenshots/task8-01-stalls.png</w:t>
+      </w:r>
+    </w:p>
+    <w:p>
+      <w:r>
+        <w:br w:type="page"/>
       </w:r>
     </w:p>
     <w:p>
@@ -16158,7 +16137,7 @@
         <w:drawing>
           <wp:inline xmlns:a="http://schemas.openxmlformats.org/drawingml/2006/main" xmlns:pic="http://schemas.openxmlformats.org/drawingml/2006/picture">
             <wp:extent cx="6080760" cy="3420428"/>
-            <wp:docPr id="4" name="Picture 4"/>
+            <wp:docPr id="3" name="Picture 3"/>
             <wp:cNvGraphicFramePr>
               <a:graphicFrameLocks noChangeAspect="1"/>
             </wp:cNvGraphicFramePr>
@@ -16166,7 +16145,7 @@
               <a:graphicData uri="http://schemas.openxmlformats.org/drawingml/2006/picture">
                 <pic:pic>
                   <pic:nvPicPr>
-                    <pic:cNvPr id="0" name="task8-03-sold-out-toast.png"/>
+                    <pic:cNvPr id="0" name="task8-02-menu-sold-out.png"/>
                     <pic:cNvPicPr/>
                   </pic:nvPicPr>
                   <pic:blipFill>
@@ -16196,14 +16175,9 @@
         <w:spacing w:after="240"/>
       </w:pPr>
       <w:r>
-        <w:t>Figure F4. Toast for the newly observed sold-out change, menu still listing the item</w:t>
+        <w:t>Figure F3. Seeded sold-out Pineapple Tart greyed with the disabled "Sold out" control</w:t>
         <w:br/>
-        <w:t>Source: docs/evidence/screenshots/task8-03-sold-out-toast.png</w:t>
-      </w:r>
-    </w:p>
-    <w:p>
-      <w:r>
-        <w:br w:type="page"/>
+        <w:t>Source: docs/evidence/screenshots/task8-02-menu-sold-out.png</w:t>
       </w:r>
     </w:p>
     <w:p>
@@ -16215,7 +16189,7 @@
         <w:drawing>
           <wp:inline xmlns:a="http://schemas.openxmlformats.org/drawingml/2006/main" xmlns:pic="http://schemas.openxmlformats.org/drawingml/2006/picture">
             <wp:extent cx="6080760" cy="3420428"/>
-            <wp:docPr id="5" name="Picture 5"/>
+            <wp:docPr id="4" name="Picture 4"/>
             <wp:cNvGraphicFramePr>
               <a:graphicFrameLocks noChangeAspect="1"/>
             </wp:cNvGraphicFramePr>
@@ -16223,7 +16197,7 @@
               <a:graphicData uri="http://schemas.openxmlformats.org/drawingml/2006/picture">
                 <pic:pic>
                   <pic:nvPicPr>
-                    <pic:cNvPr id="0" name="task8-04-menu-after-add.png"/>
+                    <pic:cNvPr id="0" name="task8-03-sold-out-toast.png"/>
                     <pic:cNvPicPr/>
                   </pic:nvPicPr>
                   <pic:blipFill>
@@ -16253,9 +16227,14 @@
         <w:spacing w:after="240"/>
       </w:pPr>
       <w:r>
-        <w:t>Figure F5. "Add another (in cart: 2)" increment confirmed; cart total card $22.00</w:t>
+        <w:t>Figure F4. Toast for the newly observed sold-out change, menu still listing the item</w:t>
         <w:br/>
-        <w:t>Source: docs/evidence/screenshots/task8-04-menu-after-add.png</w:t>
+        <w:t>Source: docs/evidence/screenshots/task8-03-sold-out-toast.png</w:t>
+      </w:r>
+    </w:p>
+    <w:p>
+      <w:r>
+        <w:br w:type="page"/>
       </w:r>
     </w:p>
     <w:p>
@@ -16267,7 +16246,7 @@
         <w:drawing>
           <wp:inline xmlns:a="http://schemas.openxmlformats.org/drawingml/2006/main" xmlns:pic="http://schemas.openxmlformats.org/drawingml/2006/picture">
             <wp:extent cx="6080760" cy="3420428"/>
-            <wp:docPr id="6" name="Picture 6"/>
+            <wp:docPr id="5" name="Picture 5"/>
             <wp:cNvGraphicFramePr>
               <a:graphicFrameLocks noChangeAspect="1"/>
             </wp:cNvGraphicFramePr>
@@ -16275,7 +16254,7 @@
               <a:graphicData uri="http://schemas.openxmlformats.org/drawingml/2006/picture">
                 <pic:pic>
                   <pic:nvPicPr>
-                    <pic:cNvPr id="0" name="task8-05-cart-edited.png"/>
+                    <pic:cNvPr id="0" name="task8-04-menu-after-add.png"/>
                     <pic:cNvPicPr/>
                   </pic:nvPicPr>
                   <pic:blipFill>
@@ -16305,14 +16284,9 @@
         <w:spacing w:after="240"/>
       </w:pPr>
       <w:r>
-        <w:t>Figure F6. Cart after stepper/removal edits: 2× M1, total $13.00, server-computed total</w:t>
+        <w:t>Figure F5. "Add another (in cart: 2)" increment confirmed; cart total card $22.00</w:t>
         <w:br/>
-        <w:t>Source: docs/evidence/screenshots/task8-05-cart-edited.png</w:t>
-      </w:r>
-    </w:p>
-    <w:p>
-      <w:r>
-        <w:br w:type="page"/>
+        <w:t>Source: docs/evidence/screenshots/task8-04-menu-after-add.png</w:t>
       </w:r>
     </w:p>
     <w:p>
@@ -16324,7 +16298,7 @@
         <w:drawing>
           <wp:inline xmlns:a="http://schemas.openxmlformats.org/drawingml/2006/main" xmlns:pic="http://schemas.openxmlformats.org/drawingml/2006/picture">
             <wp:extent cx="6080760" cy="3420428"/>
-            <wp:docPr id="7" name="Picture 7"/>
+            <wp:docPr id="6" name="Picture 6"/>
             <wp:cNvGraphicFramePr>
               <a:graphicFrameLocks noChangeAspect="1"/>
             </wp:cNvGraphicFramePr>
@@ -16332,7 +16306,7 @@
               <a:graphicData uri="http://schemas.openxmlformats.org/drawingml/2006/picture">
                 <pic:pic>
                   <pic:nvPicPr>
-                    <pic:cNvPr id="0" name="task8-06-checkout.png"/>
+                    <pic:cNvPr id="0" name="task8-05-cart-edited.png"/>
                     <pic:cNvPicPr/>
                   </pic:nvPicPr>
                   <pic:blipFill>
@@ -16362,9 +16336,14 @@
         <w:spacing w:after="240"/>
       </w:pPr>
       <w:r>
-        <w:t>Figure F7. Checkout summary, payable total, PayNow selected; fingerprint remains internal</w:t>
+        <w:t>Figure F6. Cart after stepper/removal edits: 2× M1, total $13.00, server-computed total</w:t>
         <w:br/>
-        <w:t>Source: docs/evidence/screenshots/task8-06-checkout.png</w:t>
+        <w:t>Source: docs/evidence/screenshots/task8-05-cart-edited.png</w:t>
+      </w:r>
+    </w:p>
+    <w:p>
+      <w:r>
+        <w:br w:type="page"/>
       </w:r>
     </w:p>
     <w:p>
@@ -16376,7 +16355,7 @@
         <w:drawing>
           <wp:inline xmlns:a="http://schemas.openxmlformats.org/drawingml/2006/main" xmlns:pic="http://schemas.openxmlformats.org/drawingml/2006/picture">
             <wp:extent cx="6080760" cy="3420428"/>
-            <wp:docPr id="8" name="Picture 8"/>
+            <wp:docPr id="7" name="Picture 7"/>
             <wp:cNvGraphicFramePr>
               <a:graphicFrameLocks noChangeAspect="1"/>
             </wp:cNvGraphicFramePr>
@@ -16384,7 +16363,7 @@
               <a:graphicData uri="http://schemas.openxmlformats.org/drawingml/2006/picture">
                 <pic:pic>
                   <pic:nvPicPr>
-                    <pic:cNvPr id="0" name="task8-07-checkout-stale-refused.png"/>
+                    <pic:cNvPr id="0" name="task8-06-checkout.png"/>
                     <pic:cNvPicPr/>
                   </pic:nvPicPr>
                   <pic:blipFill>
@@ -16414,14 +16393,9 @@
         <w:spacing w:after="240"/>
       </w:pPr>
       <w:r>
-        <w:t>Figure F8. Stale-cart refusal ("Your cart total changed since it was loaded…") with Review / Refresh-and-retry and the retained-key notice</w:t>
+        <w:t>Figure F7. Checkout summary, payable total, PayNow selected; fingerprint remains internal</w:t>
         <w:br/>
-        <w:t>Source: docs/evidence/screenshots/task8-07-checkout-stale-refused.png</w:t>
-      </w:r>
-    </w:p>
-    <w:p>
-      <w:r>
-        <w:br w:type="page"/>
+        <w:t>Source: docs/evidence/screenshots/task8-06-checkout.png</w:t>
       </w:r>
     </w:p>
     <w:p>
@@ -16433,7 +16407,7 @@
         <w:drawing>
           <wp:inline xmlns:a="http://schemas.openxmlformats.org/drawingml/2006/main" xmlns:pic="http://schemas.openxmlformats.org/drawingml/2006/picture">
             <wp:extent cx="6080760" cy="3420428"/>
-            <wp:docPr id="9" name="Picture 9"/>
+            <wp:docPr id="8" name="Picture 8"/>
             <wp:cNvGraphicFramePr>
               <a:graphicFrameLocks noChangeAspect="1"/>
             </wp:cNvGraphicFramePr>
@@ -16441,7 +16415,7 @@
               <a:graphicData uri="http://schemas.openxmlformats.org/drawingml/2006/picture">
                 <pic:pic>
                   <pic:nvPicPr>
-                    <pic:cNvPr id="0" name="task8-08-checkout-success.png"/>
+                    <pic:cNvPr id="0" name="task8-07-checkout-stale-refused.png"/>
                     <pic:cNvPicPr/>
                   </pic:nvPicPr>
                   <pic:blipFill>
@@ -16471,9 +16445,14 @@
         <w:spacing w:after="240"/>
       </w:pPr>
       <w:r>
-        <w:t>Figure F9. Payment successful: queue number, order id, Pending, PayNow Paid, $14.50</w:t>
+        <w:t>Figure F8. Stale-cart refusal ("Your cart total changed since it was loaded…") with Review / Refresh-and-retry and the retained-key notice</w:t>
         <w:br/>
-        <w:t>Source: docs/evidence/screenshots/task8-08-checkout-success.png</w:t>
+        <w:t>Source: docs/evidence/screenshots/task8-07-checkout-stale-refused.png</w:t>
+      </w:r>
+    </w:p>
+    <w:p>
+      <w:r>
+        <w:br w:type="page"/>
       </w:r>
     </w:p>
     <w:p>
@@ -16485,7 +16464,7 @@
         <w:drawing>
           <wp:inline xmlns:a="http://schemas.openxmlformats.org/drawingml/2006/main" xmlns:pic="http://schemas.openxmlformats.org/drawingml/2006/picture">
             <wp:extent cx="6080760" cy="3420428"/>
-            <wp:docPr id="10" name="Picture 10"/>
+            <wp:docPr id="9" name="Picture 9"/>
             <wp:cNvGraphicFramePr>
               <a:graphicFrameLocks noChangeAspect="1"/>
             </wp:cNvGraphicFramePr>
@@ -16493,7 +16472,7 @@
               <a:graphicData uri="http://schemas.openxmlformats.org/drawingml/2006/picture">
                 <pic:pic>
                   <pic:nvPicPr>
-                    <pic:cNvPr id="0" name="task8-09-tracking-pending.png"/>
+                    <pic:cNvPr id="0" name="task8-08-checkout-success.png"/>
                     <pic:cNvPicPr/>
                   </pic:nvPicPr>
                   <pic:blipFill>
@@ -16523,14 +16502,9 @@
         <w:spacing w:after="240"/>
       </w:pPr>
       <w:r>
-        <w:t>Figure F10. Tracking page: queue number, Pending badge, snapshot lines, payment state</w:t>
+        <w:t>Figure F9. Payment successful: queue number, order id, Pending, PayNow Paid, $14.50</w:t>
         <w:br/>
-        <w:t>Source: docs/evidence/screenshots/task8-09-tracking-pending.png</w:t>
-      </w:r>
-    </w:p>
-    <w:p>
-      <w:r>
-        <w:br w:type="page"/>
+        <w:t>Source: docs/evidence/screenshots/task8-08-checkout-success.png</w:t>
       </w:r>
     </w:p>
     <w:p>
@@ -16542,7 +16516,7 @@
         <w:drawing>
           <wp:inline xmlns:a="http://schemas.openxmlformats.org/drawingml/2006/main" xmlns:pic="http://schemas.openxmlformats.org/drawingml/2006/picture">
             <wp:extent cx="6080760" cy="3420428"/>
-            <wp:docPr id="11" name="Picture 11"/>
+            <wp:docPr id="10" name="Picture 10"/>
             <wp:cNvGraphicFramePr>
               <a:graphicFrameLocks noChangeAspect="1"/>
             </wp:cNvGraphicFramePr>
@@ -16550,7 +16524,7 @@
               <a:graphicData uri="http://schemas.openxmlformats.org/drawingml/2006/picture">
                 <pic:pic>
                   <pic:nvPicPr>
-                    <pic:cNvPr id="0" name="task8-10-tracking-ready.png"/>
+                    <pic:cNvPr id="0" name="task8-09-tracking-pending.png"/>
                     <pic:cNvPicPr/>
                   </pic:nvPicPr>
                   <pic:blipFill>
@@ -16580,9 +16554,14 @@
         <w:spacing w:after="240"/>
       </w:pPr>
       <w:r>
-        <w:t>Figure F11. Ready badge with the green "Your order is ready. Collect it at the counter." banner</w:t>
+        <w:t>Figure F10. Tracking page: queue number, Pending badge, snapshot lines, payment state</w:t>
         <w:br/>
-        <w:t>Source: docs/evidence/screenshots/task8-10-tracking-ready.png</w:t>
+        <w:t>Source: docs/evidence/screenshots/task8-09-tracking-pending.png</w:t>
+      </w:r>
+    </w:p>
+    <w:p>
+      <w:r>
+        <w:br w:type="page"/>
       </w:r>
     </w:p>
     <w:p>
@@ -16594,7 +16573,7 @@
         <w:drawing>
           <wp:inline xmlns:a="http://schemas.openxmlformats.org/drawingml/2006/main" xmlns:pic="http://schemas.openxmlformats.org/drawingml/2006/picture">
             <wp:extent cx="6080760" cy="3420428"/>
-            <wp:docPr id="12" name="Picture 12"/>
+            <wp:docPr id="11" name="Picture 11"/>
             <wp:cNvGraphicFramePr>
               <a:graphicFrameLocks noChangeAspect="1"/>
             </wp:cNvGraphicFramePr>
@@ -16602,7 +16581,7 @@
               <a:graphicData uri="http://schemas.openxmlformats.org/drawingml/2006/picture">
                 <pic:pic>
                   <pic:nvPicPr>
-                    <pic:cNvPr id="0" name="task8-11-tracking-collected.png"/>
+                    <pic:cNvPr id="0" name="task8-10-tracking-ready.png"/>
                     <pic:cNvPicPr/>
                   </pic:nvPicPr>
                   <pic:blipFill>
@@ -16632,14 +16611,9 @@
         <w:spacing w:after="240"/>
       </w:pPr>
       <w:r>
-        <w:t>Figure F12. Terminal Collected notice (polling now stopped)</w:t>
+        <w:t>Figure F11. Ready badge with the green "Your order is ready. Collect it at the counter." banner</w:t>
         <w:br/>
-        <w:t>Source: docs/evidence/screenshots/task8-11-tracking-collected.png</w:t>
-      </w:r>
-    </w:p>
-    <w:p>
-      <w:r>
-        <w:br w:type="page"/>
+        <w:t>Source: docs/evidence/screenshots/task8-10-tracking-ready.png</w:t>
       </w:r>
     </w:p>
     <w:p>
@@ -16651,7 +16625,7 @@
         <w:drawing>
           <wp:inline xmlns:a="http://schemas.openxmlformats.org/drawingml/2006/main" xmlns:pic="http://schemas.openxmlformats.org/drawingml/2006/picture">
             <wp:extent cx="6080760" cy="3420428"/>
-            <wp:docPr id="13" name="Picture 13"/>
+            <wp:docPr id="12" name="Picture 12"/>
             <wp:cNvGraphicFramePr>
               <a:graphicFrameLocks noChangeAspect="1"/>
             </wp:cNvGraphicFramePr>
@@ -16659,7 +16633,7 @@
               <a:graphicData uri="http://schemas.openxmlformats.org/drawingml/2006/picture">
                 <pic:pic>
                   <pic:nvPicPr>
-                    <pic:cNvPr id="0" name="task8-12-payment-failed.png"/>
+                    <pic:cNvPr id="0" name="task8-11-tracking-collected.png"/>
                     <pic:cNvPicPr/>
                   </pic:nvPicPr>
                   <pic:blipFill>
@@ -16689,9 +16663,14 @@
         <w:spacing w:after="240"/>
       </w:pPr>
       <w:r>
-        <w:t>Figure F13. Simulated payment failure with the retained-checkout-key retry notice</w:t>
+        <w:t>Figure F12. Terminal Collected notice (polling now stopped)</w:t>
         <w:br/>
-        <w:t>Source: docs/evidence/screenshots/task8-12-payment-failed.png</w:t>
+        <w:t>Source: docs/evidence/screenshots/task8-11-tracking-collected.png</w:t>
+      </w:r>
+    </w:p>
+    <w:p>
+      <w:r>
+        <w:br w:type="page"/>
       </w:r>
     </w:p>
     <w:p>
@@ -16703,7 +16682,7 @@
         <w:drawing>
           <wp:inline xmlns:a="http://schemas.openxmlformats.org/drawingml/2006/main" xmlns:pic="http://schemas.openxmlformats.org/drawingml/2006/picture">
             <wp:extent cx="6080760" cy="3420428"/>
-            <wp:docPr id="14" name="Picture 14"/>
+            <wp:docPr id="13" name="Picture 13"/>
             <wp:cNvGraphicFramePr>
               <a:graphicFrameLocks noChangeAspect="1"/>
             </wp:cNvGraphicFramePr>
@@ -16711,7 +16690,7 @@
               <a:graphicData uri="http://schemas.openxmlformats.org/drawingml/2006/picture">
                 <pic:pic>
                   <pic:nvPicPr>
-                    <pic:cNvPr id="0" name="task8-13-payment-retry-success.png"/>
+                    <pic:cNvPr id="0" name="task8-12-payment-failed.png"/>
                     <pic:cNvPicPr/>
                   </pic:nvPicPr>
                   <pic:blipFill>
@@ -16741,14 +16720,9 @@
         <w:spacing w:after="240"/>
       </w:pPr>
       <w:r>
-        <w:t>Figure F14. Retry under the same key: payment successful, one order stored</w:t>
+        <w:t>Figure F13. Simulated payment failure with the retained-checkout-key retry notice</w:t>
         <w:br/>
-        <w:t>Source: docs/evidence/screenshots/task8-13-payment-retry-success.png</w:t>
-      </w:r>
-    </w:p>
-    <w:p>
-      <w:r>
-        <w:br w:type="page"/>
+        <w:t>Source: docs/evidence/screenshots/task8-12-payment-failed.png</w:t>
       </w:r>
     </w:p>
     <w:p>
@@ -16760,7 +16734,7 @@
         <w:drawing>
           <wp:inline xmlns:a="http://schemas.openxmlformats.org/drawingml/2006/main" xmlns:pic="http://schemas.openxmlformats.org/drawingml/2006/picture">
             <wp:extent cx="6080760" cy="3420428"/>
-            <wp:docPr id="15" name="Picture 15"/>
+            <wp:docPr id="14" name="Picture 14"/>
             <wp:cNvGraphicFramePr>
               <a:graphicFrameLocks noChangeAspect="1"/>
             </wp:cNvGraphicFramePr>
@@ -16768,7 +16742,7 @@
               <a:graphicData uri="http://schemas.openxmlformats.org/drawingml/2006/picture">
                 <pic:pic>
                   <pic:nvPicPr>
-                    <pic:cNvPr id="0" name="task8-14-double-click-single-order.png"/>
+                    <pic:cNvPr id="0" name="task8-13-payment-retry-success.png"/>
                     <pic:cNvPicPr/>
                   </pic:nvPicPr>
                   <pic:blipFill>
@@ -16798,9 +16772,14 @@
         <w:spacing w:after="240"/>
       </w:pPr>
       <w:r>
-        <w:t>Figure F15. Double-click result screen; exactly one order exists for the attempt</w:t>
+        <w:t>Figure F14. Retry under the same key: payment successful, one order stored</w:t>
         <w:br/>
-        <w:t>Source: docs/evidence/screenshots/task8-14-double-click-single-order.png</w:t>
+        <w:t>Source: docs/evidence/screenshots/task8-13-payment-retry-success.png</w:t>
+      </w:r>
+    </w:p>
+    <w:p>
+      <w:r>
+        <w:br w:type="page"/>
       </w:r>
     </w:p>
     <w:p>
@@ -16812,7 +16791,7 @@
         <w:drawing>
           <wp:inline xmlns:a="http://schemas.openxmlformats.org/drawingml/2006/main" xmlns:pic="http://schemas.openxmlformats.org/drawingml/2006/picture">
             <wp:extent cx="6080760" cy="3420428"/>
-            <wp:docPr id="16" name="Picture 16"/>
+            <wp:docPr id="15" name="Picture 15"/>
             <wp:cNvGraphicFramePr>
               <a:graphicFrameLocks noChangeAspect="1"/>
             </wp:cNvGraphicFramePr>
@@ -16820,7 +16799,7 @@
               <a:graphicData uri="http://schemas.openxmlformats.org/drawingml/2006/picture">
                 <pic:pic>
                   <pic:nvPicPr>
-                    <pic:cNvPr id="0" name="task8-15-stale-sold-out-refused.png"/>
+                    <pic:cNvPr id="0" name="task8-14-double-click-single-order.png"/>
                     <pic:cNvPicPr/>
                   </pic:nvPicPr>
                   <pic:blipFill>
@@ -16850,14 +16829,9 @@
         <w:spacing w:after="240"/>
       </w:pPr>
       <w:r>
-        <w:t>Figure F16. Checkout refused because a line sold out before payment</w:t>
+        <w:t>Figure F15. Double-click result screen; exactly one order exists for the attempt</w:t>
         <w:br/>
-        <w:t>Source: docs/evidence/screenshots/task8-15-stale-sold-out-refused.png</w:t>
-      </w:r>
-    </w:p>
-    <w:p>
-      <w:r>
-        <w:br w:type="page"/>
+        <w:t>Source: docs/evidence/screenshots/task8-14-double-click-single-order.png</w:t>
       </w:r>
     </w:p>
     <w:p>
@@ -16869,7 +16843,7 @@
         <w:drawing>
           <wp:inline xmlns:a="http://schemas.openxmlformats.org/drawingml/2006/main" xmlns:pic="http://schemas.openxmlformats.org/drawingml/2006/picture">
             <wp:extent cx="6080760" cy="3420428"/>
-            <wp:docPr id="17" name="Picture 17"/>
+            <wp:docPr id="16" name="Picture 16"/>
             <wp:cNvGraphicFramePr>
               <a:graphicFrameLocks noChangeAspect="1"/>
             </wp:cNvGraphicFramePr>
@@ -16877,7 +16851,7 @@
               <a:graphicData uri="http://schemas.openxmlformats.org/drawingml/2006/picture">
                 <pic:pic>
                   <pic:nvPicPr>
-                    <pic:cNvPr id="0" name="task8-16-after-removal-paid.png"/>
+                    <pic:cNvPr id="0" name="task8-15-stale-sold-out-refused.png"/>
                     <pic:cNvPicPr/>
                   </pic:nvPicPr>
                   <pic:blipFill>
@@ -16907,9 +16881,14 @@
         <w:spacing w:after="240"/>
       </w:pPr>
       <w:r>
-        <w:t>Figure F17. Remaining line paid out after the sold-out line was removed</w:t>
+        <w:t>Figure F16. Checkout refused because a line sold out before payment</w:t>
         <w:br/>
-        <w:t>Source: docs/evidence/screenshots/task8-16-after-removal-paid.png</w:t>
+        <w:t>Source: docs/evidence/screenshots/task8-15-stale-sold-out-refused.png</w:t>
+      </w:r>
+    </w:p>
+    <w:p>
+      <w:r>
+        <w:br w:type="page"/>
       </w:r>
     </w:p>
     <w:p>
@@ -16921,7 +16900,7 @@
         <w:drawing>
           <wp:inline xmlns:a="http://schemas.openxmlformats.org/drawingml/2006/main" xmlns:pic="http://schemas.openxmlformats.org/drawingml/2006/picture">
             <wp:extent cx="6080760" cy="3420428"/>
-            <wp:docPr id="18" name="Picture 18"/>
+            <wp:docPr id="17" name="Picture 17"/>
             <wp:cNvGraphicFramePr>
               <a:graphicFrameLocks noChangeAspect="1"/>
             </wp:cNvGraphicFramePr>
@@ -16929,7 +16908,7 @@
               <a:graphicData uri="http://schemas.openxmlformats.org/drawingml/2006/picture">
                 <pic:pic>
                   <pic:nvPicPr>
-                    <pic:cNvPr id="0" name="task8-17-cross-stall-refused.png"/>
+                    <pic:cNvPr id="0" name="task8-16-after-removal-paid.png"/>
                     <pic:cNvPicPr/>
                   </pic:nvPicPr>
                   <pic:blipFill>
@@ -16959,14 +16938,9 @@
         <w:spacing w:after="240"/>
       </w:pPr>
       <w:r>
-        <w:t>Figure F18. Cross-stall add refusal naming the stall already in the cart</w:t>
+        <w:t>Figure F17. Remaining line paid out after the sold-out line was removed</w:t>
         <w:br/>
-        <w:t>Source: docs/evidence/screenshots/task8-17-cross-stall-refused.png</w:t>
-      </w:r>
-    </w:p>
-    <w:p>
-      <w:r>
-        <w:br w:type="page"/>
+        <w:t>Source: docs/evidence/screenshots/task8-16-after-removal-paid.png</w:t>
       </w:r>
     </w:p>
     <w:p>
@@ -16978,7 +16952,7 @@
         <w:drawing>
           <wp:inline xmlns:a="http://schemas.openxmlformats.org/drawingml/2006/main" xmlns:pic="http://schemas.openxmlformats.org/drawingml/2006/picture">
             <wp:extent cx="6080760" cy="3420428"/>
-            <wp:docPr id="19" name="Picture 19"/>
+            <wp:docPr id="18" name="Picture 18"/>
             <wp:cNvGraphicFramePr>
               <a:graphicFrameLocks noChangeAspect="1"/>
             </wp:cNvGraphicFramePr>
@@ -16986,7 +16960,7 @@
               <a:graphicData uri="http://schemas.openxmlformats.org/drawingml/2006/picture">
                 <pic:pic>
                   <pic:nvPicPr>
-                    <pic:cNvPr id="0" name="task8-18-forged-token-sign-in.png"/>
+                    <pic:cNvPr id="0" name="task8-17-cross-stall-refused.png"/>
                     <pic:cNvPicPr/>
                   </pic:nvPicPr>
                   <pic:blipFill>
@@ -17016,9 +16990,14 @@
         <w:spacing w:after="240"/>
       </w:pPr>
       <w:r>
-        <w:t>Figure F19. Forged-token 401: session cleared, sign-in presented</w:t>
+        <w:t>Figure F18. Cross-stall add refusal naming the stall already in the cart</w:t>
         <w:br/>
-        <w:t>Source: docs/evidence/screenshots/task8-18-forged-token-sign-in.png</w:t>
+        <w:t>Source: docs/evidence/screenshots/task8-17-cross-stall-refused.png</w:t>
+      </w:r>
+    </w:p>
+    <w:p>
+      <w:r>
+        <w:br w:type="page"/>
       </w:r>
     </w:p>
     <w:p>
@@ -17030,7 +17009,7 @@
         <w:drawing>
           <wp:inline xmlns:a="http://schemas.openxmlformats.org/drawingml/2006/main" xmlns:pic="http://schemas.openxmlformats.org/drawingml/2006/picture">
             <wp:extent cx="6080760" cy="3420428"/>
-            <wp:docPr id="20" name="Picture 20"/>
+            <wp:docPr id="19" name="Picture 19"/>
             <wp:cNvGraphicFramePr>
               <a:graphicFrameLocks noChangeAspect="1"/>
             </wp:cNvGraphicFramePr>
@@ -17038,7 +17017,7 @@
               <a:graphicData uri="http://schemas.openxmlformats.org/drawingml/2006/picture">
                 <pic:pic>
                   <pic:nvPicPr>
-                    <pic:cNvPr id="0" name="task9-01-vendor-menu-open.png"/>
+                    <pic:cNvPr id="0" name="task8-18-forged-token-sign-in.png"/>
                     <pic:cNvPicPr/>
                   </pic:nvPicPr>
                   <pic:blipFill>
@@ -17068,14 +17047,9 @@
         <w:spacing w:after="240"/>
       </w:pPr>
       <w:r>
-        <w:t>Figure F20. Vendor login lands on the own menu: stall name, Open badge, 3 active items, seeded Pineapple Tart badged Sold out</w:t>
+        <w:t>Figure F19. Forged-token 401: session cleared, sign-in presented</w:t>
         <w:br/>
-        <w:t>Source: docs/evidence/screenshots/task9-01-vendor-menu-open.png</w:t>
-      </w:r>
-    </w:p>
-    <w:p>
-      <w:r>
-        <w:br w:type="page"/>
+        <w:t>Source: docs/evidence/screenshots/task8-18-forged-token-sign-in.png</w:t>
       </w:r>
     </w:p>
     <w:p>
@@ -17087,7 +17061,7 @@
         <w:drawing>
           <wp:inline xmlns:a="http://schemas.openxmlformats.org/drawingml/2006/main" xmlns:pic="http://schemas.openxmlformats.org/drawingml/2006/picture">
             <wp:extent cx="6080760" cy="3420428"/>
-            <wp:docPr id="21" name="Picture 21"/>
+            <wp:docPr id="20" name="Picture 20"/>
             <wp:cNvGraphicFramePr>
               <a:graphicFrameLocks noChangeAspect="1"/>
             </wp:cNvGraphicFramePr>
@@ -17095,7 +17069,7 @@
               <a:graphicData uri="http://schemas.openxmlformats.org/drawingml/2006/picture">
                 <pic:pic>
                   <pic:nvPicPr>
-                    <pic:cNvPr id="0" name="task9-02-closed-banner.png"/>
+                    <pic:cNvPr id="0" name="task9-01-vendor-menu-open.png"/>
                     <pic:cNvPicPr/>
                   </pic:nvPicPr>
                   <pic:blipFill>
@@ -17125,9 +17099,14 @@
         <w:spacing w:after="240"/>
       </w:pPr>
       <w:r>
-        <w:t>Figure F21. After the switch: Closed badge and the closure banner (new orders refused, paid queue stays accessible)</w:t>
+        <w:t>Figure F20. Vendor login lands on the own menu: stall name, Open badge, 3 active items, seeded Pineapple Tart badged Sold out</w:t>
         <w:br/>
-        <w:t>Source: docs/evidence/screenshots/task9-02-closed-banner.png</w:t>
+        <w:t>Source: docs/evidence/screenshots/task9-01-vendor-menu-open.png</w:t>
+      </w:r>
+    </w:p>
+    <w:p>
+      <w:r>
+        <w:br w:type="page"/>
       </w:r>
     </w:p>
     <w:p>
@@ -17139,7 +17118,7 @@
         <w:drawing>
           <wp:inline xmlns:a="http://schemas.openxmlformats.org/drawingml/2006/main" xmlns:pic="http://schemas.openxmlformats.org/drawingml/2006/picture">
             <wp:extent cx="6080760" cy="3420428"/>
-            <wp:docPr id="22" name="Picture 22"/>
+            <wp:docPr id="21" name="Picture 21"/>
             <wp:cNvGraphicFramePr>
               <a:graphicFrameLocks noChangeAspect="1"/>
             </wp:cNvGraphicFramePr>
@@ -17147,7 +17126,7 @@
               <a:graphicData uri="http://schemas.openxmlformats.org/drawingml/2006/picture">
                 <pic:pic>
                   <pic:nvPicPr>
-                    <pic:cNvPr id="0" name="task9-03-diner-closed-stall.png"/>
+                    <pic:cNvPr id="0" name="task9-02-closed-banner.png"/>
                     <pic:cNvPicPr/>
                   </pic:nvPicPr>
                   <pic:blipFill>
@@ -17177,14 +17156,9 @@
         <w:spacing w:after="240"/>
       </w:pPr>
       <w:r>
-        <w:t>Figure F22. The diner's direct-link view of the closed stall: closure notice, every Add control disabled</w:t>
+        <w:t>Figure F21. After the switch: Closed badge and the closure banner (new orders refused, paid queue stays accessible)</w:t>
         <w:br/>
-        <w:t>Source: docs/evidence/screenshots/task9-03-diner-closed-stall.png</w:t>
-      </w:r>
-    </w:p>
-    <w:p>
-      <w:r>
-        <w:br w:type="page"/>
+        <w:t>Source: docs/evidence/screenshots/task9-02-closed-banner.png</w:t>
       </w:r>
     </w:p>
     <w:p>
@@ -17196,7 +17170,7 @@
         <w:drawing>
           <wp:inline xmlns:a="http://schemas.openxmlformats.org/drawingml/2006/main" xmlns:pic="http://schemas.openxmlformats.org/drawingml/2006/picture">
             <wp:extent cx="6080760" cy="3420428"/>
-            <wp:docPr id="23" name="Picture 23"/>
+            <wp:docPr id="22" name="Picture 22"/>
             <wp:cNvGraphicFramePr>
               <a:graphicFrameLocks noChangeAspect="1"/>
             </wp:cNvGraphicFramePr>
@@ -17204,7 +17178,7 @@
               <a:graphicData uri="http://schemas.openxmlformats.org/drawingml/2006/picture">
                 <pic:pic>
                   <pic:nvPicPr>
-                    <pic:cNvPr id="0" name="task9-04-form-rejection.png"/>
+                    <pic:cNvPr id="0" name="task9-03-diner-closed-stall.png"/>
                     <pic:cNvPicPr/>
                   </pic:nvPicPr>
                   <pic:blipFill>
@@ -17234,9 +17208,14 @@
         <w:spacing w:after="240"/>
       </w:pPr>
       <w:r>
-        <w:t>Figure F23. The create form showing the backend's own 400 message for a malformed price</w:t>
+        <w:t>Figure F22. The diner's direct-link view of the closed stall: closure notice, every Add control disabled</w:t>
         <w:br/>
-        <w:t>Source: docs/evidence/screenshots/task9-04-form-rejection.png</w:t>
+        <w:t>Source: docs/evidence/screenshots/task9-03-diner-closed-stall.png</w:t>
+      </w:r>
+    </w:p>
+    <w:p>
+      <w:r>
+        <w:br w:type="page"/>
       </w:r>
     </w:p>
     <w:p>
@@ -17248,7 +17227,7 @@
         <w:drawing>
           <wp:inline xmlns:a="http://schemas.openxmlformats.org/drawingml/2006/main" xmlns:pic="http://schemas.openxmlformats.org/drawingml/2006/picture">
             <wp:extent cx="6080760" cy="3420428"/>
-            <wp:docPr id="24" name="Picture 24"/>
+            <wp:docPr id="23" name="Picture 23"/>
             <wp:cNvGraphicFramePr>
               <a:graphicFrameLocks noChangeAspect="1"/>
             </wp:cNvGraphicFramePr>
@@ -17256,7 +17235,7 @@
               <a:graphicData uri="http://schemas.openxmlformats.org/drawingml/2006/picture">
                 <pic:pic>
                   <pic:nvPicPr>
-                    <pic:cNvPr id="0" name="task9-05-item-created.png"/>
+                    <pic:cNvPr id="0" name="task9-04-form-rejection.png"/>
                     <pic:cNvPicPr/>
                   </pic:nvPicPr>
                   <pic:blipFill>
@@ -17286,14 +17265,9 @@
         <w:spacing w:after="240"/>
       </w:pPr>
       <w:r>
-        <w:t>Figure F24. The run-created item listed with its $9.99 price and the success banner</w:t>
+        <w:t>Figure F23. The create form showing the backend's own 400 message for a malformed price</w:t>
         <w:br/>
-        <w:t>Source: docs/evidence/screenshots/task9-05-item-created.png</w:t>
-      </w:r>
-    </w:p>
-    <w:p>
-      <w:r>
-        <w:br w:type="page"/>
+        <w:t>Source: docs/evidence/screenshots/task9-04-form-rejection.png</w:t>
       </w:r>
     </w:p>
     <w:p>
@@ -17305,7 +17279,7 @@
         <w:drawing>
           <wp:inline xmlns:a="http://schemas.openxmlformats.org/drawingml/2006/main" xmlns:pic="http://schemas.openxmlformats.org/drawingml/2006/picture">
             <wp:extent cx="6080760" cy="3420428"/>
-            <wp:docPr id="25" name="Picture 25"/>
+            <wp:docPr id="24" name="Picture 24"/>
             <wp:cNvGraphicFramePr>
               <a:graphicFrameLocks noChangeAspect="1"/>
             </wp:cNvGraphicFramePr>
@@ -17313,7 +17287,7 @@
               <a:graphicData uri="http://schemas.openxmlformats.org/drawingml/2006/picture">
                 <pic:pic>
                   <pic:nvPicPr>
-                    <pic:cNvPr id="0" name="task9-06-item-edited.png"/>
+                    <pic:cNvPr id="0" name="task9-05-item-created.png"/>
                     <pic:cNvPicPr/>
                   </pic:nvPicPr>
                   <pic:blipFill>
@@ -17343,9 +17317,14 @@
         <w:spacing w:after="240"/>
       </w:pPr>
       <w:r>
-        <w:t>Figure F25. The renamed/repriced item ($10.50) after the edit form saved</w:t>
+        <w:t>Figure F24. The run-created item listed with its $9.99 price and the success banner</w:t>
         <w:br/>
-        <w:t>Source: docs/evidence/screenshots/task9-06-item-edited.png</w:t>
+        <w:t>Source: docs/evidence/screenshots/task9-05-item-created.png</w:t>
+      </w:r>
+    </w:p>
+    <w:p>
+      <w:r>
+        <w:br w:type="page"/>
       </w:r>
     </w:p>
     <w:p>
@@ -17357,7 +17336,7 @@
         <w:drawing>
           <wp:inline xmlns:a="http://schemas.openxmlformats.org/drawingml/2006/main" xmlns:pic="http://schemas.openxmlformats.org/drawingml/2006/picture">
             <wp:extent cx="6080760" cy="3420428"/>
-            <wp:docPr id="26" name="Picture 26"/>
+            <wp:docPr id="25" name="Picture 25"/>
             <wp:cNvGraphicFramePr>
               <a:graphicFrameLocks noChangeAspect="1"/>
             </wp:cNvGraphicFramePr>
@@ -17365,7 +17344,7 @@
               <a:graphicData uri="http://schemas.openxmlformats.org/drawingml/2006/picture">
                 <pic:pic>
                   <pic:nvPicPr>
-                    <pic:cNvPr id="0" name="task9-07-m2-sold-out.png"/>
+                    <pic:cNvPr id="0" name="task9-06-item-edited.png"/>
                     <pic:cNvPicPr/>
                   </pic:nvPicPr>
                   <pic:blipFill>
@@ -17395,14 +17374,9 @@
         <w:spacing w:after="240"/>
       </w:pPr>
       <w:r>
-        <w:t>Figure F26. A seeded item marked sold out from its row control (badge + success banner)</w:t>
+        <w:t>Figure F25. The renamed/repriced item ($10.50) after the edit form saved</w:t>
         <w:br/>
-        <w:t>Source: docs/evidence/screenshots/task9-07-m2-sold-out.png</w:t>
-      </w:r>
-    </w:p>
-    <w:p>
-      <w:r>
-        <w:br w:type="page"/>
+        <w:t>Source: docs/evidence/screenshots/task9-06-item-edited.png</w:t>
       </w:r>
     </w:p>
     <w:p>
@@ -17414,7 +17388,7 @@
         <w:drawing>
           <wp:inline xmlns:a="http://schemas.openxmlformats.org/drawingml/2006/main" xmlns:pic="http://schemas.openxmlformats.org/drawingml/2006/picture">
             <wp:extent cx="6080760" cy="3420428"/>
-            <wp:docPr id="27" name="Picture 27"/>
+            <wp:docPr id="26" name="Picture 26"/>
             <wp:cNvGraphicFramePr>
               <a:graphicFrameLocks noChangeAspect="1"/>
             </wp:cNvGraphicFramePr>
@@ -17422,7 +17396,7 @@
               <a:graphicData uri="http://schemas.openxmlformats.org/drawingml/2006/picture">
                 <pic:pic>
                   <pic:nvPicPr>
-                    <pic:cNvPr id="0" name="task9-08-orders-queue.png"/>
+                    <pic:cNvPr id="0" name="task9-07-m2-sold-out.png"/>
                     <pic:cNvPicPr/>
                   </pic:nvPicPr>
                   <pic:blipFill>
@@ -17452,9 +17426,14 @@
         <w:spacing w:after="240"/>
       </w:pPr>
       <w:r>
-        <w:t>Figure F27. The paid queue: 8 own-stall orders newest-first, other-stall order absent, status badges</w:t>
+        <w:t>Figure F26. A seeded item marked sold out from its row control (badge + success banner)</w:t>
         <w:br/>
-        <w:t>Source: docs/evidence/screenshots/task9-08-orders-queue.png</w:t>
+        <w:t>Source: docs/evidence/screenshots/task9-07-m2-sold-out.png</w:t>
+      </w:r>
+    </w:p>
+    <w:p>
+      <w:r>
+        <w:br w:type="page"/>
       </w:r>
     </w:p>
     <w:p>
@@ -17466,7 +17445,7 @@
         <w:drawing>
           <wp:inline xmlns:a="http://schemas.openxmlformats.org/drawingml/2006/main" xmlns:pic="http://schemas.openxmlformats.org/drawingml/2006/picture">
             <wp:extent cx="6080760" cy="3420428"/>
-            <wp:docPr id="28" name="Picture 28"/>
+            <wp:docPr id="27" name="Picture 27"/>
             <wp:cNvGraphicFramePr>
               <a:graphicFrameLocks noChangeAspect="1"/>
             </wp:cNvGraphicFramePr>
@@ -17474,7 +17453,7 @@
               <a:graphicData uri="http://schemas.openxmlformats.org/drawingml/2006/picture">
                 <pic:pic>
                   <pic:nvPicPr>
-                    <pic:cNvPr id="0" name="task9-09-pending-controls.png"/>
+                    <pic:cNvPr id="0" name="task9-08-orders-queue.png"/>
                     <pic:cNvPicPr/>
                   </pic:nvPicPr>
                   <pic:blipFill>
@@ -17504,14 +17483,9 @@
         <w:spacing w:after="240"/>
       </w:pPr>
       <w:r>
-        <w:t>Figure F28. A Pending order: exactly Accept order / Reject order</w:t>
+        <w:t>Figure F27. The paid queue: 8 own-stall orders newest-first, other-stall order absent, status badges</w:t>
         <w:br/>
-        <w:t>Source: docs/evidence/screenshots/task9-09-pending-controls.png</w:t>
-      </w:r>
-    </w:p>
-    <w:p>
-      <w:r>
-        <w:br w:type="page"/>
+        <w:t>Source: docs/evidence/screenshots/task9-08-orders-queue.png</w:t>
       </w:r>
     </w:p>
     <w:p>
@@ -17523,7 +17497,7 @@
         <w:drawing>
           <wp:inline xmlns:a="http://schemas.openxmlformats.org/drawingml/2006/main" xmlns:pic="http://schemas.openxmlformats.org/drawingml/2006/picture">
             <wp:extent cx="6080760" cy="3420428"/>
-            <wp:docPr id="29" name="Picture 29"/>
+            <wp:docPr id="28" name="Picture 28"/>
             <wp:cNvGraphicFramePr>
               <a:graphicFrameLocks noChangeAspect="1"/>
             </wp:cNvGraphicFramePr>
@@ -17531,7 +17505,7 @@
               <a:graphicData uri="http://schemas.openxmlformats.org/drawingml/2006/picture">
                 <pic:pic>
                   <pic:nvPicPr>
-                    <pic:cNvPr id="0" name="task9-10-preparing-controls.png"/>
+                    <pic:cNvPr id="0" name="task9-09-pending-controls.png"/>
                     <pic:cNvPicPr/>
                   </pic:nvPicPr>
                   <pic:blipFill>
@@ -17561,9 +17535,14 @@
         <w:spacing w:after="240"/>
       </w:pPr>
       <w:r>
-        <w:t>Figure F29. A Preparing order: exactly Mark ready (rejection no longer offered)</w:t>
+        <w:t>Figure F28. A Pending order: exactly Accept order / Reject order</w:t>
         <w:br/>
-        <w:t>Source: docs/evidence/screenshots/task9-10-preparing-controls.png</w:t>
+        <w:t>Source: docs/evidence/screenshots/task9-09-pending-controls.png</w:t>
+      </w:r>
+    </w:p>
+    <w:p>
+      <w:r>
+        <w:br w:type="page"/>
       </w:r>
     </w:p>
     <w:p>
@@ -17575,7 +17554,7 @@
         <w:drawing>
           <wp:inline xmlns:a="http://schemas.openxmlformats.org/drawingml/2006/main" xmlns:pic="http://schemas.openxmlformats.org/drawingml/2006/picture">
             <wp:extent cx="6080760" cy="3420428"/>
-            <wp:docPr id="30" name="Picture 30"/>
+            <wp:docPr id="29" name="Picture 29"/>
             <wp:cNvGraphicFramePr>
               <a:graphicFrameLocks noChangeAspect="1"/>
             </wp:cNvGraphicFramePr>
@@ -17583,7 +17562,7 @@
               <a:graphicData uri="http://schemas.openxmlformats.org/drawingml/2006/picture">
                 <pic:pic>
                   <pic:nvPicPr>
-                    <pic:cNvPr id="0" name="task9-11-ready-no-noshow.png"/>
+                    <pic:cNvPr id="0" name="task9-10-preparing-controls.png"/>
                     <pic:cNvPicPr/>
                   </pic:nvPicPr>
                   <pic:blipFill>
@@ -17613,14 +17592,9 @@
         <w:spacing w:after="240"/>
       </w:pPr>
       <w:r>
-        <w:t>Figure F30. Ready +5 min: Mark collected only — the NoShow control is still hidden</w:t>
+        <w:t>Figure F29. A Preparing order: exactly Mark ready (rejection no longer offered)</w:t>
         <w:br/>
-        <w:t>Source: docs/evidence/screenshots/task9-11-ready-no-noshow.png</w:t>
-      </w:r>
-    </w:p>
-    <w:p>
-      <w:r>
-        <w:br w:type="page"/>
+        <w:t>Source: docs/evidence/screenshots/task9-10-preparing-controls.png</w:t>
       </w:r>
     </w:p>
     <w:p>
@@ -17632,7 +17606,7 @@
         <w:drawing>
           <wp:inline xmlns:a="http://schemas.openxmlformats.org/drawingml/2006/main" xmlns:pic="http://schemas.openxmlformats.org/drawingml/2006/picture">
             <wp:extent cx="6080760" cy="3420428"/>
-            <wp:docPr id="31" name="Picture 31"/>
+            <wp:docPr id="30" name="Picture 30"/>
             <wp:cNvGraphicFramePr>
               <a:graphicFrameLocks noChangeAspect="1"/>
             </wp:cNvGraphicFramePr>
@@ -17640,7 +17614,7 @@
               <a:graphicData uri="http://schemas.openxmlformats.org/drawingml/2006/picture">
                 <pic:pic>
                   <pic:nvPicPr>
-                    <pic:cNvPr id="0" name="task9-12-ready-with-noshow.png"/>
+                    <pic:cNvPr id="0" name="task9-11-ready-no-noshow.png"/>
                     <pic:cNvPicPr/>
                   </pic:nvPicPr>
                   <pic:blipFill>
@@ -17670,9 +17644,14 @@
         <w:spacing w:after="240"/>
       </w:pPr>
       <w:r>
-        <w:t>Figure F31. Ready +35 min: both Mark collected and Mark no-show are offered</w:t>
+        <w:t>Figure F30. Ready +5 min: Mark collected only — the NoShow control is still hidden</w:t>
         <w:br/>
-        <w:t>Source: docs/evidence/screenshots/task9-12-ready-with-noshow.png</w:t>
+        <w:t>Source: docs/evidence/screenshots/task9-11-ready-no-noshow.png</w:t>
+      </w:r>
+    </w:p>
+    <w:p>
+      <w:r>
+        <w:br w:type="page"/>
       </w:r>
     </w:p>
     <w:p>
@@ -17684,7 +17663,7 @@
         <w:drawing>
           <wp:inline xmlns:a="http://schemas.openxmlformats.org/drawingml/2006/main" xmlns:pic="http://schemas.openxmlformats.org/drawingml/2006/picture">
             <wp:extent cx="6080760" cy="3420428"/>
-            <wp:docPr id="32" name="Picture 32"/>
+            <wp:docPr id="31" name="Picture 31"/>
             <wp:cNvGraphicFramePr>
               <a:graphicFrameLocks noChangeAspect="1"/>
             </wp:cNvGraphicFramePr>
@@ -17692,7 +17671,7 @@
               <a:graphicData uri="http://schemas.openxmlformats.org/drawingml/2006/picture">
                 <pic:pic>
                   <pic:nvPicPr>
-                    <pic:cNvPr id="0" name="task9-13-terminal-cancelled.png"/>
+                    <pic:cNvPr id="0" name="task9-12-ready-with-noshow.png"/>
                     <pic:cNvPicPr/>
                   </pic:nvPicPr>
                   <pic:blipFill>
@@ -17722,14 +17701,9 @@
         <w:spacing w:after="240"/>
       </w:pPr>
       <w:r>
-        <w:t>Figure F32. Cancelled order: read-only, "This order is final", refund shown with time</w:t>
+        <w:t>Figure F31. Ready +35 min: both Mark collected and Mark no-show are offered</w:t>
         <w:br/>
-        <w:t>Source: docs/evidence/screenshots/task9-13-terminal-cancelled.png</w:t>
-      </w:r>
-    </w:p>
-    <w:p>
-      <w:r>
-        <w:br w:type="page"/>
+        <w:t>Source: docs/evidence/screenshots/task9-12-ready-with-noshow.png</w:t>
       </w:r>
     </w:p>
     <w:p>
@@ -17741,7 +17715,7 @@
         <w:drawing>
           <wp:inline xmlns:a="http://schemas.openxmlformats.org/drawingml/2006/main" xmlns:pic="http://schemas.openxmlformats.org/drawingml/2006/picture">
             <wp:extent cx="6080760" cy="3420428"/>
-            <wp:docPr id="33" name="Picture 33"/>
+            <wp:docPr id="32" name="Picture 32"/>
             <wp:cNvGraphicFramePr>
               <a:graphicFrameLocks noChangeAspect="1"/>
             </wp:cNvGraphicFramePr>
@@ -17749,7 +17723,7 @@
               <a:graphicData uri="http://schemas.openxmlformats.org/drawingml/2006/picture">
                 <pic:pic>
                   <pic:nvPicPr>
-                    <pic:cNvPr id="0" name="task9-14-terminal-noshow.png"/>
+                    <pic:cNvPr id="0" name="task9-13-terminal-cancelled.png"/>
                     <pic:cNvPicPr/>
                   </pic:nvPicPr>
                   <pic:blipFill>
@@ -17779,9 +17753,14 @@
         <w:spacing w:after="240"/>
       </w:pPr>
       <w:r>
-        <w:t>Figure F33. NoShow order: read-only, payment-stays-paid notice</w:t>
+        <w:t>Figure F32. Cancelled order: read-only, "This order is final", refund shown with time</w:t>
         <w:br/>
-        <w:t>Source: docs/evidence/screenshots/task9-14-terminal-noshow.png</w:t>
+        <w:t>Source: docs/evidence/screenshots/task9-13-terminal-cancelled.png</w:t>
+      </w:r>
+    </w:p>
+    <w:p>
+      <w:r>
+        <w:br w:type="page"/>
       </w:r>
     </w:p>
     <w:p>
@@ -17793,7 +17772,7 @@
         <w:drawing>
           <wp:inline xmlns:a="http://schemas.openxmlformats.org/drawingml/2006/main" xmlns:pic="http://schemas.openxmlformats.org/drawingml/2006/picture">
             <wp:extent cx="6080760" cy="3420428"/>
-            <wp:docPr id="34" name="Picture 34"/>
+            <wp:docPr id="33" name="Picture 33"/>
             <wp:cNvGraphicFramePr>
               <a:graphicFrameLocks noChangeAspect="1"/>
             </wp:cNvGraphicFramePr>
@@ -17801,7 +17780,7 @@
               <a:graphicData uri="http://schemas.openxmlformats.org/drawingml/2006/picture">
                 <pic:pic>
                   <pic:nvPicPr>
-                    <pic:cNvPr id="0" name="task9-15-terminal-collected-snapshot.png"/>
+                    <pic:cNvPr id="0" name="task9-14-terminal-noshow.png"/>
                     <pic:cNvPicPr/>
                   </pic:nvPicPr>
                   <pic:blipFill>
@@ -17831,14 +17810,9 @@
         <w:spacing w:after="240"/>
       </w:pPr>
       <w:r>
-        <w:t>Figure F34. Collected order: read-only, stale purchase snapshot (Grilled Chicken Rice $6.00)</w:t>
+        <w:t>Figure F33. NoShow order: read-only, payment-stays-paid notice</w:t>
         <w:br/>
-        <w:t>Source: docs/evidence/screenshots/task9-15-terminal-collected-snapshot.png</w:t>
-      </w:r>
-    </w:p>
-    <w:p>
-      <w:r>
-        <w:br w:type="page"/>
+        <w:t>Source: docs/evidence/screenshots/task9-14-terminal-noshow.png</w:t>
       </w:r>
     </w:p>
     <w:p>
@@ -17850,7 +17824,7 @@
         <w:drawing>
           <wp:inline xmlns:a="http://schemas.openxmlformats.org/drawingml/2006/main" xmlns:pic="http://schemas.openxmlformats.org/drawingml/2006/picture">
             <wp:extent cx="6080760" cy="3420428"/>
-            <wp:docPr id="35" name="Picture 35"/>
+            <wp:docPr id="34" name="Picture 34"/>
             <wp:cNvGraphicFramePr>
               <a:graphicFrameLocks noChangeAspect="1"/>
             </wp:cNvGraphicFramePr>
@@ -17858,7 +17832,7 @@
               <a:graphicData uri="http://schemas.openxmlformats.org/drawingml/2006/picture">
                 <pic:pic>
                   <pic:nvPicPr>
-                    <pic:cNvPr id="0" name="task9-16-forbidden-order.png"/>
+                    <pic:cNvPr id="0" name="task9-15-terminal-collected-snapshot.png"/>
                     <pic:cNvPicPr/>
                   </pic:nvPicPr>
                   <pic:blipFill>
@@ -17888,9 +17862,14 @@
         <w:spacing w:after="240"/>
       </w:pPr>
       <w:r>
-        <w:t>Figure F35. Another stall's order: the 403 screen, no order data rendered</w:t>
+        <w:t>Figure F34. Collected order: read-only, stale purchase snapshot (Grilled Chicken Rice $6.00)</w:t>
         <w:br/>
-        <w:t>Source: docs/evidence/screenshots/task9-16-forbidden-order.png</w:t>
+        <w:t>Source: docs/evidence/screenshots/task9-15-terminal-collected-snapshot.png</w:t>
+      </w:r>
+    </w:p>
+    <w:p>
+      <w:r>
+        <w:br w:type="page"/>
       </w:r>
     </w:p>
     <w:p>
@@ -17902,7 +17881,7 @@
         <w:drawing>
           <wp:inline xmlns:a="http://schemas.openxmlformats.org/drawingml/2006/main" xmlns:pic="http://schemas.openxmlformats.org/drawingml/2006/picture">
             <wp:extent cx="6080760" cy="3420428"/>
-            <wp:docPr id="36" name="Picture 36"/>
+            <wp:docPr id="35" name="Picture 35"/>
             <wp:cNvGraphicFramePr>
               <a:graphicFrameLocks noChangeAspect="1"/>
             </wp:cNvGraphicFramePr>
@@ -17910,7 +17889,7 @@
               <a:graphicData uri="http://schemas.openxmlformats.org/drawingml/2006/picture">
                 <pic:pic>
                   <pic:nvPicPr>
-                    <pic:cNvPr id="0" name="task9-17-closed-queue-accessible.png"/>
+                    <pic:cNvPr id="0" name="task9-16-forbidden-order.png"/>
                     <pic:cNvPicPr/>
                   </pic:nvPicPr>
                   <pic:blipFill>
@@ -17940,14 +17919,9 @@
         <w:spacing w:after="240"/>
       </w:pPr>
       <w:r>
-        <w:t>Figure F36. While the stall is closed: closure banner plus the full paid queue with every Manage control enabled</w:t>
+        <w:t>Figure F35. Another stall's order: the 403 screen, no order data rendered</w:t>
         <w:br/>
-        <w:t>Source: docs/evidence/screenshots/task9-17-closed-queue-accessible.png</w:t>
-      </w:r>
-    </w:p>
-    <w:p>
-      <w:r>
-        <w:br w:type="page"/>
+        <w:t>Source: docs/evidence/screenshots/task9-16-forbidden-order.png</w:t>
       </w:r>
     </w:p>
     <w:p>
@@ -17959,7 +17933,7 @@
         <w:drawing>
           <wp:inline xmlns:a="http://schemas.openxmlformats.org/drawingml/2006/main" xmlns:pic="http://schemas.openxmlformats.org/drawingml/2006/picture">
             <wp:extent cx="6080760" cy="3420428"/>
-            <wp:docPr id="37" name="Picture 37"/>
+            <wp:docPr id="36" name="Picture 36"/>
             <wp:cNvGraphicFramePr>
               <a:graphicFrameLocks noChangeAspect="1"/>
             </wp:cNvGraphicFramePr>
@@ -17967,7 +17941,7 @@
               <a:graphicData uri="http://schemas.openxmlformats.org/drawingml/2006/picture">
                 <pic:pic>
                   <pic:nvPicPr>
-                    <pic:cNvPr id="0" name="task9-18-diner-checkout-success.png"/>
+                    <pic:cNvPr id="0" name="task9-17-closed-queue-accessible.png"/>
                     <pic:cNvPicPr/>
                   </pic:nvPicPr>
                   <pic:blipFill>
@@ -17997,9 +17971,14 @@
         <w:spacing w:after="240"/>
       </w:pPr>
       <w:r>
-        <w:t>Figure F37. The diner context: the seeded cart ($15.50) paid, fresh queue number shown</w:t>
+        <w:t>Figure F36. While the stall is closed: closure banner plus the full paid queue with every Manage control enabled</w:t>
         <w:br/>
-        <w:t>Source: docs/evidence/screenshots/task9-18-diner-checkout-success.png</w:t>
+        <w:t>Source: docs/evidence/screenshots/task9-17-closed-queue-accessible.png</w:t>
+      </w:r>
+    </w:p>
+    <w:p>
+      <w:r>
+        <w:br w:type="page"/>
       </w:r>
     </w:p>
     <w:p>
@@ -18011,7 +17990,7 @@
         <w:drawing>
           <wp:inline xmlns:a="http://schemas.openxmlformats.org/drawingml/2006/main" xmlns:pic="http://schemas.openxmlformats.org/drawingml/2006/picture">
             <wp:extent cx="6080760" cy="3420428"/>
-            <wp:docPr id="38" name="Picture 38"/>
+            <wp:docPr id="37" name="Picture 37"/>
             <wp:cNvGraphicFramePr>
               <a:graphicFrameLocks noChangeAspect="1"/>
             </wp:cNvGraphicFramePr>
@@ -18019,7 +17998,7 @@
               <a:graphicData uri="http://schemas.openxmlformats.org/drawingml/2006/picture">
                 <pic:pic>
                   <pic:nvPicPr>
-                    <pic:cNvPr id="0" name="task9-19-vendor-accepted.png"/>
+                    <pic:cNvPr id="0" name="task9-18-diner-checkout-success.png"/>
                     <pic:cNvPicPr/>
                   </pic:nvPicPr>
                   <pic:blipFill>
@@ -18049,14 +18028,9 @@
         <w:spacing w:after="240"/>
       </w:pPr>
       <w:r>
-        <w:t>Figure F38. The vendor detail of the same order after Accept: Preparing badge, success notice</w:t>
+        <w:t>Figure F37. The diner context: the seeded cart ($15.50) paid, fresh queue number shown</w:t>
         <w:br/>
-        <w:t>Source: docs/evidence/screenshots/task9-19-vendor-accepted.png</w:t>
-      </w:r>
-    </w:p>
-    <w:p>
-      <w:r>
-        <w:br w:type="page"/>
+        <w:t>Source: docs/evidence/screenshots/task9-18-diner-checkout-success.png</w:t>
       </w:r>
     </w:p>
     <w:p>
@@ -18068,7 +18042,7 @@
         <w:drawing>
           <wp:inline xmlns:a="http://schemas.openxmlformats.org/drawingml/2006/main" xmlns:pic="http://schemas.openxmlformats.org/drawingml/2006/picture">
             <wp:extent cx="6080760" cy="3420428"/>
-            <wp:docPr id="39" name="Picture 39"/>
+            <wp:docPr id="38" name="Picture 38"/>
             <wp:cNvGraphicFramePr>
               <a:graphicFrameLocks noChangeAspect="1"/>
             </wp:cNvGraphicFramePr>
@@ -18076,7 +18050,7 @@
               <a:graphicData uri="http://schemas.openxmlformats.org/drawingml/2006/picture">
                 <pic:pic>
                   <pic:nvPicPr>
-                    <pic:cNvPr id="0" name="task9-20-diner-preparing.png"/>
+                    <pic:cNvPr id="0" name="task9-19-vendor-accepted.png"/>
                     <pic:cNvPicPr/>
                   </pic:nvPicPr>
                   <pic:blipFill>
@@ -18106,9 +18080,14 @@
         <w:spacing w:after="240"/>
       </w:pPr>
       <w:r>
-        <w:t>Figure F39. The diner's tracking page observing Preparing (polling, no manual refresh)</w:t>
+        <w:t>Figure F38. The vendor detail of the same order after Accept: Preparing badge, success notice</w:t>
         <w:br/>
-        <w:t>Source: docs/evidence/screenshots/task9-20-diner-preparing.png</w:t>
+        <w:t>Source: docs/evidence/screenshots/task9-19-vendor-accepted.png</w:t>
+      </w:r>
+    </w:p>
+    <w:p>
+      <w:r>
+        <w:br w:type="page"/>
       </w:r>
     </w:p>
     <w:p>
@@ -18120,7 +18099,7 @@
         <w:drawing>
           <wp:inline xmlns:a="http://schemas.openxmlformats.org/drawingml/2006/main" xmlns:pic="http://schemas.openxmlformats.org/drawingml/2006/picture">
             <wp:extent cx="6080760" cy="3420428"/>
-            <wp:docPr id="40" name="Picture 40"/>
+            <wp:docPr id="39" name="Picture 39"/>
             <wp:cNvGraphicFramePr>
               <a:graphicFrameLocks noChangeAspect="1"/>
             </wp:cNvGraphicFramePr>
@@ -18128,7 +18107,7 @@
               <a:graphicData uri="http://schemas.openxmlformats.org/drawingml/2006/picture">
                 <pic:pic>
                   <pic:nvPicPr>
-                    <pic:cNvPr id="0" name="task9-21-diner-ready-banner.png"/>
+                    <pic:cNvPr id="0" name="task9-20-diner-preparing.png"/>
                     <pic:cNvPicPr/>
                   </pic:nvPicPr>
                   <pic:blipFill>
@@ -18158,14 +18137,9 @@
         <w:spacing w:after="240"/>
       </w:pPr>
       <w:r>
-        <w:t>Figure F40. The Ready-for-collection banner on the diner's tracking page after Mark ready</w:t>
+        <w:t>Figure F39. The diner's tracking page observing Preparing (polling, no manual refresh)</w:t>
         <w:br/>
-        <w:t>Source: docs/evidence/screenshots/task9-21-diner-ready-banner.png</w:t>
-      </w:r>
-    </w:p>
-    <w:p>
-      <w:r>
-        <w:br w:type="page"/>
+        <w:t>Source: docs/evidence/screenshots/task9-20-diner-preparing.png</w:t>
       </w:r>
     </w:p>
     <w:p>
@@ -18177,7 +18151,7 @@
         <w:drawing>
           <wp:inline xmlns:a="http://schemas.openxmlformats.org/drawingml/2006/main" xmlns:pic="http://schemas.openxmlformats.org/drawingml/2006/picture">
             <wp:extent cx="6080760" cy="3420428"/>
-            <wp:docPr id="41" name="Picture 41"/>
+            <wp:docPr id="40" name="Picture 40"/>
             <wp:cNvGraphicFramePr>
               <a:graphicFrameLocks noChangeAspect="1"/>
             </wp:cNvGraphicFramePr>
@@ -18185,7 +18159,7 @@
               <a:graphicData uri="http://schemas.openxmlformats.org/drawingml/2006/picture">
                 <pic:pic>
                   <pic:nvPicPr>
-                    <pic:cNvPr id="0" name="task9-22-vendor-collected.png"/>
+                    <pic:cNvPr id="0" name="task9-21-diner-ready-banner.png"/>
                     <pic:cNvPicPr/>
                   </pic:nvPicPr>
                   <pic:blipFill>
@@ -18215,9 +18189,14 @@
         <w:spacing w:after="240"/>
       </w:pPr>
       <w:r>
-        <w:t>Figure F41. The vendor detail after Mark collected: terminal, read-only notice</w:t>
+        <w:t>Figure F40. The Ready-for-collection banner on the diner's tracking page after Mark ready</w:t>
         <w:br/>
-        <w:t>Source: docs/evidence/screenshots/task9-22-vendor-collected.png</w:t>
+        <w:t>Source: docs/evidence/screenshots/task9-21-diner-ready-banner.png</w:t>
+      </w:r>
+    </w:p>
+    <w:p>
+      <w:r>
+        <w:br w:type="page"/>
       </w:r>
     </w:p>
     <w:p>
@@ -18229,7 +18208,7 @@
         <w:drawing>
           <wp:inline xmlns:a="http://schemas.openxmlformats.org/drawingml/2006/main" xmlns:pic="http://schemas.openxmlformats.org/drawingml/2006/picture">
             <wp:extent cx="6080760" cy="3420428"/>
-            <wp:docPr id="42" name="Picture 42"/>
+            <wp:docPr id="41" name="Picture 41"/>
             <wp:cNvGraphicFramePr>
               <a:graphicFrameLocks noChangeAspect="1"/>
             </wp:cNvGraphicFramePr>
@@ -18237,7 +18216,7 @@
               <a:graphicData uri="http://schemas.openxmlformats.org/drawingml/2006/picture">
                 <pic:pic>
                   <pic:nvPicPr>
-                    <pic:cNvPr id="0" name="task9-23-diner-collected.png"/>
+                    <pic:cNvPr id="0" name="task9-22-vendor-collected.png"/>
                     <pic:cNvPicPr/>
                   </pic:nvPicPr>
                   <pic:blipFill>
@@ -18267,14 +18246,9 @@
         <w:spacing w:after="240"/>
       </w:pPr>
       <w:r>
-        <w:t>Figure F42. The diner's terminal Collected notice for the same order</w:t>
+        <w:t>Figure F41. The vendor detail after Mark collected: terminal, read-only notice</w:t>
         <w:br/>
-        <w:t>Source: docs/evidence/screenshots/task9-23-diner-collected.png</w:t>
-      </w:r>
-    </w:p>
-    <w:p>
-      <w:r>
-        <w:br w:type="page"/>
+        <w:t>Source: docs/evidence/screenshots/task9-22-vendor-collected.png</w:t>
       </w:r>
     </w:p>
     <w:p>
@@ -18286,7 +18260,7 @@
         <w:drawing>
           <wp:inline xmlns:a="http://schemas.openxmlformats.org/drawingml/2006/main" xmlns:pic="http://schemas.openxmlformats.org/drawingml/2006/picture">
             <wp:extent cx="6080760" cy="3420428"/>
-            <wp:docPr id="43" name="Picture 43"/>
+            <wp:docPr id="42" name="Picture 42"/>
             <wp:cNvGraphicFramePr>
               <a:graphicFrameLocks noChangeAspect="1"/>
             </wp:cNvGraphicFramePr>
@@ -18294,7 +18268,7 @@
               <a:graphicData uri="http://schemas.openxmlformats.org/drawingml/2006/picture">
                 <pic:pic>
                   <pic:nvPicPr>
-                    <pic:cNvPr id="0" name="task9-24-cancel-refund.png"/>
+                    <pic:cNvPr id="0" name="task9-23-diner-collected.png"/>
                     <pic:cNvPicPr/>
                   </pic:nvPicPr>
                   <pic:blipFill>
@@ -18324,9 +18298,14 @@
         <w:spacing w:after="240"/>
       </w:pPr>
       <w:r>
-        <w:t>Figure F43. The vendor rejecting the seeded Pending order: Cancelled badge, refund shown</w:t>
+        <w:t>Figure F42. The diner's terminal Collected notice for the same order</w:t>
         <w:br/>
-        <w:t>Source: docs/evidence/screenshots/task9-24-cancel-refund.png</w:t>
+        <w:t>Source: docs/evidence/screenshots/task9-23-diner-collected.png</w:t>
+      </w:r>
+    </w:p>
+    <w:p>
+      <w:r>
+        <w:br w:type="page"/>
       </w:r>
     </w:p>
     <w:p>
@@ -18338,7 +18317,7 @@
         <w:drawing>
           <wp:inline xmlns:a="http://schemas.openxmlformats.org/drawingml/2006/main" xmlns:pic="http://schemas.openxmlformats.org/drawingml/2006/picture">
             <wp:extent cx="6080760" cy="3420428"/>
-            <wp:docPr id="44" name="Picture 44"/>
+            <wp:docPr id="43" name="Picture 43"/>
             <wp:cNvGraphicFramePr>
               <a:graphicFrameLocks noChangeAspect="1"/>
             </wp:cNvGraphicFramePr>
@@ -18346,7 +18325,7 @@
               <a:graphicData uri="http://schemas.openxmlformats.org/drawingml/2006/picture">
                 <pic:pic>
                   <pic:nvPicPr>
-                    <pic:cNvPr id="0" name="task9-25-diner-cancelled.png"/>
+                    <pic:cNvPr id="0" name="task9-24-cancel-refund.png"/>
                     <pic:cNvPicPr/>
                   </pic:nvPicPr>
                   <pic:blipFill>
@@ -18376,14 +18355,9 @@
         <w:spacing w:after="240"/>
       </w:pPr>
       <w:r>
-        <w:t>Figure F44. The diner's cancellation notice with the refunded $13.00 amount</w:t>
+        <w:t>Figure F43. The vendor rejecting the seeded Pending order: Cancelled badge, refund shown</w:t>
         <w:br/>
-        <w:t>Source: docs/evidence/screenshots/task9-25-diner-cancelled.png</w:t>
-      </w:r>
-    </w:p>
-    <w:p>
-      <w:r>
-        <w:br w:type="page"/>
+        <w:t>Source: docs/evidence/screenshots/task9-24-cancel-refund.png</w:t>
       </w:r>
     </w:p>
     <w:p>
@@ -18395,7 +18369,7 @@
         <w:drawing>
           <wp:inline xmlns:a="http://schemas.openxmlformats.org/drawingml/2006/main" xmlns:pic="http://schemas.openxmlformats.org/drawingml/2006/picture">
             <wp:extent cx="6080760" cy="3420428"/>
-            <wp:docPr id="45" name="Picture 45"/>
+            <wp:docPr id="44" name="Picture 44"/>
             <wp:cNvGraphicFramePr>
               <a:graphicFrameLocks noChangeAspect="1"/>
             </wp:cNvGraphicFramePr>
@@ -18403,7 +18377,7 @@
               <a:graphicData uri="http://schemas.openxmlformats.org/drawingml/2006/picture">
                 <pic:pic>
                   <pic:nvPicPr>
-                    <pic:cNvPr id="0" name="task9-26-vendor-noshow.png"/>
+                    <pic:cNvPr id="0" name="task9-25-diner-cancelled.png"/>
                     <pic:cNvPicPr/>
                   </pic:nvPicPr>
                   <pic:blipFill>
@@ -18433,9 +18407,14 @@
         <w:spacing w:after="240"/>
       </w:pPr>
       <w:r>
-        <w:t>Figure F45. Mark no-show accepted past the 30-minute boundary: NoShow badge, stays-paid notice</w:t>
+        <w:t>Figure F44. The diner's cancellation notice with the refunded $13.00 amount</w:t>
         <w:br/>
-        <w:t>Source: docs/evidence/screenshots/task9-26-vendor-noshow.png</w:t>
+        <w:t>Source: docs/evidence/screenshots/task9-25-diner-cancelled.png</w:t>
+      </w:r>
+    </w:p>
+    <w:p>
+      <w:r>
+        <w:br w:type="page"/>
       </w:r>
     </w:p>
     <w:p>
@@ -18447,7 +18426,7 @@
         <w:drawing>
           <wp:inline xmlns:a="http://schemas.openxmlformats.org/drawingml/2006/main" xmlns:pic="http://schemas.openxmlformats.org/drawingml/2006/picture">
             <wp:extent cx="6080760" cy="3420428"/>
-            <wp:docPr id="46" name="Picture 46"/>
+            <wp:docPr id="45" name="Picture 45"/>
             <wp:cNvGraphicFramePr>
               <a:graphicFrameLocks noChangeAspect="1"/>
             </wp:cNvGraphicFramePr>
@@ -18455,7 +18434,7 @@
               <a:graphicData uri="http://schemas.openxmlformats.org/drawingml/2006/picture">
                 <pic:pic>
                   <pic:nvPicPr>
-                    <pic:cNvPr id="0" name="task9-27-diner-noshow.png"/>
+                    <pic:cNvPr id="0" name="task9-26-vendor-noshow.png"/>
                     <pic:cNvPicPr/>
                   </pic:nvPicPr>
                   <pic:blipFill>
@@ -18485,14 +18464,9 @@
         <w:spacing w:after="240"/>
       </w:pPr>
       <w:r>
-        <w:t>Figure F46. The diner's no-show notice ("The payment stays paid.")</w:t>
+        <w:t>Figure F45. Mark no-show accepted past the 30-minute boundary: NoShow badge, stays-paid notice</w:t>
         <w:br/>
-        <w:t>Source: docs/evidence/screenshots/task9-27-diner-noshow.png</w:t>
-      </w:r>
-    </w:p>
-    <w:p>
-      <w:r>
-        <w:br w:type="page"/>
+        <w:t>Source: docs/evidence/screenshots/task9-26-vendor-noshow.png</w:t>
       </w:r>
     </w:p>
     <w:p>
@@ -18504,7 +18478,7 @@
         <w:drawing>
           <wp:inline xmlns:a="http://schemas.openxmlformats.org/drawingml/2006/main" xmlns:pic="http://schemas.openxmlformats.org/drawingml/2006/picture">
             <wp:extent cx="6080760" cy="3420428"/>
-            <wp:docPr id="47" name="Picture 47"/>
+            <wp:docPr id="46" name="Picture 46"/>
             <wp:cNvGraphicFramePr>
               <a:graphicFrameLocks noChangeAspect="1"/>
             </wp:cNvGraphicFramePr>
@@ -18512,7 +18486,7 @@
               <a:graphicData uri="http://schemas.openxmlformats.org/drawingml/2006/picture">
                 <pic:pic>
                   <pic:nvPicPr>
-                    <pic:cNvPr id="0" name="task10-01-orders-all.png"/>
+                    <pic:cNvPr id="0" name="task9-27-diner-noshow.png"/>
                     <pic:cNvPicPr/>
                   </pic:nvPicPr>
                   <pic:blipFill>
@@ -18542,9 +18516,14 @@
         <w:spacing w:after="240"/>
       </w:pPr>
       <w:r>
-        <w:t>Figure F47. All (default): the diner's 8 own orders across all six statuses, newest-first, another diner's order absent</w:t>
+        <w:t>Figure F46. The diner's no-show notice ("The payment stays paid.")</w:t>
         <w:br/>
-        <w:t>Source: docs/evidence/screenshots/task10-01-orders-all.png</w:t>
+        <w:t>Source: docs/evidence/screenshots/task9-27-diner-noshow.png</w:t>
+      </w:r>
+    </w:p>
+    <w:p>
+      <w:r>
+        <w:br w:type="page"/>
       </w:r>
     </w:p>
     <w:p>
@@ -18556,7 +18535,7 @@
         <w:drawing>
           <wp:inline xmlns:a="http://schemas.openxmlformats.org/drawingml/2006/main" xmlns:pic="http://schemas.openxmlformats.org/drawingml/2006/picture">
             <wp:extent cx="6080760" cy="3420428"/>
-            <wp:docPr id="48" name="Picture 48"/>
+            <wp:docPr id="47" name="Picture 47"/>
             <wp:cNvGraphicFramePr>
               <a:graphicFrameLocks noChangeAspect="1"/>
             </wp:cNvGraphicFramePr>
@@ -18564,7 +18543,7 @@
               <a:graphicData uri="http://schemas.openxmlformats.org/drawingml/2006/picture">
                 <pic:pic>
                   <pic:nvPicPr>
-                    <pic:cNvPr id="0" name="task10-02-orders-current.png"/>
+                    <pic:cNvPr id="0" name="task10-01-orders-all.png"/>
                     <pic:cNvPicPr/>
                   </pic:nvPicPr>
                   <pic:blipFill>
@@ -18594,14 +18573,9 @@
         <w:spacing w:after="240"/>
       </w:pPr>
       <w:r>
-        <w:t>Figure F48. Current filter: only the 5 Pending/Preparing/Ready orders</w:t>
+        <w:t>Figure F47. All (default): the diner's 8 own orders across all six statuses, newest-first, another diner's order absent</w:t>
         <w:br/>
-        <w:t>Source: docs/evidence/screenshots/task10-02-orders-current.png</w:t>
-      </w:r>
-    </w:p>
-    <w:p>
-      <w:r>
-        <w:br w:type="page"/>
+        <w:t>Source: docs/evidence/screenshots/task10-01-orders-all.png</w:t>
       </w:r>
     </w:p>
     <w:p>
@@ -18613,7 +18587,7 @@
         <w:drawing>
           <wp:inline xmlns:a="http://schemas.openxmlformats.org/drawingml/2006/main" xmlns:pic="http://schemas.openxmlformats.org/drawingml/2006/picture">
             <wp:extent cx="6080760" cy="3420428"/>
-            <wp:docPr id="49" name="Picture 49"/>
+            <wp:docPr id="48" name="Picture 48"/>
             <wp:cNvGraphicFramePr>
               <a:graphicFrameLocks noChangeAspect="1"/>
             </wp:cNvGraphicFramePr>
@@ -18621,7 +18595,7 @@
               <a:graphicData uri="http://schemas.openxmlformats.org/drawingml/2006/picture">
                 <pic:pic>
                   <pic:nvPicPr>
-                    <pic:cNvPr id="0" name="task10-03-orders-past.png"/>
+                    <pic:cNvPr id="0" name="task10-02-orders-current.png"/>
                     <pic:cNvPicPr/>
                   </pic:nvPicPr>
                   <pic:blipFill>
@@ -18651,9 +18625,14 @@
         <w:spacing w:after="240"/>
       </w:pPr>
       <w:r>
-        <w:t>Figure F49. Past filter: exactly the 3 terminal orders, newest-first (this view never polls)</w:t>
+        <w:t>Figure F48. Current filter: only the 5 Pending/Preparing/Ready orders</w:t>
         <w:br/>
-        <w:t>Source: docs/evidence/screenshots/task10-03-orders-past.png</w:t>
+        <w:t>Source: docs/evidence/screenshots/task10-02-orders-current.png</w:t>
+      </w:r>
+    </w:p>
+    <w:p>
+      <w:r>
+        <w:br w:type="page"/>
       </w:r>
     </w:p>
     <w:p>
@@ -18665,7 +18644,7 @@
         <w:drawing>
           <wp:inline xmlns:a="http://schemas.openxmlformats.org/drawingml/2006/main" xmlns:pic="http://schemas.openxmlformats.org/drawingml/2006/picture">
             <wp:extent cx="6080760" cy="3420428"/>
-            <wp:docPr id="50" name="Picture 50"/>
+            <wp:docPr id="49" name="Picture 49"/>
             <wp:cNvGraphicFramePr>
               <a:graphicFrameLocks noChangeAspect="1"/>
             </wp:cNvGraphicFramePr>
@@ -18673,7 +18652,7 @@
               <a:graphicData uri="http://schemas.openxmlformats.org/drawingml/2006/picture">
                 <pic:pic>
                   <pic:nvPicPr>
-                    <pic:cNvPr id="0" name="task10-04-past-collected-snapshot.png"/>
+                    <pic:cNvPr id="0" name="task10-03-orders-past.png"/>
                     <pic:cNvPicPr/>
                   </pic:nvPicPr>
                   <pic:blipFill>
@@ -18703,14 +18682,9 @@
         <w:spacing w:after="240"/>
       </w:pPr>
       <w:r>
-        <w:t>Figure F50. Read-only past detail: Collected notice, stale snapshot (Grilled Chicken Rice $6.00)</w:t>
+        <w:t>Figure F49. Past filter: exactly the 3 terminal orders, newest-first (this view never polls)</w:t>
         <w:br/>
-        <w:t>Source: docs/evidence/screenshots/task10-04-past-collected-snapshot.png</w:t>
-      </w:r>
-    </w:p>
-    <w:p>
-      <w:r>
-        <w:br w:type="page"/>
+        <w:t>Source: docs/evidence/screenshots/task10-03-orders-past.png</w:t>
       </w:r>
     </w:p>
     <w:p>
@@ -18722,7 +18696,7 @@
         <w:drawing>
           <wp:inline xmlns:a="http://schemas.openxmlformats.org/drawingml/2006/main" xmlns:pic="http://schemas.openxmlformats.org/drawingml/2006/picture">
             <wp:extent cx="6080760" cy="3420428"/>
-            <wp:docPr id="51" name="Picture 51"/>
+            <wp:docPr id="50" name="Picture 50"/>
             <wp:cNvGraphicFramePr>
               <a:graphicFrameLocks noChangeAspect="1"/>
             </wp:cNvGraphicFramePr>
@@ -18730,7 +18704,7 @@
               <a:graphicData uri="http://schemas.openxmlformats.org/drawingml/2006/picture">
                 <pic:pic>
                   <pic:nvPicPr>
-                    <pic:cNvPr id="0" name="task10-05-past-cancelled-refund.png"/>
+                    <pic:cNvPr id="0" name="task10-04-past-collected-snapshot.png"/>
                     <pic:cNvPicPr/>
                   </pic:nvPicPr>
                   <pic:blipFill>
@@ -18760,9 +18734,14 @@
         <w:spacing w:after="240"/>
       </w:pPr>
       <w:r>
-        <w:t>Figure F51. Read-only past detail: Cancelled notice with the refunded $2.50 and time</w:t>
+        <w:t>Figure F50. Read-only past detail: Collected notice, stale snapshot (Grilled Chicken Rice $6.00)</w:t>
         <w:br/>
-        <w:t>Source: docs/evidence/screenshots/task10-05-past-cancelled-refund.png</w:t>
+        <w:t>Source: docs/evidence/screenshots/task10-04-past-collected-snapshot.png</w:t>
+      </w:r>
+    </w:p>
+    <w:p>
+      <w:r>
+        <w:br w:type="page"/>
       </w:r>
     </w:p>
     <w:p>
@@ -18774,7 +18753,7 @@
         <w:drawing>
           <wp:inline xmlns:a="http://schemas.openxmlformats.org/drawingml/2006/main" xmlns:pic="http://schemas.openxmlformats.org/drawingml/2006/picture">
             <wp:extent cx="6080760" cy="3420428"/>
-            <wp:docPr id="52" name="Picture 52"/>
+            <wp:docPr id="51" name="Picture 51"/>
             <wp:cNvGraphicFramePr>
               <a:graphicFrameLocks noChangeAspect="1"/>
             </wp:cNvGraphicFramePr>
@@ -18782,7 +18761,7 @@
               <a:graphicData uri="http://schemas.openxmlformats.org/drawingml/2006/picture">
                 <pic:pic>
                   <pic:nvPicPr>
-                    <pic:cNvPr id="0" name="task10-06-current-snapshot-after-reprice.png"/>
+                    <pic:cNvPr id="0" name="task10-05-past-cancelled-refund.png"/>
                     <pic:cNvPicPr/>
                   </pic:nvPicPr>
                   <pic:blipFill>
@@ -18812,14 +18791,9 @@
         <w:spacing w:after="240"/>
       </w:pPr>
       <w:r>
-        <w:t>Figure F52. An in-progress order keeping its $13.00 snapshot total after the menu item was live-repriced</w:t>
+        <w:t>Figure F51. Read-only past detail: Cancelled notice with the refunded $2.50 and time</w:t>
         <w:br/>
-        <w:t>Source: docs/evidence/screenshots/task10-06-current-snapshot-after-reprice.png</w:t>
-      </w:r>
-    </w:p>
-    <w:p>
-      <w:r>
-        <w:br w:type="page"/>
+        <w:t>Source: docs/evidence/screenshots/task10-05-past-cancelled-refund.png</w:t>
       </w:r>
     </w:p>
     <w:p>
@@ -18831,7 +18805,7 @@
         <w:drawing>
           <wp:inline xmlns:a="http://schemas.openxmlformats.org/drawingml/2006/main" xmlns:pic="http://schemas.openxmlformats.org/drawingml/2006/picture">
             <wp:extent cx="6080760" cy="3420428"/>
-            <wp:docPr id="53" name="Picture 53"/>
+            <wp:docPr id="52" name="Picture 52"/>
             <wp:cNvGraphicFramePr>
               <a:graphicFrameLocks noChangeAspect="1"/>
             </wp:cNvGraphicFramePr>
@@ -18839,7 +18813,7 @@
               <a:graphicData uri="http://schemas.openxmlformats.org/drawingml/2006/picture">
                 <pic:pic>
                   <pic:nvPicPr>
-                    <pic:cNvPr id="0" name="task10-07-empty-diner-all.png"/>
+                    <pic:cNvPr id="0" name="task10-06-current-snapshot-after-reprice.png"/>
                     <pic:cNvPicPr/>
                   </pic:nvPicPr>
                   <pic:blipFill>
@@ -18869,9 +18843,14 @@
         <w:spacing w:after="240"/>
       </w:pPr>
       <w:r>
-        <w:t>Figure F53. An order-free diner: "You have no orders yet." with the Browse open stalls link</w:t>
+        <w:t>Figure F52. An in-progress order keeping its $13.00 snapshot total after the menu item was live-repriced</w:t>
         <w:br/>
-        <w:t>Source: docs/evidence/screenshots/task10-07-empty-diner-all.png</w:t>
+        <w:t>Source: docs/evidence/screenshots/task10-06-current-snapshot-after-reprice.png</w:t>
+      </w:r>
+    </w:p>
+    <w:p>
+      <w:r>
+        <w:br w:type="page"/>
       </w:r>
     </w:p>
     <w:p>
@@ -18883,7 +18862,7 @@
         <w:drawing>
           <wp:inline xmlns:a="http://schemas.openxmlformats.org/drawingml/2006/main" xmlns:pic="http://schemas.openxmlformats.org/drawingml/2006/picture">
             <wp:extent cx="6080760" cy="3420428"/>
-            <wp:docPr id="54" name="Picture 54"/>
+            <wp:docPr id="53" name="Picture 53"/>
             <wp:cNvGraphicFramePr>
               <a:graphicFrameLocks noChangeAspect="1"/>
             </wp:cNvGraphicFramePr>
@@ -18891,7 +18870,7 @@
               <a:graphicData uri="http://schemas.openxmlformats.org/drawingml/2006/picture">
                 <pic:pic>
                   <pic:nvPicPr>
-                    <pic:cNvPr id="0" name="task10-08-empty-diner-past.png"/>
+                    <pic:cNvPr id="0" name="task10-07-empty-diner-all.png"/>
                     <pic:cNvPicPr/>
                   </pic:nvPicPr>
                   <pic:blipFill>
@@ -18921,14 +18900,9 @@
         <w:spacing w:after="240"/>
       </w:pPr>
       <w:r>
-        <w:t>Figure F54. The same diner on Past: "No past orders yet."</w:t>
+        <w:t>Figure F53. An order-free diner: "You have no orders yet." with the Browse open stalls link</w:t>
         <w:br/>
-        <w:t>Source: docs/evidence/screenshots/task10-08-empty-diner-past.png</w:t>
-      </w:r>
-    </w:p>
-    <w:p>
-      <w:r>
-        <w:br w:type="page"/>
+        <w:t>Source: docs/evidence/screenshots/task10-07-empty-diner-all.png</w:t>
       </w:r>
     </w:p>
     <w:p>
@@ -18940,7 +18914,7 @@
         <w:drawing>
           <wp:inline xmlns:a="http://schemas.openxmlformats.org/drawingml/2006/main" xmlns:pic="http://schemas.openxmlformats.org/drawingml/2006/picture">
             <wp:extent cx="6080760" cy="3420428"/>
-            <wp:docPr id="55" name="Picture 55"/>
+            <wp:docPr id="54" name="Picture 54"/>
             <wp:cNvGraphicFramePr>
               <a:graphicFrameLocks noChangeAspect="1"/>
             </wp:cNvGraphicFramePr>
@@ -18948,7 +18922,7 @@
               <a:graphicData uri="http://schemas.openxmlformats.org/drawingml/2006/picture">
                 <pic:pic>
                   <pic:nvPicPr>
-                    <pic:cNvPr id="0" name="task11-01-diner-payment-success-pending.png"/>
+                    <pic:cNvPr id="0" name="task10-08-empty-diner-past.png"/>
                     <pic:cNvPicPr/>
                   </pic:nvPicPr>
                   <pic:blipFill>
@@ -18978,9 +18952,14 @@
         <w:spacing w:after="240"/>
       </w:pPr>
       <w:r>
-        <w:t>Figure F55. task11 01 diner payment success pending</w:t>
+        <w:t>Figure F54. The same diner on Past: "No past orders yet."</w:t>
         <w:br/>
-        <w:t>Source: docs/evidence/screenshots/task11-01-diner-payment-success-pending.png</w:t>
+        <w:t>Source: docs/evidence/screenshots/task10-08-empty-diner-past.png</w:t>
+      </w:r>
+    </w:p>
+    <w:p>
+      <w:r>
+        <w:br w:type="page"/>
       </w:r>
     </w:p>
     <w:p>
@@ -18992,7 +18971,7 @@
         <w:drawing>
           <wp:inline xmlns:a="http://schemas.openxmlformats.org/drawingml/2006/main" xmlns:pic="http://schemas.openxmlformats.org/drawingml/2006/picture">
             <wp:extent cx="6080760" cy="3420428"/>
-            <wp:docPr id="56" name="Picture 56"/>
+            <wp:docPr id="55" name="Picture 55"/>
             <wp:cNvGraphicFramePr>
               <a:graphicFrameLocks noChangeAspect="1"/>
             </wp:cNvGraphicFramePr>
@@ -19000,7 +18979,7 @@
               <a:graphicData uri="http://schemas.openxmlformats.org/drawingml/2006/picture">
                 <pic:pic>
                   <pic:nvPicPr>
-                    <pic:cNvPr id="0" name="task11-02-diner-pending.png"/>
+                    <pic:cNvPr id="0" name="task11-01-diner-payment-success-pending.png"/>
                     <pic:cNvPicPr/>
                   </pic:nvPicPr>
                   <pic:blipFill>
@@ -19030,14 +19009,9 @@
         <w:spacing w:after="240"/>
       </w:pPr>
       <w:r>
-        <w:t>Figure F56. task11 02 diner pending</w:t>
+        <w:t>Figure F55. task11 01 diner payment success pending</w:t>
         <w:br/>
-        <w:t>Source: docs/evidence/screenshots/task11-02-diner-pending.png</w:t>
-      </w:r>
-    </w:p>
-    <w:p>
-      <w:r>
-        <w:br w:type="page"/>
+        <w:t>Source: docs/evidence/screenshots/task11-01-diner-payment-success-pending.png</w:t>
       </w:r>
     </w:p>
     <w:p>
@@ -19049,7 +19023,7 @@
         <w:drawing>
           <wp:inline xmlns:a="http://schemas.openxmlformats.org/drawingml/2006/main" xmlns:pic="http://schemas.openxmlformats.org/drawingml/2006/picture">
             <wp:extent cx="6080760" cy="3420428"/>
-            <wp:docPr id="57" name="Picture 57"/>
+            <wp:docPr id="56" name="Picture 56"/>
             <wp:cNvGraphicFramePr>
               <a:graphicFrameLocks noChangeAspect="1"/>
             </wp:cNvGraphicFramePr>
@@ -19057,7 +19031,7 @@
               <a:graphicData uri="http://schemas.openxmlformats.org/drawingml/2006/picture">
                 <pic:pic>
                   <pic:nvPicPr>
-                    <pic:cNvPr id="0" name="task11-03-vendor-queue-with-new-pending-order.png"/>
+                    <pic:cNvPr id="0" name="task11-02-diner-pending.png"/>
                     <pic:cNvPicPr/>
                   </pic:nvPicPr>
                   <pic:blipFill>
@@ -19087,9 +19061,14 @@
         <w:spacing w:after="240"/>
       </w:pPr>
       <w:r>
-        <w:t>Figure F57. task11 03 vendor queue with new pending order</w:t>
+        <w:t>Figure F56. task11 02 diner pending</w:t>
         <w:br/>
-        <w:t>Source: docs/evidence/screenshots/task11-03-vendor-queue-with-new-pending-order.png</w:t>
+        <w:t>Source: docs/evidence/screenshots/task11-02-diner-pending.png</w:t>
+      </w:r>
+    </w:p>
+    <w:p>
+      <w:r>
+        <w:br w:type="page"/>
       </w:r>
     </w:p>
     <w:p>
@@ -19101,7 +19080,7 @@
         <w:drawing>
           <wp:inline xmlns:a="http://schemas.openxmlformats.org/drawingml/2006/main" xmlns:pic="http://schemas.openxmlformats.org/drawingml/2006/picture">
             <wp:extent cx="6080760" cy="3420428"/>
-            <wp:docPr id="58" name="Picture 58"/>
+            <wp:docPr id="57" name="Picture 57"/>
             <wp:cNvGraphicFramePr>
               <a:graphicFrameLocks noChangeAspect="1"/>
             </wp:cNvGraphicFramePr>
@@ -19109,7 +19088,7 @@
               <a:graphicData uri="http://schemas.openxmlformats.org/drawingml/2006/picture">
                 <pic:pic>
                   <pic:nvPicPr>
-                    <pic:cNvPr id="0" name="task11-04-vendor-pending.png"/>
+                    <pic:cNvPr id="0" name="task11-03-vendor-queue-with-new-pending-order.png"/>
                     <pic:cNvPicPr/>
                   </pic:nvPicPr>
                   <pic:blipFill>
@@ -19139,14 +19118,9 @@
         <w:spacing w:after="240"/>
       </w:pPr>
       <w:r>
-        <w:t>Figure F58. task11 04 vendor pending</w:t>
+        <w:t>Figure F57. task11 03 vendor queue with new pending order</w:t>
         <w:br/>
-        <w:t>Source: docs/evidence/screenshots/task11-04-vendor-pending.png</w:t>
-      </w:r>
-    </w:p>
-    <w:p>
-      <w:r>
-        <w:br w:type="page"/>
+        <w:t>Source: docs/evidence/screenshots/task11-03-vendor-queue-with-new-pending-order.png</w:t>
       </w:r>
     </w:p>
     <w:p>
@@ -19158,7 +19132,7 @@
         <w:drawing>
           <wp:inline xmlns:a="http://schemas.openxmlformats.org/drawingml/2006/main" xmlns:pic="http://schemas.openxmlformats.org/drawingml/2006/picture">
             <wp:extent cx="6080760" cy="3420428"/>
-            <wp:docPr id="59" name="Picture 59"/>
+            <wp:docPr id="58" name="Picture 58"/>
             <wp:cNvGraphicFramePr>
               <a:graphicFrameLocks noChangeAspect="1"/>
             </wp:cNvGraphicFramePr>
@@ -19166,7 +19140,7 @@
               <a:graphicData uri="http://schemas.openxmlformats.org/drawingml/2006/picture">
                 <pic:pic>
                   <pic:nvPicPr>
-                    <pic:cNvPr id="0" name="task11-05-vendor-preparing.png"/>
+                    <pic:cNvPr id="0" name="task11-04-vendor-pending.png"/>
                     <pic:cNvPicPr/>
                   </pic:nvPicPr>
                   <pic:blipFill>
@@ -19196,9 +19170,14 @@
         <w:spacing w:after="240"/>
       </w:pPr>
       <w:r>
-        <w:t>Figure F59. task11 05 vendor preparing</w:t>
+        <w:t>Figure F58. task11 04 vendor pending</w:t>
         <w:br/>
-        <w:t>Source: docs/evidence/screenshots/task11-05-vendor-preparing.png</w:t>
+        <w:t>Source: docs/evidence/screenshots/task11-04-vendor-pending.png</w:t>
+      </w:r>
+    </w:p>
+    <w:p>
+      <w:r>
+        <w:br w:type="page"/>
       </w:r>
     </w:p>
     <w:p>
@@ -19210,7 +19189,7 @@
         <w:drawing>
           <wp:inline xmlns:a="http://schemas.openxmlformats.org/drawingml/2006/main" xmlns:pic="http://schemas.openxmlformats.org/drawingml/2006/picture">
             <wp:extent cx="6080760" cy="3420428"/>
-            <wp:docPr id="60" name="Picture 60"/>
+            <wp:docPr id="59" name="Picture 59"/>
             <wp:cNvGraphicFramePr>
               <a:graphicFrameLocks noChangeAspect="1"/>
             </wp:cNvGraphicFramePr>
@@ -19218,7 +19197,7 @@
               <a:graphicData uri="http://schemas.openxmlformats.org/drawingml/2006/picture">
                 <pic:pic>
                   <pic:nvPicPr>
-                    <pic:cNvPr id="0" name="task11-06-diner-preparing.png"/>
+                    <pic:cNvPr id="0" name="task11-05-vendor-preparing.png"/>
                     <pic:cNvPicPr/>
                   </pic:nvPicPr>
                   <pic:blipFill>
@@ -19248,14 +19227,9 @@
         <w:spacing w:after="240"/>
       </w:pPr>
       <w:r>
-        <w:t>Figure F60. task11 06 diner preparing</w:t>
+        <w:t>Figure F59. task11 05 vendor preparing</w:t>
         <w:br/>
-        <w:t>Source: docs/evidence/screenshots/task11-06-diner-preparing.png</w:t>
-      </w:r>
-    </w:p>
-    <w:p>
-      <w:r>
-        <w:br w:type="page"/>
+        <w:t>Source: docs/evidence/screenshots/task11-05-vendor-preparing.png</w:t>
       </w:r>
     </w:p>
     <w:p>
@@ -19267,7 +19241,7 @@
         <w:drawing>
           <wp:inline xmlns:a="http://schemas.openxmlformats.org/drawingml/2006/main" xmlns:pic="http://schemas.openxmlformats.org/drawingml/2006/picture">
             <wp:extent cx="6080760" cy="3420428"/>
-            <wp:docPr id="61" name="Picture 61"/>
+            <wp:docPr id="60" name="Picture 60"/>
             <wp:cNvGraphicFramePr>
               <a:graphicFrameLocks noChangeAspect="1"/>
             </wp:cNvGraphicFramePr>
@@ -19275,7 +19249,7 @@
               <a:graphicData uri="http://schemas.openxmlformats.org/drawingml/2006/picture">
                 <pic:pic>
                   <pic:nvPicPr>
-                    <pic:cNvPr id="0" name="task11-07-vendor-ready.png"/>
+                    <pic:cNvPr id="0" name="task11-06-diner-preparing.png"/>
                     <pic:cNvPicPr/>
                   </pic:nvPicPr>
                   <pic:blipFill>
@@ -19305,9 +19279,14 @@
         <w:spacing w:after="240"/>
       </w:pPr>
       <w:r>
-        <w:t>Figure F61. task11 07 vendor ready</w:t>
+        <w:t>Figure F60. task11 06 diner preparing</w:t>
         <w:br/>
-        <w:t>Source: docs/evidence/screenshots/task11-07-vendor-ready.png</w:t>
+        <w:t>Source: docs/evidence/screenshots/task11-06-diner-preparing.png</w:t>
+      </w:r>
+    </w:p>
+    <w:p>
+      <w:r>
+        <w:br w:type="page"/>
       </w:r>
     </w:p>
     <w:p>
@@ -19319,7 +19298,7 @@
         <w:drawing>
           <wp:inline xmlns:a="http://schemas.openxmlformats.org/drawingml/2006/main" xmlns:pic="http://schemas.openxmlformats.org/drawingml/2006/picture">
             <wp:extent cx="6080760" cy="3420428"/>
-            <wp:docPr id="62" name="Picture 62"/>
+            <wp:docPr id="61" name="Picture 61"/>
             <wp:cNvGraphicFramePr>
               <a:graphicFrameLocks noChangeAspect="1"/>
             </wp:cNvGraphicFramePr>
@@ -19327,7 +19306,7 @@
               <a:graphicData uri="http://schemas.openxmlformats.org/drawingml/2006/picture">
                 <pic:pic>
                   <pic:nvPicPr>
-                    <pic:cNvPr id="0" name="task11-08-diner-ready.png"/>
+                    <pic:cNvPr id="0" name="task11-07-vendor-ready.png"/>
                     <pic:cNvPicPr/>
                   </pic:nvPicPr>
                   <pic:blipFill>
@@ -19357,14 +19336,9 @@
         <w:spacing w:after="240"/>
       </w:pPr>
       <w:r>
-        <w:t>Figure F62. task11 08 diner ready</w:t>
+        <w:t>Figure F61. task11 07 vendor ready</w:t>
         <w:br/>
-        <w:t>Source: docs/evidence/screenshots/task11-08-diner-ready.png</w:t>
-      </w:r>
-    </w:p>
-    <w:p>
-      <w:r>
-        <w:br w:type="page"/>
+        <w:t>Source: docs/evidence/screenshots/task11-07-vendor-ready.png</w:t>
       </w:r>
     </w:p>
     <w:p>
@@ -19376,7 +19350,7 @@
         <w:drawing>
           <wp:inline xmlns:a="http://schemas.openxmlformats.org/drawingml/2006/main" xmlns:pic="http://schemas.openxmlformats.org/drawingml/2006/picture">
             <wp:extent cx="6080760" cy="3420428"/>
-            <wp:docPr id="63" name="Picture 63"/>
+            <wp:docPr id="62" name="Picture 62"/>
             <wp:cNvGraphicFramePr>
               <a:graphicFrameLocks noChangeAspect="1"/>
             </wp:cNvGraphicFramePr>
@@ -19384,7 +19358,7 @@
               <a:graphicData uri="http://schemas.openxmlformats.org/drawingml/2006/picture">
                 <pic:pic>
                   <pic:nvPicPr>
-                    <pic:cNvPr id="0" name="task11-09-vendor-collected.png"/>
+                    <pic:cNvPr id="0" name="task11-08-diner-ready.png"/>
                     <pic:cNvPicPr/>
                   </pic:nvPicPr>
                   <pic:blipFill>
@@ -19414,9 +19388,14 @@
         <w:spacing w:after="240"/>
       </w:pPr>
       <w:r>
-        <w:t>Figure F63. task11 09 vendor collected</w:t>
+        <w:t>Figure F62. task11 08 diner ready</w:t>
         <w:br/>
-        <w:t>Source: docs/evidence/screenshots/task11-09-vendor-collected.png</w:t>
+        <w:t>Source: docs/evidence/screenshots/task11-08-diner-ready.png</w:t>
+      </w:r>
+    </w:p>
+    <w:p>
+      <w:r>
+        <w:br w:type="page"/>
       </w:r>
     </w:p>
     <w:p>
@@ -19428,7 +19407,7 @@
         <w:drawing>
           <wp:inline xmlns:a="http://schemas.openxmlformats.org/drawingml/2006/main" xmlns:pic="http://schemas.openxmlformats.org/drawingml/2006/picture">
             <wp:extent cx="6080760" cy="3420428"/>
-            <wp:docPr id="64" name="Picture 64"/>
+            <wp:docPr id="63" name="Picture 63"/>
             <wp:cNvGraphicFramePr>
               <a:graphicFrameLocks noChangeAspect="1"/>
             </wp:cNvGraphicFramePr>
@@ -19436,7 +19415,7 @@
               <a:graphicData uri="http://schemas.openxmlformats.org/drawingml/2006/picture">
                 <pic:pic>
                   <pic:nvPicPr>
-                    <pic:cNvPr id="0" name="task11-10-diner-collected.png"/>
+                    <pic:cNvPr id="0" name="task11-09-vendor-collected.png"/>
                     <pic:cNvPicPr/>
                   </pic:nvPicPr>
                   <pic:blipFill>
@@ -19466,14 +19445,9 @@
         <w:spacing w:after="240"/>
       </w:pPr>
       <w:r>
-        <w:t>Figure F64. task11 10 diner collected</w:t>
+        <w:t>Figure F63. task11 09 vendor collected</w:t>
         <w:br/>
-        <w:t>Source: docs/evidence/screenshots/task11-10-diner-collected.png</w:t>
-      </w:r>
-    </w:p>
-    <w:p>
-      <w:r>
-        <w:br w:type="page"/>
+        <w:t>Source: docs/evidence/screenshots/task11-09-vendor-collected.png</w:t>
       </w:r>
     </w:p>
     <w:p>
@@ -19485,7 +19459,7 @@
         <w:drawing>
           <wp:inline xmlns:a="http://schemas.openxmlformats.org/drawingml/2006/main" xmlns:pic="http://schemas.openxmlformats.org/drawingml/2006/picture">
             <wp:extent cx="6080760" cy="3420428"/>
-            <wp:docPr id="65" name="Picture 65"/>
+            <wp:docPr id="64" name="Picture 64"/>
             <wp:cNvGraphicFramePr>
               <a:graphicFrameLocks noChangeAspect="1"/>
             </wp:cNvGraphicFramePr>
@@ -19493,7 +19467,7 @@
               <a:graphicData uri="http://schemas.openxmlformats.org/drawingml/2006/picture">
                 <pic:pic>
                   <pic:nvPicPr>
-                    <pic:cNvPr id="0" name="task11-11-diner-past-list.png"/>
+                    <pic:cNvPr id="0" name="task11-10-diner-collected.png"/>
                     <pic:cNvPicPr/>
                   </pic:nvPicPr>
                   <pic:blipFill>
@@ -19523,6 +19497,63 @@
         <w:spacing w:after="240"/>
       </w:pPr>
       <w:r>
+        <w:t>Figure F64. task11 10 diner collected</w:t>
+        <w:br/>
+        <w:t>Source: docs/evidence/screenshots/task11-10-diner-collected.png</w:t>
+      </w:r>
+    </w:p>
+    <w:p>
+      <w:r>
+        <w:br w:type="page"/>
+      </w:r>
+    </w:p>
+    <w:p>
+      <w:pPr>
+        <w:keepNext/>
+        <w:jc w:val="center"/>
+      </w:pPr>
+      <w:r>
+        <w:drawing>
+          <wp:inline xmlns:a="http://schemas.openxmlformats.org/drawingml/2006/main" xmlns:pic="http://schemas.openxmlformats.org/drawingml/2006/picture">
+            <wp:extent cx="6080760" cy="3420428"/>
+            <wp:docPr id="65" name="Picture 65"/>
+            <wp:cNvGraphicFramePr>
+              <a:graphicFrameLocks noChangeAspect="1"/>
+            </wp:cNvGraphicFramePr>
+            <a:graphic>
+              <a:graphicData uri="http://schemas.openxmlformats.org/drawingml/2006/picture">
+                <pic:pic>
+                  <pic:nvPicPr>
+                    <pic:cNvPr id="0" name="task11-11-diner-past-list.png"/>
+                    <pic:cNvPicPr/>
+                  </pic:nvPicPr>
+                  <pic:blipFill>
+                    <a:blip r:embed="rId83"/>
+                    <a:stretch>
+                      <a:fillRect/>
+                    </a:stretch>
+                  </pic:blipFill>
+                  <pic:spPr>
+                    <a:xfrm>
+                      <a:off x="0" y="0"/>
+                      <a:ext cx="6080760" cy="3420428"/>
+                    </a:xfrm>
+                    <a:prstGeom prst="rect"/>
+                  </pic:spPr>
+                </pic:pic>
+              </a:graphicData>
+            </a:graphic>
+          </wp:inline>
+        </w:drawing>
+      </w:r>
+    </w:p>
+    <w:p>
+      <w:pPr>
+        <w:pStyle w:val="Caption"/>
+        <w:keepLines/>
+        <w:spacing w:after="240"/>
+      </w:pPr>
+      <w:r>
         <w:t>Figure F65. task11 11 diner past list</w:t>
         <w:br/>
         <w:t>Source: docs/evidence/screenshots/task11-11-diner-past-list.png</w:t>
@@ -20063,7 +20094,7 @@
         </w:rPr>
         <w:t xml:space="preserve">, and passed the same tests. Final frontend/browser checks and their actual outcomes are recorded in </w:t>
       </w:r>
-      <w:hyperlink r:id="rId83">
+      <w:hyperlink r:id="rId84">
         <w:r>
           <w:rPr>
             <w:color w:val="174469"/>
@@ -20371,7 +20402,7 @@
         </w:rPr>
         <w:t xml:space="preserve">Output used: the prospective </w:t>
       </w:r>
-      <w:hyperlink r:id="rId84">
+      <w:hyperlink r:id="rId85">
         <w:r>
           <w:rPr>
             <w:color w:val="174469"/>
@@ -20436,7 +20467,7 @@
         </w:rPr>
         <w:t xml:space="preserve">Output used: six reviewed personal Qwen skills, persistent workspace/backend/frontend QWEN.md briefings, isolated document/video helper dependencies, an updated implementation handoff and a </w:t>
       </w:r>
-      <w:hyperlink r:id="rId85">
+      <w:hyperlink r:id="rId86">
         <w:r>
           <w:rPr>
             <w:color w:val="174469"/>
@@ -21880,7 +21911,7 @@
         </w:rPr>
         <w:t xml:space="preserve">The two planning requests below generated/reviewed planning text only. Subsequent request metadata and the available current plaintext requests are in </w:t>
       </w:r>
-      <w:hyperlink r:id="rId86">
+      <w:hyperlink r:id="rId87">
         <w:r>
           <w:rPr>
             <w:color w:val="174469"/>
@@ -22657,6 +22688,270 @@
       </w:r>
     </w:p>
     <w:p>
+      <w:pPr>
+        <w:pStyle w:val="Heading2"/>
+      </w:pPr>
+      <w:r>
+        <w:rPr>
+          <w:b w:val="0"/>
+          <w:i w:val="0"/>
+        </w:rPr>
+        <w:t>P19 — GitHub publishing and authentication repair</w:t>
+      </w:r>
+    </w:p>
+    <w:p>
+      <w:pPr/>
+      <w:r>
+        <w:rPr>
+          <w:b w:val="0"/>
+          <w:i w:val="0"/>
+        </w:rPr>
+        <w:t>Exact user prompt:</w:t>
+      </w:r>
+    </w:p>
+    <w:p>
+      <w:pPr>
+        <w:spacing w:after="0" w:line="240" w:lineRule="auto"/>
+      </w:pPr>
+      <w:r>
+        <w:rPr>
+          <w:rFonts w:ascii="Courier New" w:hAnsi="Courier New"/>
+          <w:sz w:val="16"/>
+        </w:rPr>
+        <w:t>{</w:t>
+      </w:r>
+    </w:p>
+    <w:p>
+      <w:pPr>
+        <w:spacing w:after="0" w:line="240" w:lineRule="auto"/>
+      </w:pPr>
+      <w:r>
+        <w:rPr>
+          <w:rFonts w:ascii="Courier New" w:hAnsi="Courier New"/>
+          <w:sz w:val="16"/>
+        </w:rPr>
+        <w:t xml:space="preserve">  "prompt": "i want to push code but i encounter\n\n((.venv) ) (base) arellakoo@Arellas-MacBook-Air backend % git push --set-upstream origin setup/lab-adaptation        \nremote: Permission to ArellaKoo/devops-assignment-BE.git denied to Arella-Koo.\nfatal: unable to access 'https://github.com/ArellaKoo/devops-assignment-BE.git/': The requested URL returned error: 403\n\ncn you help me push"</w:t>
+      </w:r>
+    </w:p>
+    <w:p>
+      <w:pPr>
+        <w:spacing w:after="0" w:line="240" w:lineRule="auto"/>
+      </w:pPr>
+      <w:r>
+        <w:rPr>
+          <w:rFonts w:ascii="Courier New" w:hAnsi="Courier New"/>
+          <w:sz w:val="16"/>
+        </w:rPr>
+        <w:t>}</w:t>
+      </w:r>
+    </w:p>
+    <w:p>
+      <w:pPr/>
+      <w:r>
+        <w:rPr>
+          <w:b w:val="0"/>
+          <w:i w:val="0"/>
+        </w:rPr>
+        <w:t xml:space="preserve">The user's browser-login response was “done”. Codex reproduced the 403, verified that the cached credential authenticated as </w:t>
+      </w:r>
+      <w:r>
+        <w:rPr>
+          <w:rFonts w:ascii="Courier New" w:hAnsi="Courier New"/>
+          <w:b w:val="0"/>
+          <w:i w:val="0"/>
+          <w:sz w:val="18"/>
+        </w:rPr>
+        <w:t>Arella-Koo</w:t>
+      </w:r>
+      <w:r>
+        <w:rPr>
+          <w:b w:val="0"/>
+          <w:i w:val="0"/>
+        </w:rPr>
+        <w:t xml:space="preserve">, and installed the official GitHub CLI v2.102.0 ARM64 binary under the ignored workspace tooling directory after release-archive SHA-256 verification. The user completed browser authentication as </w:t>
+      </w:r>
+      <w:r>
+        <w:rPr>
+          <w:rFonts w:ascii="Courier New" w:hAnsi="Courier New"/>
+          <w:b w:val="0"/>
+          <w:i w:val="0"/>
+          <w:sz w:val="18"/>
+        </w:rPr>
+        <w:t>ArellaKoo</w:t>
+      </w:r>
+      <w:r>
+        <w:rPr>
+          <w:b w:val="0"/>
+          <w:i w:val="0"/>
+        </w:rPr>
+        <w:t xml:space="preserve">. Repository-scoped credential helpers select this account, while the previous credential remains stored. Both repositories were pushed on </w:t>
+      </w:r>
+      <w:r>
+        <w:rPr>
+          <w:rFonts w:ascii="Courier New" w:hAnsi="Courier New"/>
+          <w:b w:val="0"/>
+          <w:i w:val="0"/>
+          <w:sz w:val="18"/>
+        </w:rPr>
+        <w:t>setup/lab-adaptation</w:t>
+      </w:r>
+      <w:r>
+        <w:rPr>
+          <w:b w:val="0"/>
+          <w:i w:val="0"/>
+        </w:rPr>
+        <w:t xml:space="preserve">; remote heads matched backend </w:t>
+      </w:r>
+      <w:r>
+        <w:rPr>
+          <w:rFonts w:ascii="Courier New" w:hAnsi="Courier New"/>
+          <w:b w:val="0"/>
+          <w:i w:val="0"/>
+          <w:sz w:val="18"/>
+        </w:rPr>
+        <w:t>4c26ee9</w:t>
+      </w:r>
+      <w:r>
+        <w:rPr>
+          <w:b w:val="0"/>
+          <w:i w:val="0"/>
+        </w:rPr>
+        <w:t xml:space="preserve"> and frontend </w:t>
+      </w:r>
+      <w:r>
+        <w:rPr>
+          <w:rFonts w:ascii="Courier New" w:hAnsi="Courier New"/>
+          <w:b w:val="0"/>
+          <w:i w:val="0"/>
+          <w:sz w:val="18"/>
+        </w:rPr>
+        <w:t>d2a9a1c</w:t>
+      </w:r>
+      <w:r>
+        <w:rPr>
+          <w:b w:val="0"/>
+          <w:i w:val="0"/>
+        </w:rPr>
+        <w:t>, with zero ahead/behind and clean working directories. An anonymous full MP4 download returned 200 and matched the local video hash. No password/token contents were printed or committed; no force push, deletion, deployment or Canvas submission was performed. This later request supersedes the earlier boundary that left publishing unauthorised.</w:t>
+      </w:r>
+    </w:p>
+    <w:p>
+      <w:pPr>
+        <w:pStyle w:val="Heading2"/>
+      </w:pPr>
+      <w:r>
+        <w:rPr>
+          <w:b w:val="0"/>
+          <w:i w:val="0"/>
+        </w:rPr>
+        <w:t>P20 — Align current documentation with default main</w:t>
+      </w:r>
+    </w:p>
+    <w:p>
+      <w:pPr/>
+      <w:r>
+        <w:rPr>
+          <w:b w:val="0"/>
+          <w:i w:val="0"/>
+        </w:rPr>
+        <w:t>Exact user prompt:</w:t>
+      </w:r>
+    </w:p>
+    <w:p>
+      <w:pPr>
+        <w:spacing w:after="0" w:line="240" w:lineRule="auto"/>
+      </w:pPr>
+      <w:r>
+        <w:rPr>
+          <w:rFonts w:ascii="Courier New" w:hAnsi="Courier New"/>
+          <w:sz w:val="16"/>
+        </w:rPr>
+        <w:t>{</w:t>
+      </w:r>
+    </w:p>
+    <w:p>
+      <w:pPr>
+        <w:spacing w:after="0" w:line="240" w:lineRule="auto"/>
+      </w:pPr>
+      <w:r>
+        <w:rPr>
+          <w:rFonts w:ascii="Courier New" w:hAnsi="Courier New"/>
+          <w:sz w:val="16"/>
+        </w:rPr>
+        <w:t xml:space="preserve">  "prompt": "okay i set both repo to have main branch and made it default. "</w:t>
+      </w:r>
+    </w:p>
+    <w:p>
+      <w:pPr>
+        <w:spacing w:after="0" w:line="240" w:lineRule="auto"/>
+      </w:pPr>
+      <w:r>
+        <w:rPr>
+          <w:rFonts w:ascii="Courier New" w:hAnsi="Courier New"/>
+          <w:sz w:val="16"/>
+        </w:rPr>
+        <w:t>}</w:t>
+      </w:r>
+    </w:p>
+    <w:p>
+      <w:pPr/>
+      <w:r>
+        <w:rPr>
+          <w:b w:val="0"/>
+          <w:i w:val="0"/>
+        </w:rPr>
+        <w:t xml:space="preserve">Both local branches already tracked </w:t>
+      </w:r>
+      <w:r>
+        <w:rPr>
+          <w:rFonts w:ascii="Courier New" w:hAnsi="Courier New"/>
+          <w:b w:val="0"/>
+          <w:i w:val="0"/>
+          <w:sz w:val="18"/>
+        </w:rPr>
+        <w:t>origin/main</w:t>
+      </w:r>
+      <w:r>
+        <w:rPr>
+          <w:b w:val="0"/>
+          <w:i w:val="0"/>
+        </w:rPr>
+        <w:t xml:space="preserve">. Remote symbolic HEADs and main commit IDs confirmed that both default branches contained the complete published code. Codex updated current README and exported report hyperlinks to </w:t>
+      </w:r>
+      <w:r>
+        <w:rPr>
+          <w:rFonts w:ascii="Courier New" w:hAnsi="Courier New"/>
+          <w:b w:val="0"/>
+          <w:i w:val="0"/>
+          <w:sz w:val="18"/>
+        </w:rPr>
+        <w:t>main</w:t>
+      </w:r>
+      <w:r>
+        <w:rPr>
+          <w:b w:val="0"/>
+          <w:i w:val="0"/>
+        </w:rPr>
+        <w:t xml:space="preserve">, refreshed publication status and retained historical milestone records. Public repository pages and a full raw video download returned 200 without authentication; downloaded bytes matched the decoded MP4. Exact access evidence is </w:t>
+      </w:r>
+      <w:r>
+        <w:rPr>
+          <w:rFonts w:ascii="Courier New" w:hAnsi="Courier New"/>
+          <w:b w:val="0"/>
+          <w:i w:val="0"/>
+          <w:sz w:val="18"/>
+        </w:rPr>
+        <w:t>docs/assessment/published-main-access.json</w:t>
+      </w:r>
+      <w:r>
+        <w:rPr>
+          <w:b w:val="0"/>
+          <w:i w:val="0"/>
+        </w:rPr>
+        <w:t>. DOCX/PDF were regenerated and their main-branch hyperlinks checked. These are documentation/publication checks; the assessed suites were not rerun and no new load result is claimed. Student playback review, personal cover inputs, historical prompt gaps and submission remain pending.</w:t>
+      </w:r>
+    </w:p>
+    <w:p>
       <w:r>
         <w:br w:type="page"/>
       </w:r>
@@ -22692,7 +22987,7 @@
         </w:rPr>
         <w:t xml:space="preserve">The retained plaintext planning requests A01/A02 and their follow-up are in </w:t>
       </w:r>
-      <w:hyperlink r:id="rId87">
+      <w:hyperlink r:id="rId88">
         <w:r>
           <w:rPr>
             <w:color w:val="174469"/>
@@ -27135,7 +27430,7 @@
           <w:b w:val="0"/>
           <w:i w:val="0"/>
         </w:rPr>
-        <w:t xml:space="preserve">Both assignment repositories remain on </w:t>
+        <w:t xml:space="preserve">At this original pre-publication stage, both assignment repositories used </w:t>
       </w:r>
       <w:r>
         <w:rPr>
@@ -27151,7 +27446,23 @@
           <w:b w:val="0"/>
           <w:i w:val="0"/>
         </w:rPr>
-        <w:t xml:space="preserve">, the existing user-selected working branch. Backend code fix: </w:t>
+        <w:t xml:space="preserve">. The current published branch is </w:t>
+      </w:r>
+      <w:r>
+        <w:rPr>
+          <w:rFonts w:ascii="Courier New" w:hAnsi="Courier New"/>
+          <w:b w:val="0"/>
+          <w:i w:val="0"/>
+          <w:sz w:val="18"/>
+        </w:rPr>
+        <w:t>main</w:t>
+      </w:r>
+      <w:r>
+        <w:rPr>
+          <w:b w:val="0"/>
+          <w:i w:val="0"/>
+        </w:rPr>
+        <w:t xml:space="preserve">, as recorded below. Backend code fix: </w:t>
       </w:r>
       <w:r>
         <w:rPr>
@@ -27876,7 +28187,7 @@
           <w:b w:val="0"/>
           <w:i w:val="0"/>
         </w:rPr>
-        <w:t>Review the completed local MP4, which uses disclosed computer-generated narration and automated live UI actions. Choose it or a personally narrated replacement. Marker playback/access still needs checking after authorized publication; the local video is linked in the report and both READMEs.</w:t>
+        <w:t>Review the completed local MP4, which uses disclosed computer-generated narration and automated live UI actions. Choose it or a personally narrated replacement. Public repository access and full video download have now been checked; confirm human playback before submission. The video is linked in the report and both READMEs.</w:t>
       </w:r>
     </w:p>
     <w:p>
@@ -27900,7 +28211,23 @@
           <w:b w:val="0"/>
           <w:i w:val="0"/>
         </w:rPr>
-        <w:t>Confirm these are the course-intended repositories, authorize/publish both final branches and video, verify marker/non-owner access, then submit by the stated assignment deadline. No submission status or grade is guaranteed.</w:t>
+        <w:t xml:space="preserve">Confirm these are the course-intended repositories, review marker playback and submit by the stated assignment deadline. Both repositories and the video are published on </w:t>
+      </w:r>
+      <w:r>
+        <w:rPr>
+          <w:rFonts w:ascii="Courier New" w:hAnsi="Courier New"/>
+          <w:b w:val="0"/>
+          <w:i w:val="0"/>
+          <w:sz w:val="18"/>
+        </w:rPr>
+        <w:t>main</w:t>
+      </w:r>
+      <w:r>
+        <w:rPr>
+          <w:b w:val="0"/>
+          <w:i w:val="0"/>
+        </w:rPr>
+        <w:t>; anonymous access/download passed. No submission status or grade is guaranteed.</w:t>
       </w:r>
     </w:p>
     <w:p>
@@ -28057,6 +28384,156 @@
           <w:i w:val="0"/>
         </w:rPr>
         <w:t>. Student review, personal cover inputs, missing historical prompt exports, publication/access and submission remain pending. Nothing was pushed or submitted.</w:t>
+      </w:r>
+    </w:p>
+    <w:p>
+      <w:pPr>
+        <w:pStyle w:val="Heading2"/>
+      </w:pPr>
+      <w:r>
+        <w:rPr>
+          <w:b w:val="0"/>
+          <w:i w:val="0"/>
+        </w:rPr>
+        <w:t>Publication and default main branch — 7 October 2026</w:t>
+      </w:r>
+    </w:p>
+    <w:p>
+      <w:pPr/>
+      <w:r>
+        <w:rPr>
+          <w:b w:val="0"/>
+          <w:i w:val="0"/>
+        </w:rPr>
+        <w:t xml:space="preserve">The user authorized pushing the assignment repositories. The saved macOS credential authenticated as </w:t>
+      </w:r>
+      <w:r>
+        <w:rPr>
+          <w:rFonts w:ascii="Courier New" w:hAnsi="Courier New"/>
+          <w:b w:val="0"/>
+          <w:i w:val="0"/>
+          <w:sz w:val="18"/>
+        </w:rPr>
+        <w:t>Arella-Koo</w:t>
+      </w:r>
+      <w:r>
+        <w:rPr>
+          <w:b w:val="0"/>
+          <w:i w:val="0"/>
+        </w:rPr>
+        <w:t xml:space="preserve">, which GitHub refused; GitHub CLI browser login authenticated as </w:t>
+      </w:r>
+      <w:r>
+        <w:rPr>
+          <w:rFonts w:ascii="Courier New" w:hAnsi="Courier New"/>
+          <w:b w:val="0"/>
+          <w:i w:val="0"/>
+          <w:sz w:val="18"/>
+        </w:rPr>
+        <w:t>ArellaKoo</w:t>
+      </w:r>
+      <w:r>
+        <w:rPr>
+          <w:b w:val="0"/>
+          <w:i w:val="0"/>
+        </w:rPr>
+        <w:t xml:space="preserve">, and repository-scoped credential helpers now select that account without deleting the previous saved credential. Backend </w:t>
+      </w:r>
+      <w:r>
+        <w:rPr>
+          <w:rFonts w:ascii="Courier New" w:hAnsi="Courier New"/>
+          <w:b w:val="0"/>
+          <w:i w:val="0"/>
+          <w:sz w:val="18"/>
+        </w:rPr>
+        <w:t>4c26ee9</w:t>
+      </w:r>
+      <w:r>
+        <w:rPr>
+          <w:b w:val="0"/>
+          <w:i w:val="0"/>
+        </w:rPr>
+        <w:t xml:space="preserve"> and frontend </w:t>
+      </w:r>
+      <w:r>
+        <w:rPr>
+          <w:rFonts w:ascii="Courier New" w:hAnsi="Courier New"/>
+          <w:b w:val="0"/>
+          <w:i w:val="0"/>
+          <w:sz w:val="18"/>
+        </w:rPr>
+        <w:t>d2a9a1c</w:t>
+      </w:r>
+      <w:r>
+        <w:rPr>
+          <w:b w:val="0"/>
+          <w:i w:val="0"/>
+        </w:rPr>
+        <w:t xml:space="preserve"> were pushed. The user then set both </w:t>
+      </w:r>
+      <w:r>
+        <w:rPr>
+          <w:rFonts w:ascii="Courier New" w:hAnsi="Courier New"/>
+          <w:b w:val="0"/>
+          <w:i w:val="0"/>
+          <w:sz w:val="18"/>
+        </w:rPr>
+        <w:t>main</w:t>
+      </w:r>
+      <w:r>
+        <w:rPr>
+          <w:b w:val="0"/>
+          <w:i w:val="0"/>
+        </w:rPr>
+        <w:t xml:space="preserve"> branches as default and aligned the local branches to </w:t>
+      </w:r>
+      <w:r>
+        <w:rPr>
+          <w:rFonts w:ascii="Courier New" w:hAnsi="Courier New"/>
+          <w:b w:val="0"/>
+          <w:i w:val="0"/>
+          <w:sz w:val="18"/>
+        </w:rPr>
+        <w:t>origin/main</w:t>
+      </w:r>
+      <w:r>
+        <w:rPr>
+          <w:b w:val="0"/>
+          <w:i w:val="0"/>
+        </w:rPr>
+        <w:t>; remote main heads were verified to contain those complete commits. Both public repository pages and the complete video download were checked without authentication, and the video SHA-256 matches the verified local MP4 (</w:t>
+      </w:r>
+      <w:r>
+        <w:rPr>
+          <w:rFonts w:ascii="Courier New" w:hAnsi="Courier New"/>
+          <w:b w:val="0"/>
+          <w:i w:val="0"/>
+          <w:sz w:val="18"/>
+        </w:rPr>
+        <w:t>published-main-access.json</w:t>
+      </w:r>
+      <w:r>
+        <w:rPr>
+          <w:b w:val="0"/>
+          <w:i w:val="0"/>
+        </w:rPr>
+        <w:t xml:space="preserve">). Current report/README links target </w:t>
+      </w:r>
+      <w:r>
+        <w:rPr>
+          <w:rFonts w:ascii="Courier New" w:hAnsi="Courier New"/>
+          <w:b w:val="0"/>
+          <w:i w:val="0"/>
+          <w:sz w:val="18"/>
+        </w:rPr>
+        <w:t>main</w:t>
+      </w:r>
+      <w:r>
+        <w:rPr>
+          <w:b w:val="0"/>
+          <w:i w:val="0"/>
+        </w:rPr>
+        <w:t>. Historical paragraphs above retain the original pre-publication state. No force push, remote branch deletion, deployment or Canvas submission was performed. Student video review, cover inputs, historical prompt gaps and submission remain pending.</w:t>
       </w:r>
     </w:p>
     <w:sectPr>

</xml_diff>